<commit_message>
feat: add Production Scheduling with Gantt Chart (Production Planning)
</commit_message>
<xml_diff>
--- a/blueprint/DRAFT_Blueprint_ERP_ProductionPlaning_CWA.docx
+++ b/blueprint/DRAFT_Blueprint_ERP_ProductionPlaning_CWA.docx
@@ -97,6 +97,7 @@
         <w:ind w:left="1195"/>
       </w:pPr>
       <w:proofErr w:type="spellStart"/>
+      <w:proofErr w:type="gramStart"/>
       <w:r>
         <w:rPr>
           <w:spacing w:val="-2"/>
@@ -111,6 +112,7 @@
         </w:rPr>
         <w:t>,……..</w:t>
       </w:r>
+      <w:proofErr w:type="gramEnd"/>
     </w:p>
     <w:p>
       <w:pPr>
@@ -7249,13 +7251,23 @@
         <w:t xml:space="preserve">, </w:t>
       </w:r>
       <w:proofErr w:type="spellStart"/>
-      <w:r>
-        <w:rPr>
-          <w:sz w:val="24"/>
-          <w:szCs w:val="24"/>
-          <w:lang w:val="en-US"/>
-        </w:rPr>
-        <w:t>Overall_Schedule_Compliance_Percent</w:t>
+      <w:proofErr w:type="gramStart"/>
+      <w:r>
+        <w:rPr>
+          <w:sz w:val="24"/>
+          <w:szCs w:val="24"/>
+          <w:lang w:val="en-US"/>
+        </w:rPr>
+        <w:t>Overall</w:t>
+      </w:r>
+      <w:proofErr w:type="gramEnd"/>
+      <w:r>
+        <w:rPr>
+          <w:sz w:val="24"/>
+          <w:szCs w:val="24"/>
+          <w:lang w:val="en-US"/>
+        </w:rPr>
+        <w:t>_Schedule_Compliance_Percent</w:t>
       </w:r>
       <w:proofErr w:type="spellEnd"/>
       <w:r>
@@ -7285,13 +7297,23 @@
         <w:t xml:space="preserve">, </w:t>
       </w:r>
       <w:proofErr w:type="spellStart"/>
-      <w:r>
-        <w:rPr>
-          <w:sz w:val="24"/>
-          <w:szCs w:val="24"/>
-          <w:lang w:val="en-US"/>
-        </w:rPr>
-        <w:t>Overall_Yield_Percent</w:t>
+      <w:proofErr w:type="gramStart"/>
+      <w:r>
+        <w:rPr>
+          <w:sz w:val="24"/>
+          <w:szCs w:val="24"/>
+          <w:lang w:val="en-US"/>
+        </w:rPr>
+        <w:t>Overall</w:t>
+      </w:r>
+      <w:proofErr w:type="gramEnd"/>
+      <w:r>
+        <w:rPr>
+          <w:sz w:val="24"/>
+          <w:szCs w:val="24"/>
+          <w:lang w:val="en-US"/>
+        </w:rPr>
+        <w:t>_Yield_Percent</w:t>
       </w:r>
       <w:proofErr w:type="spellEnd"/>
       <w:r>
@@ -7401,6 +7423,576 @@
           <w:lang w:val="en-US"/>
         </w:rPr>
       </w:pPr>
+      <w:proofErr w:type="spellStart"/>
+      <w:r>
+        <w:rPr>
+          <w:b/>
+          <w:bCs/>
+          <w:sz w:val="24"/>
+          <w:szCs w:val="24"/>
+          <w:lang w:val="en-US"/>
+        </w:rPr>
+        <w:t>Fungsi</w:t>
+      </w:r>
+      <w:proofErr w:type="spellEnd"/>
+      <w:r>
+        <w:rPr>
+          <w:b/>
+          <w:bCs/>
+          <w:sz w:val="24"/>
+          <w:szCs w:val="24"/>
+          <w:lang w:val="en-US"/>
+        </w:rPr>
+        <w:t>:</w:t>
+      </w:r>
+      <w:r>
+        <w:rPr>
+          <w:sz w:val="24"/>
+          <w:szCs w:val="24"/>
+          <w:lang w:val="en-US"/>
+        </w:rPr>
+        <w:t xml:space="preserve"> </w:t>
+      </w:r>
+      <w:proofErr w:type="spellStart"/>
+      <w:r>
+        <w:rPr>
+          <w:sz w:val="24"/>
+          <w:szCs w:val="24"/>
+          <w:lang w:val="en-US"/>
+        </w:rPr>
+        <w:t>Menyajikan</w:t>
+      </w:r>
+      <w:proofErr w:type="spellEnd"/>
+      <w:r>
+        <w:rPr>
+          <w:sz w:val="24"/>
+          <w:szCs w:val="24"/>
+          <w:lang w:val="en-US"/>
+        </w:rPr>
+        <w:t xml:space="preserve"> </w:t>
+      </w:r>
+      <w:proofErr w:type="spellStart"/>
+      <w:r>
+        <w:rPr>
+          <w:sz w:val="24"/>
+          <w:szCs w:val="24"/>
+          <w:lang w:val="en-US"/>
+        </w:rPr>
+        <w:t>gambaran</w:t>
+      </w:r>
+      <w:proofErr w:type="spellEnd"/>
+      <w:r>
+        <w:rPr>
+          <w:sz w:val="24"/>
+          <w:szCs w:val="24"/>
+          <w:lang w:val="en-US"/>
+        </w:rPr>
+        <w:t xml:space="preserve"> </w:t>
+      </w:r>
+      <w:proofErr w:type="spellStart"/>
+      <w:r>
+        <w:rPr>
+          <w:sz w:val="24"/>
+          <w:szCs w:val="24"/>
+          <w:lang w:val="en-US"/>
+        </w:rPr>
+        <w:t>umum</w:t>
+      </w:r>
+      <w:proofErr w:type="spellEnd"/>
+      <w:r>
+        <w:rPr>
+          <w:sz w:val="24"/>
+          <w:szCs w:val="24"/>
+          <w:lang w:val="en-US"/>
+        </w:rPr>
+        <w:t xml:space="preserve"> </w:t>
+      </w:r>
+      <w:proofErr w:type="spellStart"/>
+      <w:r>
+        <w:rPr>
+          <w:sz w:val="24"/>
+          <w:szCs w:val="24"/>
+          <w:lang w:val="en-US"/>
+        </w:rPr>
+        <w:t>secara</w:t>
+      </w:r>
+      <w:proofErr w:type="spellEnd"/>
+      <w:r>
+        <w:rPr>
+          <w:sz w:val="24"/>
+          <w:szCs w:val="24"/>
+          <w:lang w:val="en-US"/>
+        </w:rPr>
+        <w:t xml:space="preserve"> visual </w:t>
+      </w:r>
+      <w:proofErr w:type="spellStart"/>
+      <w:r>
+        <w:rPr>
+          <w:sz w:val="24"/>
+          <w:szCs w:val="24"/>
+          <w:lang w:val="en-US"/>
+        </w:rPr>
+        <w:t>mengenai</w:t>
+      </w:r>
+      <w:proofErr w:type="spellEnd"/>
+      <w:r>
+        <w:rPr>
+          <w:sz w:val="24"/>
+          <w:szCs w:val="24"/>
+          <w:lang w:val="en-US"/>
+        </w:rPr>
+        <w:t xml:space="preserve"> </w:t>
+      </w:r>
+      <w:proofErr w:type="spellStart"/>
+      <w:r>
+        <w:rPr>
+          <w:sz w:val="24"/>
+          <w:szCs w:val="24"/>
+          <w:lang w:val="en-US"/>
+        </w:rPr>
+        <w:t>metrik</w:t>
+      </w:r>
+      <w:proofErr w:type="spellEnd"/>
+      <w:r>
+        <w:rPr>
+          <w:sz w:val="24"/>
+          <w:szCs w:val="24"/>
+          <w:lang w:val="en-US"/>
+        </w:rPr>
+        <w:t xml:space="preserve"> </w:t>
+      </w:r>
+      <w:proofErr w:type="spellStart"/>
+      <w:r>
+        <w:rPr>
+          <w:sz w:val="24"/>
+          <w:szCs w:val="24"/>
+          <w:lang w:val="en-US"/>
+        </w:rPr>
+        <w:t>kunci</w:t>
+      </w:r>
+      <w:proofErr w:type="spellEnd"/>
+      <w:r>
+        <w:rPr>
+          <w:sz w:val="24"/>
+          <w:szCs w:val="24"/>
+          <w:lang w:val="en-US"/>
+        </w:rPr>
+        <w:t xml:space="preserve"> </w:t>
+      </w:r>
+      <w:proofErr w:type="spellStart"/>
+      <w:r>
+        <w:rPr>
+          <w:sz w:val="24"/>
+          <w:szCs w:val="24"/>
+          <w:lang w:val="en-US"/>
+        </w:rPr>
+        <w:t>operasional</w:t>
+      </w:r>
+      <w:proofErr w:type="spellEnd"/>
+      <w:r>
+        <w:rPr>
+          <w:sz w:val="24"/>
+          <w:szCs w:val="24"/>
+          <w:lang w:val="en-US"/>
+        </w:rPr>
+        <w:t xml:space="preserve"> </w:t>
+      </w:r>
+      <w:proofErr w:type="spellStart"/>
+      <w:r>
+        <w:rPr>
+          <w:sz w:val="24"/>
+          <w:szCs w:val="24"/>
+          <w:lang w:val="en-US"/>
+        </w:rPr>
+        <w:t>perencanaan</w:t>
+      </w:r>
+      <w:proofErr w:type="spellEnd"/>
+      <w:r>
+        <w:rPr>
+          <w:sz w:val="24"/>
+          <w:szCs w:val="24"/>
+          <w:lang w:val="en-US"/>
+        </w:rPr>
+        <w:t xml:space="preserve"> dan </w:t>
+      </w:r>
+      <w:proofErr w:type="spellStart"/>
+      <w:r>
+        <w:rPr>
+          <w:sz w:val="24"/>
+          <w:szCs w:val="24"/>
+          <w:lang w:val="en-US"/>
+        </w:rPr>
+        <w:t>realisasi</w:t>
+      </w:r>
+      <w:proofErr w:type="spellEnd"/>
+      <w:r>
+        <w:rPr>
+          <w:sz w:val="24"/>
+          <w:szCs w:val="24"/>
+          <w:lang w:val="en-US"/>
+        </w:rPr>
+        <w:t xml:space="preserve"> </w:t>
+      </w:r>
+      <w:proofErr w:type="spellStart"/>
+      <w:r>
+        <w:rPr>
+          <w:sz w:val="24"/>
+          <w:szCs w:val="24"/>
+          <w:lang w:val="en-US"/>
+        </w:rPr>
+        <w:t>produksi</w:t>
+      </w:r>
+      <w:proofErr w:type="spellEnd"/>
+      <w:r>
+        <w:rPr>
+          <w:sz w:val="24"/>
+          <w:szCs w:val="24"/>
+          <w:lang w:val="en-US"/>
+        </w:rPr>
+        <w:t xml:space="preserve"> </w:t>
+      </w:r>
+      <w:proofErr w:type="spellStart"/>
+      <w:r>
+        <w:rPr>
+          <w:sz w:val="24"/>
+          <w:szCs w:val="24"/>
+          <w:lang w:val="en-US"/>
+        </w:rPr>
+        <w:t>pabrik</w:t>
+      </w:r>
+      <w:proofErr w:type="spellEnd"/>
+      <w:r>
+        <w:rPr>
+          <w:sz w:val="24"/>
+          <w:szCs w:val="24"/>
+          <w:lang w:val="en-US"/>
+        </w:rPr>
+        <w:t xml:space="preserve"> cat, </w:t>
+      </w:r>
+      <w:proofErr w:type="spellStart"/>
+      <w:r>
+        <w:rPr>
+          <w:sz w:val="24"/>
+          <w:szCs w:val="24"/>
+          <w:lang w:val="en-US"/>
+        </w:rPr>
+        <w:t>pemantauan</w:t>
+      </w:r>
+      <w:proofErr w:type="spellEnd"/>
+      <w:r>
+        <w:rPr>
+          <w:sz w:val="24"/>
+          <w:szCs w:val="24"/>
+          <w:lang w:val="en-US"/>
+        </w:rPr>
+        <w:t xml:space="preserve"> status </w:t>
+      </w:r>
+      <w:proofErr w:type="spellStart"/>
+      <w:r>
+        <w:rPr>
+          <w:sz w:val="24"/>
+          <w:szCs w:val="24"/>
+          <w:lang w:val="en-US"/>
+        </w:rPr>
+        <w:t>alur</w:t>
+      </w:r>
+      <w:proofErr w:type="spellEnd"/>
+      <w:r>
+        <w:rPr>
+          <w:sz w:val="24"/>
+          <w:szCs w:val="24"/>
+          <w:lang w:val="en-US"/>
+        </w:rPr>
+        <w:t xml:space="preserve"> </w:t>
+      </w:r>
+      <w:proofErr w:type="spellStart"/>
+      <w:r>
+        <w:rPr>
+          <w:sz w:val="24"/>
+          <w:szCs w:val="24"/>
+          <w:lang w:val="en-US"/>
+        </w:rPr>
+        <w:t>Perintah</w:t>
+      </w:r>
+      <w:proofErr w:type="spellEnd"/>
+      <w:r>
+        <w:rPr>
+          <w:sz w:val="24"/>
+          <w:szCs w:val="24"/>
+          <w:lang w:val="en-US"/>
+        </w:rPr>
+        <w:t xml:space="preserve"> </w:t>
+      </w:r>
+      <w:proofErr w:type="spellStart"/>
+      <w:r>
+        <w:rPr>
+          <w:sz w:val="24"/>
+          <w:szCs w:val="24"/>
+          <w:lang w:val="en-US"/>
+        </w:rPr>
+        <w:t>Kerja</w:t>
+      </w:r>
+      <w:proofErr w:type="spellEnd"/>
+      <w:r>
+        <w:rPr>
+          <w:sz w:val="24"/>
+          <w:szCs w:val="24"/>
+          <w:lang w:val="en-US"/>
+        </w:rPr>
+        <w:t xml:space="preserve"> (SPK), </w:t>
+      </w:r>
+      <w:proofErr w:type="spellStart"/>
+      <w:r>
+        <w:rPr>
+          <w:sz w:val="24"/>
+          <w:szCs w:val="24"/>
+          <w:lang w:val="en-US"/>
+        </w:rPr>
+        <w:t>utilisasi</w:t>
+      </w:r>
+      <w:proofErr w:type="spellEnd"/>
+      <w:r>
+        <w:rPr>
+          <w:sz w:val="24"/>
+          <w:szCs w:val="24"/>
+          <w:lang w:val="en-US"/>
+        </w:rPr>
+        <w:t xml:space="preserve"> </w:t>
+      </w:r>
+      <w:proofErr w:type="spellStart"/>
+      <w:r>
+        <w:rPr>
+          <w:sz w:val="24"/>
+          <w:szCs w:val="24"/>
+          <w:lang w:val="en-US"/>
+        </w:rPr>
+        <w:t>mesin</w:t>
+      </w:r>
+      <w:proofErr w:type="spellEnd"/>
+      <w:r>
+        <w:rPr>
+          <w:sz w:val="24"/>
+          <w:szCs w:val="24"/>
+          <w:lang w:val="en-US"/>
+        </w:rPr>
+        <w:t xml:space="preserve"> </w:t>
+      </w:r>
+      <w:proofErr w:type="spellStart"/>
+      <w:r>
+        <w:rPr>
+          <w:sz w:val="24"/>
+          <w:szCs w:val="24"/>
+          <w:lang w:val="en-US"/>
+        </w:rPr>
+        <w:t>giling</w:t>
+      </w:r>
+      <w:proofErr w:type="spellEnd"/>
+      <w:r>
+        <w:rPr>
+          <w:sz w:val="24"/>
+          <w:szCs w:val="24"/>
+          <w:lang w:val="en-US"/>
+        </w:rPr>
+        <w:t xml:space="preserve">, </w:t>
+      </w:r>
+      <w:proofErr w:type="spellStart"/>
+      <w:r>
+        <w:rPr>
+          <w:sz w:val="24"/>
+          <w:szCs w:val="24"/>
+          <w:lang w:val="en-US"/>
+        </w:rPr>
+        <w:t>perolehan</w:t>
+      </w:r>
+      <w:proofErr w:type="spellEnd"/>
+      <w:r>
+        <w:rPr>
+          <w:sz w:val="24"/>
+          <w:szCs w:val="24"/>
+          <w:lang w:val="en-US"/>
+        </w:rPr>
+        <w:t xml:space="preserve"> </w:t>
+      </w:r>
+      <w:proofErr w:type="spellStart"/>
+      <w:r>
+        <w:rPr>
+          <w:sz w:val="24"/>
+          <w:szCs w:val="24"/>
+          <w:lang w:val="en-US"/>
+        </w:rPr>
+        <w:t>hasil</w:t>
+      </w:r>
+      <w:proofErr w:type="spellEnd"/>
+      <w:r>
+        <w:rPr>
+          <w:sz w:val="24"/>
+          <w:szCs w:val="24"/>
+          <w:lang w:val="en-US"/>
+        </w:rPr>
+        <w:t xml:space="preserve"> </w:t>
+      </w:r>
+      <w:proofErr w:type="spellStart"/>
+      <w:r>
+        <w:rPr>
+          <w:sz w:val="24"/>
+          <w:szCs w:val="24"/>
+          <w:lang w:val="en-US"/>
+        </w:rPr>
+        <w:t>produksi</w:t>
+      </w:r>
+      <w:proofErr w:type="spellEnd"/>
+      <w:r>
+        <w:rPr>
+          <w:sz w:val="24"/>
+          <w:szCs w:val="24"/>
+          <w:lang w:val="en-US"/>
+        </w:rPr>
+        <w:t xml:space="preserve"> (yield), </w:t>
+      </w:r>
+      <w:proofErr w:type="spellStart"/>
+      <w:r>
+        <w:rPr>
+          <w:sz w:val="24"/>
+          <w:szCs w:val="24"/>
+          <w:lang w:val="en-US"/>
+        </w:rPr>
+        <w:t>serta</w:t>
+      </w:r>
+      <w:proofErr w:type="spellEnd"/>
+      <w:r>
+        <w:rPr>
+          <w:sz w:val="24"/>
+          <w:szCs w:val="24"/>
+          <w:lang w:val="en-US"/>
+        </w:rPr>
+        <w:t xml:space="preserve"> </w:t>
+      </w:r>
+      <w:proofErr w:type="spellStart"/>
+      <w:r>
+        <w:rPr>
+          <w:sz w:val="24"/>
+          <w:szCs w:val="24"/>
+          <w:lang w:val="en-US"/>
+        </w:rPr>
+        <w:t>peringatan</w:t>
+      </w:r>
+      <w:proofErr w:type="spellEnd"/>
+      <w:r>
+        <w:rPr>
+          <w:sz w:val="24"/>
+          <w:szCs w:val="24"/>
+          <w:lang w:val="en-US"/>
+        </w:rPr>
+        <w:t xml:space="preserve"> </w:t>
+      </w:r>
+      <w:proofErr w:type="spellStart"/>
+      <w:r>
+        <w:rPr>
+          <w:sz w:val="24"/>
+          <w:szCs w:val="24"/>
+          <w:lang w:val="en-US"/>
+        </w:rPr>
+        <w:t>dini</w:t>
+      </w:r>
+      <w:proofErr w:type="spellEnd"/>
+      <w:r>
+        <w:rPr>
+          <w:sz w:val="24"/>
+          <w:szCs w:val="24"/>
+          <w:lang w:val="en-US"/>
+        </w:rPr>
+        <w:t xml:space="preserve"> </w:t>
+      </w:r>
+      <w:proofErr w:type="spellStart"/>
+      <w:r>
+        <w:rPr>
+          <w:sz w:val="24"/>
+          <w:szCs w:val="24"/>
+          <w:lang w:val="en-US"/>
+        </w:rPr>
+        <w:t>kekurangan</w:t>
+      </w:r>
+      <w:proofErr w:type="spellEnd"/>
+      <w:r>
+        <w:rPr>
+          <w:sz w:val="24"/>
+          <w:szCs w:val="24"/>
+          <w:lang w:val="en-US"/>
+        </w:rPr>
+        <w:t xml:space="preserve"> </w:t>
+      </w:r>
+      <w:proofErr w:type="spellStart"/>
+      <w:r>
+        <w:rPr>
+          <w:sz w:val="24"/>
+          <w:szCs w:val="24"/>
+          <w:lang w:val="en-US"/>
+        </w:rPr>
+        <w:t>stok</w:t>
+      </w:r>
+      <w:proofErr w:type="spellEnd"/>
+      <w:r>
+        <w:rPr>
+          <w:sz w:val="24"/>
+          <w:szCs w:val="24"/>
+          <w:lang w:val="en-US"/>
+        </w:rPr>
+        <w:t xml:space="preserve"> </w:t>
+      </w:r>
+      <w:proofErr w:type="spellStart"/>
+      <w:r>
+        <w:rPr>
+          <w:sz w:val="24"/>
+          <w:szCs w:val="24"/>
+          <w:lang w:val="en-US"/>
+        </w:rPr>
+        <w:t>bahan</w:t>
+      </w:r>
+      <w:proofErr w:type="spellEnd"/>
+      <w:r>
+        <w:rPr>
+          <w:sz w:val="24"/>
+          <w:szCs w:val="24"/>
+          <w:lang w:val="en-US"/>
+        </w:rPr>
+        <w:t xml:space="preserve"> </w:t>
+      </w:r>
+      <w:proofErr w:type="spellStart"/>
+      <w:r>
+        <w:rPr>
+          <w:sz w:val="24"/>
+          <w:szCs w:val="24"/>
+          <w:lang w:val="en-US"/>
+        </w:rPr>
+        <w:t>baku</w:t>
+      </w:r>
+      <w:proofErr w:type="spellEnd"/>
+      <w:r>
+        <w:rPr>
+          <w:sz w:val="24"/>
+          <w:szCs w:val="24"/>
+          <w:lang w:val="en-US"/>
+        </w:rPr>
+        <w:t xml:space="preserve"> (pigmen/resin/solvent/</w:t>
+      </w:r>
+      <w:proofErr w:type="spellStart"/>
+      <w:r>
+        <w:rPr>
+          <w:sz w:val="24"/>
+          <w:szCs w:val="24"/>
+          <w:lang w:val="en-US"/>
+        </w:rPr>
+        <w:t>kemasan</w:t>
+      </w:r>
+      <w:proofErr w:type="spellEnd"/>
+      <w:r>
+        <w:rPr>
+          <w:sz w:val="24"/>
+          <w:szCs w:val="24"/>
+          <w:lang w:val="en-US"/>
+        </w:rPr>
+        <w:t>).</w:t>
+      </w:r>
     </w:p>
     <w:p>
       <w:pPr>
@@ -7427,7 +8019,7 @@
           <w:szCs w:val="24"/>
           <w:lang w:val="en-US"/>
         </w:rPr>
-        <w:t>Fungsi</w:t>
+        <w:t>Penjelasan</w:t>
       </w:r>
       <w:proofErr w:type="spellEnd"/>
       <w:r>
@@ -7438,54 +8030,711 @@
           <w:szCs w:val="24"/>
           <w:lang w:val="en-US"/>
         </w:rPr>
-        <w:t>:</w:t>
-      </w:r>
-      <w:r>
-        <w:rPr>
-          <w:sz w:val="24"/>
-          <w:szCs w:val="24"/>
-          <w:lang w:val="en-US"/>
-        </w:rPr>
-        <w:t xml:space="preserve"> </w:t>
+        <w:t xml:space="preserve"> UI:</w:t>
+      </w:r>
+      <w:r>
+        <w:t xml:space="preserve"> </w:t>
+      </w:r>
+      <w:proofErr w:type="spellStart"/>
+      <w:r>
+        <w:rPr>
+          <w:sz w:val="24"/>
+          <w:szCs w:val="24"/>
+          <w:lang w:val="en-US"/>
+        </w:rPr>
+        <w:t>Tampilan</w:t>
+      </w:r>
+      <w:proofErr w:type="spellEnd"/>
+      <w:r>
+        <w:rPr>
+          <w:sz w:val="24"/>
+          <w:szCs w:val="24"/>
+          <w:lang w:val="en-US"/>
+        </w:rPr>
+        <w:t xml:space="preserve"> </w:t>
+      </w:r>
+      <w:proofErr w:type="spellStart"/>
+      <w:r>
+        <w:rPr>
+          <w:sz w:val="24"/>
+          <w:szCs w:val="24"/>
+          <w:lang w:val="en-US"/>
+        </w:rPr>
+        <w:t>awal</w:t>
+      </w:r>
+      <w:proofErr w:type="spellEnd"/>
+      <w:r>
+        <w:rPr>
+          <w:sz w:val="24"/>
+          <w:szCs w:val="24"/>
+          <w:lang w:val="en-US"/>
+        </w:rPr>
+        <w:t xml:space="preserve"> </w:t>
+      </w:r>
+      <w:proofErr w:type="spellStart"/>
+      <w:r>
+        <w:rPr>
+          <w:sz w:val="24"/>
+          <w:szCs w:val="24"/>
+          <w:lang w:val="en-US"/>
+        </w:rPr>
+        <w:t>berupa</w:t>
+      </w:r>
+      <w:proofErr w:type="spellEnd"/>
+      <w:r>
+        <w:rPr>
+          <w:sz w:val="24"/>
+          <w:szCs w:val="24"/>
+          <w:lang w:val="en-US"/>
+        </w:rPr>
+        <w:t xml:space="preserve"> dashboard </w:t>
+      </w:r>
+      <w:proofErr w:type="spellStart"/>
+      <w:r>
+        <w:rPr>
+          <w:sz w:val="24"/>
+          <w:szCs w:val="24"/>
+          <w:lang w:val="en-US"/>
+        </w:rPr>
+        <w:t>interaktif</w:t>
+      </w:r>
+      <w:proofErr w:type="spellEnd"/>
+      <w:r>
+        <w:rPr>
+          <w:sz w:val="24"/>
+          <w:szCs w:val="24"/>
+          <w:lang w:val="en-US"/>
+        </w:rPr>
+        <w:t xml:space="preserve"> </w:t>
+      </w:r>
+      <w:proofErr w:type="spellStart"/>
+      <w:r>
+        <w:rPr>
+          <w:sz w:val="24"/>
+          <w:szCs w:val="24"/>
+          <w:lang w:val="en-US"/>
+        </w:rPr>
+        <w:t>berisi</w:t>
+      </w:r>
+      <w:proofErr w:type="spellEnd"/>
+      <w:r>
+        <w:rPr>
+          <w:sz w:val="24"/>
+          <w:szCs w:val="24"/>
+          <w:lang w:val="en-US"/>
+        </w:rPr>
+        <w:t xml:space="preserve"> </w:t>
+      </w:r>
+      <w:proofErr w:type="spellStart"/>
+      <w:r>
+        <w:rPr>
+          <w:sz w:val="24"/>
+          <w:szCs w:val="24"/>
+          <w:lang w:val="en-US"/>
+        </w:rPr>
+        <w:t>ringkasan</w:t>
+      </w:r>
+      <w:proofErr w:type="spellEnd"/>
+      <w:r>
+        <w:rPr>
+          <w:sz w:val="24"/>
+          <w:szCs w:val="24"/>
+          <w:lang w:val="en-US"/>
+        </w:rPr>
+        <w:t xml:space="preserve"> widget </w:t>
+      </w:r>
+      <w:proofErr w:type="spellStart"/>
+      <w:r>
+        <w:rPr>
+          <w:sz w:val="24"/>
+          <w:szCs w:val="24"/>
+          <w:lang w:val="en-US"/>
+        </w:rPr>
+        <w:t>angka</w:t>
+      </w:r>
+      <w:proofErr w:type="spellEnd"/>
+      <w:r>
+        <w:rPr>
+          <w:sz w:val="24"/>
+          <w:szCs w:val="24"/>
+          <w:lang w:val="en-US"/>
+        </w:rPr>
+        <w:t xml:space="preserve"> (card stat) </w:t>
+      </w:r>
+      <w:proofErr w:type="spellStart"/>
+      <w:r>
+        <w:rPr>
+          <w:sz w:val="24"/>
+          <w:szCs w:val="24"/>
+          <w:lang w:val="en-US"/>
+        </w:rPr>
+        <w:t>indikator</w:t>
+      </w:r>
+      <w:proofErr w:type="spellEnd"/>
+      <w:r>
+        <w:rPr>
+          <w:sz w:val="24"/>
+          <w:szCs w:val="24"/>
+          <w:lang w:val="en-US"/>
+        </w:rPr>
+        <w:t xml:space="preserve"> </w:t>
+      </w:r>
+      <w:proofErr w:type="spellStart"/>
+      <w:r>
+        <w:rPr>
+          <w:sz w:val="24"/>
+          <w:szCs w:val="24"/>
+          <w:lang w:val="en-US"/>
+        </w:rPr>
+        <w:t>performa</w:t>
+      </w:r>
+      <w:proofErr w:type="spellEnd"/>
+      <w:r>
+        <w:rPr>
+          <w:sz w:val="24"/>
+          <w:szCs w:val="24"/>
+          <w:lang w:val="en-US"/>
+        </w:rPr>
+        <w:t xml:space="preserve"> </w:t>
+      </w:r>
+      <w:proofErr w:type="spellStart"/>
+      <w:r>
+        <w:rPr>
+          <w:sz w:val="24"/>
+          <w:szCs w:val="24"/>
+          <w:lang w:val="en-US"/>
+        </w:rPr>
+        <w:t>utama</w:t>
+      </w:r>
+      <w:proofErr w:type="spellEnd"/>
+      <w:r>
+        <w:rPr>
+          <w:sz w:val="24"/>
+          <w:szCs w:val="24"/>
+          <w:lang w:val="en-US"/>
+        </w:rPr>
+        <w:t xml:space="preserve"> (KPI), </w:t>
+      </w:r>
+      <w:proofErr w:type="spellStart"/>
+      <w:r>
+        <w:rPr>
+          <w:sz w:val="24"/>
+          <w:szCs w:val="24"/>
+          <w:lang w:val="en-US"/>
+        </w:rPr>
+        <w:t>modul</w:t>
+      </w:r>
+      <w:proofErr w:type="spellEnd"/>
+      <w:r>
+        <w:rPr>
+          <w:sz w:val="24"/>
+          <w:szCs w:val="24"/>
+          <w:lang w:val="en-US"/>
+        </w:rPr>
+        <w:t xml:space="preserve"> visual pipeline status SPK, diagram </w:t>
+      </w:r>
+      <w:proofErr w:type="spellStart"/>
+      <w:r>
+        <w:rPr>
+          <w:sz w:val="24"/>
+          <w:szCs w:val="24"/>
+          <w:lang w:val="en-US"/>
+        </w:rPr>
+        <w:t>grafik</w:t>
+      </w:r>
+      <w:proofErr w:type="spellEnd"/>
+      <w:r>
+        <w:rPr>
+          <w:sz w:val="24"/>
+          <w:szCs w:val="24"/>
+          <w:lang w:val="en-US"/>
+        </w:rPr>
+        <w:t xml:space="preserve"> garis/</w:t>
+      </w:r>
+      <w:proofErr w:type="spellStart"/>
+      <w:r>
+        <w:rPr>
+          <w:sz w:val="24"/>
+          <w:szCs w:val="24"/>
+          <w:lang w:val="en-US"/>
+        </w:rPr>
+        <w:t>batang</w:t>
+      </w:r>
+      <w:proofErr w:type="spellEnd"/>
+      <w:r>
+        <w:rPr>
+          <w:sz w:val="24"/>
+          <w:szCs w:val="24"/>
+          <w:lang w:val="en-US"/>
+        </w:rPr>
+        <w:t xml:space="preserve"> trend </w:t>
+      </w:r>
+      <w:proofErr w:type="spellStart"/>
+      <w:r>
+        <w:rPr>
+          <w:sz w:val="24"/>
+          <w:szCs w:val="24"/>
+          <w:lang w:val="en-US"/>
+        </w:rPr>
+        <w:t>realisasi</w:t>
+      </w:r>
+      <w:proofErr w:type="spellEnd"/>
+      <w:r>
+        <w:rPr>
+          <w:sz w:val="24"/>
+          <w:szCs w:val="24"/>
+          <w:lang w:val="en-US"/>
+        </w:rPr>
+        <w:t xml:space="preserve"> output </w:t>
+      </w:r>
+      <w:proofErr w:type="spellStart"/>
+      <w:r>
+        <w:rPr>
+          <w:sz w:val="24"/>
+          <w:szCs w:val="24"/>
+          <w:lang w:val="en-US"/>
+        </w:rPr>
+        <w:t>tonase</w:t>
+      </w:r>
+      <w:proofErr w:type="spellEnd"/>
+      <w:r>
+        <w:rPr>
+          <w:sz w:val="24"/>
+          <w:szCs w:val="24"/>
+          <w:lang w:val="en-US"/>
+        </w:rPr>
+        <w:t xml:space="preserve"> </w:t>
+      </w:r>
+      <w:proofErr w:type="spellStart"/>
+      <w:r>
+        <w:rPr>
+          <w:sz w:val="24"/>
+          <w:szCs w:val="24"/>
+          <w:lang w:val="en-US"/>
+        </w:rPr>
+        <w:t>harian</w:t>
+      </w:r>
+      <w:proofErr w:type="spellEnd"/>
+      <w:r>
+        <w:rPr>
+          <w:sz w:val="24"/>
+          <w:szCs w:val="24"/>
+          <w:lang w:val="en-US"/>
+        </w:rPr>
+        <w:t xml:space="preserve"> &amp; per jam, </w:t>
+      </w:r>
+      <w:proofErr w:type="spellStart"/>
+      <w:r>
+        <w:rPr>
+          <w:sz w:val="24"/>
+          <w:szCs w:val="24"/>
+          <w:lang w:val="en-US"/>
+        </w:rPr>
+        <w:t>grafik</w:t>
+      </w:r>
+      <w:proofErr w:type="spellEnd"/>
+      <w:r>
+        <w:rPr>
+          <w:sz w:val="24"/>
+          <w:szCs w:val="24"/>
+          <w:lang w:val="en-US"/>
+        </w:rPr>
+        <w:t xml:space="preserve"> </w:t>
+      </w:r>
+      <w:proofErr w:type="spellStart"/>
+      <w:r>
+        <w:rPr>
+          <w:sz w:val="24"/>
+          <w:szCs w:val="24"/>
+          <w:lang w:val="en-US"/>
+        </w:rPr>
+        <w:t>perbandingan</w:t>
+      </w:r>
+      <w:proofErr w:type="spellEnd"/>
+      <w:r>
+        <w:rPr>
+          <w:sz w:val="24"/>
+          <w:szCs w:val="24"/>
+          <w:lang w:val="en-US"/>
+        </w:rPr>
+        <w:t xml:space="preserve"> </w:t>
+      </w:r>
+      <w:proofErr w:type="spellStart"/>
+      <w:r>
+        <w:rPr>
+          <w:sz w:val="24"/>
+          <w:szCs w:val="24"/>
+          <w:lang w:val="en-US"/>
+        </w:rPr>
+        <w:t>tahapan</w:t>
+      </w:r>
+      <w:proofErr w:type="spellEnd"/>
+      <w:r>
+        <w:rPr>
+          <w:sz w:val="24"/>
+          <w:szCs w:val="24"/>
+          <w:lang w:val="en-US"/>
+        </w:rPr>
+        <w:t xml:space="preserve"> </w:t>
+      </w:r>
+      <w:proofErr w:type="spellStart"/>
+      <w:r>
+        <w:rPr>
+          <w:sz w:val="24"/>
+          <w:szCs w:val="24"/>
+          <w:lang w:val="en-US"/>
+        </w:rPr>
+        <w:t>produksi</w:t>
+      </w:r>
+      <w:proofErr w:type="spellEnd"/>
+      <w:r>
+        <w:rPr>
+          <w:sz w:val="24"/>
+          <w:szCs w:val="24"/>
+          <w:lang w:val="en-US"/>
+        </w:rPr>
+        <w:t xml:space="preserve"> (Base vs CM vs Packing), </w:t>
+      </w:r>
+      <w:proofErr w:type="spellStart"/>
+      <w:r>
+        <w:rPr>
+          <w:sz w:val="24"/>
+          <w:szCs w:val="24"/>
+          <w:lang w:val="en-US"/>
+        </w:rPr>
+        <w:t>serta</w:t>
+      </w:r>
+      <w:proofErr w:type="spellEnd"/>
+      <w:r>
+        <w:rPr>
+          <w:sz w:val="24"/>
+          <w:szCs w:val="24"/>
+          <w:lang w:val="en-US"/>
+        </w:rPr>
+        <w:t xml:space="preserve"> </w:t>
+      </w:r>
+      <w:proofErr w:type="spellStart"/>
+      <w:r>
+        <w:rPr>
+          <w:sz w:val="24"/>
+          <w:szCs w:val="24"/>
+          <w:lang w:val="en-US"/>
+        </w:rPr>
+        <w:t>tabel</w:t>
+      </w:r>
+      <w:proofErr w:type="spellEnd"/>
+      <w:r>
+        <w:rPr>
+          <w:sz w:val="24"/>
+          <w:szCs w:val="24"/>
+          <w:lang w:val="en-US"/>
+        </w:rPr>
+        <w:t xml:space="preserve"> </w:t>
+      </w:r>
+      <w:proofErr w:type="spellStart"/>
+      <w:r>
+        <w:rPr>
+          <w:sz w:val="24"/>
+          <w:szCs w:val="24"/>
+          <w:lang w:val="en-US"/>
+        </w:rPr>
+        <w:t>ringkas</w:t>
+      </w:r>
+      <w:proofErr w:type="spellEnd"/>
+      <w:r>
+        <w:rPr>
+          <w:sz w:val="24"/>
+          <w:szCs w:val="24"/>
+          <w:lang w:val="en-US"/>
+        </w:rPr>
+        <w:t xml:space="preserve"> </w:t>
+      </w:r>
+      <w:proofErr w:type="spellStart"/>
+      <w:r>
+        <w:rPr>
+          <w:sz w:val="24"/>
+          <w:szCs w:val="24"/>
+          <w:lang w:val="en-US"/>
+        </w:rPr>
+        <w:t>notifikasi</w:t>
+      </w:r>
+      <w:proofErr w:type="spellEnd"/>
+      <w:r>
+        <w:rPr>
+          <w:sz w:val="24"/>
+          <w:szCs w:val="24"/>
+          <w:lang w:val="en-US"/>
+        </w:rPr>
+        <w:t xml:space="preserve"> SPK </w:t>
+      </w:r>
+      <w:proofErr w:type="spellStart"/>
+      <w:r>
+        <w:rPr>
+          <w:sz w:val="24"/>
+          <w:szCs w:val="24"/>
+          <w:lang w:val="en-US"/>
+        </w:rPr>
+        <w:t>mendesak</w:t>
+      </w:r>
+      <w:proofErr w:type="spellEnd"/>
+      <w:r>
+        <w:rPr>
+          <w:sz w:val="24"/>
+          <w:szCs w:val="24"/>
+          <w:lang w:val="en-US"/>
+        </w:rPr>
+        <w:t xml:space="preserve"> dan material yang </w:t>
+      </w:r>
+      <w:proofErr w:type="spellStart"/>
+      <w:r>
+        <w:rPr>
+          <w:sz w:val="24"/>
+          <w:szCs w:val="24"/>
+          <w:lang w:val="en-US"/>
+        </w:rPr>
+        <w:t>kurang</w:t>
+      </w:r>
+      <w:proofErr w:type="spellEnd"/>
+      <w:r>
+        <w:rPr>
+          <w:sz w:val="24"/>
+          <w:szCs w:val="24"/>
+          <w:lang w:val="en-US"/>
+        </w:rPr>
+        <w:t xml:space="preserve"> (shortage). Halaman </w:t>
+      </w:r>
+      <w:proofErr w:type="spellStart"/>
+      <w:r>
+        <w:rPr>
+          <w:sz w:val="24"/>
+          <w:szCs w:val="24"/>
+          <w:lang w:val="en-US"/>
+        </w:rPr>
+        <w:t>bersifat</w:t>
+      </w:r>
+      <w:proofErr w:type="spellEnd"/>
+      <w:r>
+        <w:rPr>
+          <w:sz w:val="24"/>
+          <w:szCs w:val="24"/>
+          <w:lang w:val="en-US"/>
+        </w:rPr>
+        <w:t xml:space="preserve"> Read-Only dan </w:t>
+      </w:r>
+      <w:proofErr w:type="spellStart"/>
+      <w:r>
+        <w:rPr>
+          <w:sz w:val="24"/>
+          <w:szCs w:val="24"/>
+          <w:lang w:val="en-US"/>
+        </w:rPr>
+        <w:t>hanya</w:t>
+      </w:r>
+      <w:proofErr w:type="spellEnd"/>
+      <w:r>
+        <w:rPr>
+          <w:sz w:val="24"/>
+          <w:szCs w:val="24"/>
+          <w:lang w:val="en-US"/>
+        </w:rPr>
+        <w:t xml:space="preserve"> </w:t>
+      </w:r>
+      <w:proofErr w:type="spellStart"/>
+      <w:r>
+        <w:rPr>
+          <w:sz w:val="24"/>
+          <w:szCs w:val="24"/>
+          <w:lang w:val="en-US"/>
+        </w:rPr>
+        <w:t>menyediakan</w:t>
+      </w:r>
+      <w:proofErr w:type="spellEnd"/>
+      <w:r>
+        <w:rPr>
+          <w:sz w:val="24"/>
+          <w:szCs w:val="24"/>
+          <w:lang w:val="en-US"/>
+        </w:rPr>
+        <w:t xml:space="preserve"> filter </w:t>
+      </w:r>
+      <w:proofErr w:type="spellStart"/>
+      <w:r>
+        <w:rPr>
+          <w:sz w:val="24"/>
+          <w:szCs w:val="24"/>
+          <w:lang w:val="en-US"/>
+        </w:rPr>
+        <w:t>periode</w:t>
+      </w:r>
+      <w:proofErr w:type="spellEnd"/>
+      <w:r>
+        <w:rPr>
+          <w:sz w:val="24"/>
+          <w:szCs w:val="24"/>
+          <w:lang w:val="en-US"/>
+        </w:rPr>
+        <w:t xml:space="preserve"> </w:t>
+      </w:r>
+      <w:proofErr w:type="spellStart"/>
+      <w:r>
+        <w:rPr>
+          <w:sz w:val="24"/>
+          <w:szCs w:val="24"/>
+          <w:lang w:val="en-US"/>
+        </w:rPr>
+        <w:t>tanggal</w:t>
+      </w:r>
+      <w:proofErr w:type="spellEnd"/>
+      <w:r>
+        <w:rPr>
+          <w:sz w:val="24"/>
+          <w:szCs w:val="24"/>
+          <w:lang w:val="en-US"/>
+        </w:rPr>
+        <w:t xml:space="preserve">, shift, </w:t>
+      </w:r>
+      <w:proofErr w:type="spellStart"/>
+      <w:r>
+        <w:rPr>
+          <w:sz w:val="24"/>
+          <w:szCs w:val="24"/>
+          <w:lang w:val="en-US"/>
+        </w:rPr>
+        <w:t>tipe</w:t>
+      </w:r>
+      <w:proofErr w:type="spellEnd"/>
+      <w:r>
+        <w:rPr>
+          <w:sz w:val="24"/>
+          <w:szCs w:val="24"/>
+          <w:lang w:val="en-US"/>
+        </w:rPr>
+        <w:t xml:space="preserve"> </w:t>
+      </w:r>
+      <w:proofErr w:type="spellStart"/>
+      <w:r>
+        <w:rPr>
+          <w:sz w:val="24"/>
+          <w:szCs w:val="24"/>
+          <w:lang w:val="en-US"/>
+        </w:rPr>
+        <w:t>adonan</w:t>
+      </w:r>
+      <w:proofErr w:type="spellEnd"/>
+      <w:r>
+        <w:rPr>
+          <w:sz w:val="24"/>
+          <w:szCs w:val="24"/>
+          <w:lang w:val="en-US"/>
+        </w:rPr>
+        <w:t xml:space="preserve"> (Water Based/Solvent Based), dan </w:t>
+      </w:r>
+      <w:proofErr w:type="spellStart"/>
+      <w:r>
+        <w:rPr>
+          <w:sz w:val="24"/>
+          <w:szCs w:val="24"/>
+          <w:lang w:val="en-US"/>
+        </w:rPr>
+        <w:t>lokasi</w:t>
+      </w:r>
+      <w:proofErr w:type="spellEnd"/>
+      <w:r>
+        <w:rPr>
+          <w:sz w:val="24"/>
+          <w:szCs w:val="24"/>
+          <w:lang w:val="en-US"/>
+        </w:rPr>
+        <w:t xml:space="preserve"> </w:t>
+      </w:r>
+      <w:proofErr w:type="spellStart"/>
+      <w:r>
+        <w:rPr>
+          <w:sz w:val="24"/>
+          <w:szCs w:val="24"/>
+          <w:lang w:val="en-US"/>
+        </w:rPr>
+        <w:t>gudang</w:t>
+      </w:r>
+      <w:proofErr w:type="spellEnd"/>
+      <w:r>
+        <w:rPr>
+          <w:sz w:val="24"/>
+          <w:szCs w:val="24"/>
+          <w:lang w:val="en-US"/>
+        </w:rPr>
+        <w:t>/</w:t>
+      </w:r>
+      <w:proofErr w:type="spellStart"/>
+      <w:r>
+        <w:rPr>
+          <w:sz w:val="24"/>
+          <w:szCs w:val="24"/>
+          <w:lang w:val="en-US"/>
+        </w:rPr>
+        <w:t>pabrik</w:t>
+      </w:r>
+      <w:proofErr w:type="spellEnd"/>
+      <w:r>
+        <w:rPr>
+          <w:sz w:val="24"/>
+          <w:szCs w:val="24"/>
+          <w:lang w:val="en-US"/>
+        </w:rPr>
+        <w:t>.</w:t>
       </w:r>
     </w:p>
     <w:p>
       <w:pPr>
-        <w:numPr>
-          <w:ilvl w:val="2"/>
-          <w:numId w:val="26"/>
-        </w:numPr>
-        <w:tabs>
-          <w:tab w:val="num" w:pos="2160"/>
-        </w:tabs>
         <w:spacing w:line="360" w:lineRule="auto"/>
-        <w:rPr>
-          <w:sz w:val="24"/>
-          <w:szCs w:val="24"/>
-          <w:lang w:val="en-US"/>
-        </w:rPr>
-      </w:pPr>
-      <w:proofErr w:type="spellStart"/>
-      <w:r>
-        <w:rPr>
-          <w:b/>
-          <w:bCs/>
-          <w:sz w:val="24"/>
-          <w:szCs w:val="24"/>
-          <w:lang w:val="en-US"/>
-        </w:rPr>
-        <w:t>Penjelasan</w:t>
-      </w:r>
-      <w:proofErr w:type="spellEnd"/>
-      <w:r>
-        <w:rPr>
-          <w:b/>
-          <w:bCs/>
-          <w:sz w:val="24"/>
-          <w:szCs w:val="24"/>
-          <w:lang w:val="en-US"/>
-        </w:rPr>
-        <w:t xml:space="preserve"> UI:</w:t>
+        <w:ind w:left="1728"/>
+        <w:rPr>
+          <w:sz w:val="24"/>
+          <w:szCs w:val="24"/>
+          <w:lang w:val="en-US"/>
+        </w:rPr>
+      </w:pPr>
+      <w:r>
+        <w:rPr>
+          <w:sz w:val="24"/>
+          <w:szCs w:val="24"/>
+          <w:lang w:val="en-US"/>
+        </w:rPr>
+        <w:drawing>
+          <wp:inline distT="0" distB="0" distL="0" distR="0" wp14:anchorId="64892B5A" wp14:editId="79B24B3E">
+            <wp:extent cx="5392420" cy="2463977"/>
+            <wp:effectExtent l="0" t="0" r="0" b="0"/>
+            <wp:docPr id="2106220488" name="Picture 1"/>
+            <wp:cNvGraphicFramePr>
+              <a:graphicFrameLocks xmlns:a="http://schemas.openxmlformats.org/drawingml/2006/main" noChangeAspect="1"/>
+            </wp:cNvGraphicFramePr>
+            <a:graphic xmlns:a="http://schemas.openxmlformats.org/drawingml/2006/main">
+              <a:graphicData uri="http://schemas.openxmlformats.org/drawingml/2006/picture">
+                <pic:pic xmlns:pic="http://schemas.openxmlformats.org/drawingml/2006/picture">
+                  <pic:nvPicPr>
+                    <pic:cNvPr id="2106220488" name=""/>
+                    <pic:cNvPicPr/>
+                  </pic:nvPicPr>
+                  <pic:blipFill>
+                    <a:blip r:embed="rId10"/>
+                    <a:stretch>
+                      <a:fillRect/>
+                    </a:stretch>
+                  </pic:blipFill>
+                  <pic:spPr>
+                    <a:xfrm>
+                      <a:off x="0" y="0"/>
+                      <a:ext cx="5403055" cy="2468836"/>
+                    </a:xfrm>
+                    <a:prstGeom prst="rect">
+                      <a:avLst/>
+                    </a:prstGeom>
+                  </pic:spPr>
+                </pic:pic>
+              </a:graphicData>
+            </a:graphic>
+          </wp:inline>
+        </w:drawing>
       </w:r>
     </w:p>
     <w:p>
@@ -7501,6 +8750,7 @@
         <w:spacing w:before="136"/>
       </w:pPr>
       <w:r>
+        <w:lastRenderedPageBreak/>
         <w:t>Pre Productio</w:t>
       </w:r>
       <w:r>
@@ -7532,8 +8782,9 @@
           <w:szCs w:val="24"/>
           <w:lang w:val="en-US"/>
         </w:rPr>
-        <w:t xml:space="preserve">Dashboard </w:t>
-      </w:r>
+        <w:t>Pre SPK List `pre-</w:t>
+      </w:r>
+      <w:proofErr w:type="spellStart"/>
       <w:r>
         <w:rPr>
           <w:b/>
@@ -7542,9 +8793,9 @@
           <w:szCs w:val="24"/>
           <w:lang w:val="en-US"/>
         </w:rPr>
-        <w:t xml:space="preserve">Production </w:t>
-      </w:r>
-      <w:proofErr w:type="spellStart"/>
+        <w:t>spk</w:t>
+      </w:r>
+      <w:proofErr w:type="spellEnd"/>
       <w:r>
         <w:rPr>
           <w:b/>
@@ -7553,16 +8804,7 @@
           <w:szCs w:val="24"/>
           <w:lang w:val="en-US"/>
         </w:rPr>
-        <w:t>Planing</w:t>
-      </w:r>
-      <w:proofErr w:type="spellEnd"/>
-      <w:r>
-        <w:rPr>
-          <w:sz w:val="24"/>
-          <w:szCs w:val="24"/>
-          <w:lang w:val="en-US"/>
-        </w:rPr>
-        <w:t xml:space="preserve"> `material-dashboard`</w:t>
+        <w:t>-list`</w:t>
       </w:r>
     </w:p>
     <w:p>
@@ -7611,6 +8853,32 @@
         </w:rPr>
         <w:t xml:space="preserve"> </w:t>
       </w:r>
+      <w:r>
+        <w:rPr>
+          <w:sz w:val="24"/>
+          <w:szCs w:val="24"/>
+          <w:lang w:val="en-US"/>
+        </w:rPr>
+        <w:t xml:space="preserve">Doc. ID, Date, Customer ID, Name, Total Qty, Total </w:t>
+      </w:r>
+      <w:proofErr w:type="spellStart"/>
+      <w:r>
+        <w:rPr>
+          <w:sz w:val="24"/>
+          <w:szCs w:val="24"/>
+          <w:lang w:val="en-US"/>
+        </w:rPr>
+        <w:t>Tonase</w:t>
+      </w:r>
+      <w:proofErr w:type="spellEnd"/>
+      <w:r>
+        <w:rPr>
+          <w:sz w:val="24"/>
+          <w:szCs w:val="24"/>
+          <w:lang w:val="en-US"/>
+        </w:rPr>
+        <w:t>, Notes, User ID, Status</w:t>
+      </w:r>
     </w:p>
     <w:p>
       <w:pPr>
@@ -7658,6 +8926,258 @@
         </w:rPr>
         <w:t xml:space="preserve"> </w:t>
       </w:r>
+      <w:proofErr w:type="spellStart"/>
+      <w:r>
+        <w:rPr>
+          <w:sz w:val="24"/>
+          <w:szCs w:val="24"/>
+          <w:lang w:val="en-US"/>
+        </w:rPr>
+        <w:t>Mengelola</w:t>
+      </w:r>
+      <w:proofErr w:type="spellEnd"/>
+      <w:r>
+        <w:rPr>
+          <w:sz w:val="24"/>
+          <w:szCs w:val="24"/>
+          <w:lang w:val="en-US"/>
+        </w:rPr>
+        <w:t xml:space="preserve"> </w:t>
+      </w:r>
+      <w:proofErr w:type="spellStart"/>
+      <w:r>
+        <w:rPr>
+          <w:sz w:val="24"/>
+          <w:szCs w:val="24"/>
+          <w:lang w:val="en-US"/>
+        </w:rPr>
+        <w:t>draf</w:t>
+      </w:r>
+      <w:proofErr w:type="spellEnd"/>
+      <w:r>
+        <w:rPr>
+          <w:sz w:val="24"/>
+          <w:szCs w:val="24"/>
+          <w:lang w:val="en-US"/>
+        </w:rPr>
+        <w:t xml:space="preserve"> </w:t>
+      </w:r>
+      <w:proofErr w:type="spellStart"/>
+      <w:r>
+        <w:rPr>
+          <w:sz w:val="24"/>
+          <w:szCs w:val="24"/>
+          <w:lang w:val="en-US"/>
+        </w:rPr>
+        <w:t>pengajuan</w:t>
+      </w:r>
+      <w:proofErr w:type="spellEnd"/>
+      <w:r>
+        <w:rPr>
+          <w:sz w:val="24"/>
+          <w:szCs w:val="24"/>
+          <w:lang w:val="en-US"/>
+        </w:rPr>
+        <w:t xml:space="preserve"> Surat </w:t>
+      </w:r>
+      <w:proofErr w:type="spellStart"/>
+      <w:r>
+        <w:rPr>
+          <w:sz w:val="24"/>
+          <w:szCs w:val="24"/>
+          <w:lang w:val="en-US"/>
+        </w:rPr>
+        <w:t>Perintah</w:t>
+      </w:r>
+      <w:proofErr w:type="spellEnd"/>
+      <w:r>
+        <w:rPr>
+          <w:sz w:val="24"/>
+          <w:szCs w:val="24"/>
+          <w:lang w:val="en-US"/>
+        </w:rPr>
+        <w:t xml:space="preserve"> </w:t>
+      </w:r>
+      <w:proofErr w:type="spellStart"/>
+      <w:r>
+        <w:rPr>
+          <w:sz w:val="24"/>
+          <w:szCs w:val="24"/>
+          <w:lang w:val="en-US"/>
+        </w:rPr>
+        <w:t>Kerja</w:t>
+      </w:r>
+      <w:proofErr w:type="spellEnd"/>
+      <w:r>
+        <w:rPr>
+          <w:sz w:val="24"/>
+          <w:szCs w:val="24"/>
+          <w:lang w:val="en-US"/>
+        </w:rPr>
+        <w:t xml:space="preserve"> (SPK) </w:t>
+      </w:r>
+      <w:proofErr w:type="spellStart"/>
+      <w:r>
+        <w:rPr>
+          <w:sz w:val="24"/>
+          <w:szCs w:val="24"/>
+          <w:lang w:val="en-US"/>
+        </w:rPr>
+        <w:t>awal</w:t>
+      </w:r>
+      <w:proofErr w:type="spellEnd"/>
+      <w:r>
+        <w:rPr>
+          <w:sz w:val="24"/>
+          <w:szCs w:val="24"/>
+          <w:lang w:val="en-US"/>
+        </w:rPr>
+        <w:t xml:space="preserve"> </w:t>
+      </w:r>
+      <w:proofErr w:type="spellStart"/>
+      <w:r>
+        <w:rPr>
+          <w:sz w:val="24"/>
+          <w:szCs w:val="24"/>
+          <w:lang w:val="en-US"/>
+        </w:rPr>
+        <w:t>berdasarkan</w:t>
+      </w:r>
+      <w:proofErr w:type="spellEnd"/>
+      <w:r>
+        <w:rPr>
+          <w:sz w:val="24"/>
+          <w:szCs w:val="24"/>
+          <w:lang w:val="en-US"/>
+        </w:rPr>
+        <w:t xml:space="preserve"> </w:t>
+      </w:r>
+      <w:proofErr w:type="spellStart"/>
+      <w:r>
+        <w:rPr>
+          <w:sz w:val="24"/>
+          <w:szCs w:val="24"/>
+          <w:lang w:val="en-US"/>
+        </w:rPr>
+        <w:t>pesanan</w:t>
+      </w:r>
+      <w:proofErr w:type="spellEnd"/>
+      <w:r>
+        <w:rPr>
+          <w:sz w:val="24"/>
+          <w:szCs w:val="24"/>
+          <w:lang w:val="en-US"/>
+        </w:rPr>
+        <w:t xml:space="preserve"> </w:t>
+      </w:r>
+      <w:proofErr w:type="spellStart"/>
+      <w:r>
+        <w:rPr>
+          <w:sz w:val="24"/>
+          <w:szCs w:val="24"/>
+          <w:lang w:val="en-US"/>
+        </w:rPr>
+        <w:t>pelanggan</w:t>
+      </w:r>
+      <w:proofErr w:type="spellEnd"/>
+      <w:r>
+        <w:rPr>
+          <w:sz w:val="24"/>
+          <w:szCs w:val="24"/>
+          <w:lang w:val="en-US"/>
+        </w:rPr>
+        <w:t xml:space="preserve"> </w:t>
+      </w:r>
+      <w:proofErr w:type="spellStart"/>
+      <w:r>
+        <w:rPr>
+          <w:sz w:val="24"/>
+          <w:szCs w:val="24"/>
+          <w:lang w:val="en-US"/>
+        </w:rPr>
+        <w:t>sebelum</w:t>
+      </w:r>
+      <w:proofErr w:type="spellEnd"/>
+      <w:r>
+        <w:rPr>
+          <w:sz w:val="24"/>
+          <w:szCs w:val="24"/>
+          <w:lang w:val="en-US"/>
+        </w:rPr>
+        <w:t xml:space="preserve"> </w:t>
+      </w:r>
+      <w:proofErr w:type="spellStart"/>
+      <w:r>
+        <w:rPr>
+          <w:sz w:val="24"/>
+          <w:szCs w:val="24"/>
+          <w:lang w:val="en-US"/>
+        </w:rPr>
+        <w:t>divalidasi</w:t>
+      </w:r>
+      <w:proofErr w:type="spellEnd"/>
+      <w:r>
+        <w:rPr>
+          <w:sz w:val="24"/>
+          <w:szCs w:val="24"/>
+          <w:lang w:val="en-US"/>
+        </w:rPr>
+        <w:t xml:space="preserve"> </w:t>
+      </w:r>
+      <w:proofErr w:type="spellStart"/>
+      <w:r>
+        <w:rPr>
+          <w:sz w:val="24"/>
+          <w:szCs w:val="24"/>
+          <w:lang w:val="en-US"/>
+        </w:rPr>
+        <w:t>menjadi</w:t>
+      </w:r>
+      <w:proofErr w:type="spellEnd"/>
+      <w:r>
+        <w:rPr>
+          <w:sz w:val="24"/>
+          <w:szCs w:val="24"/>
+          <w:lang w:val="en-US"/>
+        </w:rPr>
+        <w:t xml:space="preserve"> </w:t>
+      </w:r>
+      <w:proofErr w:type="spellStart"/>
+      <w:r>
+        <w:rPr>
+          <w:sz w:val="24"/>
+          <w:szCs w:val="24"/>
+          <w:lang w:val="en-US"/>
+        </w:rPr>
+        <w:t>dokumen</w:t>
+      </w:r>
+      <w:proofErr w:type="spellEnd"/>
+      <w:r>
+        <w:rPr>
+          <w:sz w:val="24"/>
+          <w:szCs w:val="24"/>
+          <w:lang w:val="en-US"/>
+        </w:rPr>
+        <w:t xml:space="preserve"> SPK </w:t>
+      </w:r>
+      <w:proofErr w:type="spellStart"/>
+      <w:r>
+        <w:rPr>
+          <w:sz w:val="24"/>
+          <w:szCs w:val="24"/>
+          <w:lang w:val="en-US"/>
+        </w:rPr>
+        <w:t>resmi</w:t>
+      </w:r>
+      <w:proofErr w:type="spellEnd"/>
+      <w:r>
+        <w:rPr>
+          <w:sz w:val="24"/>
+          <w:szCs w:val="24"/>
+          <w:lang w:val="en-US"/>
+        </w:rPr>
+        <w:t>.</w:t>
+      </w:r>
     </w:p>
     <w:p>
       <w:pPr>
@@ -7697,6 +9217,1839 @@
         </w:rPr>
         <w:t xml:space="preserve"> UI:</w:t>
       </w:r>
+      <w:r>
+        <w:t xml:space="preserve"> </w:t>
+      </w:r>
+      <w:proofErr w:type="spellStart"/>
+      <w:r>
+        <w:rPr>
+          <w:sz w:val="24"/>
+          <w:szCs w:val="24"/>
+          <w:lang w:val="en-US"/>
+        </w:rPr>
+        <w:t>Tampilan</w:t>
+      </w:r>
+      <w:proofErr w:type="spellEnd"/>
+      <w:r>
+        <w:rPr>
+          <w:sz w:val="24"/>
+          <w:szCs w:val="24"/>
+          <w:lang w:val="en-US"/>
+        </w:rPr>
+        <w:t xml:space="preserve"> </w:t>
+      </w:r>
+      <w:proofErr w:type="spellStart"/>
+      <w:r>
+        <w:rPr>
+          <w:sz w:val="24"/>
+          <w:szCs w:val="24"/>
+          <w:lang w:val="en-US"/>
+        </w:rPr>
+        <w:t>awal</w:t>
+      </w:r>
+      <w:proofErr w:type="spellEnd"/>
+      <w:r>
+        <w:rPr>
+          <w:sz w:val="24"/>
+          <w:szCs w:val="24"/>
+          <w:lang w:val="en-US"/>
+        </w:rPr>
+        <w:t xml:space="preserve"> </w:t>
+      </w:r>
+      <w:proofErr w:type="spellStart"/>
+      <w:r>
+        <w:rPr>
+          <w:sz w:val="24"/>
+          <w:szCs w:val="24"/>
+          <w:lang w:val="en-US"/>
+        </w:rPr>
+        <w:t>berupa</w:t>
+      </w:r>
+      <w:proofErr w:type="spellEnd"/>
+      <w:r>
+        <w:rPr>
+          <w:sz w:val="24"/>
+          <w:szCs w:val="24"/>
+          <w:lang w:val="en-US"/>
+        </w:rPr>
+        <w:t xml:space="preserve"> table data grid </w:t>
+      </w:r>
+      <w:proofErr w:type="spellStart"/>
+      <w:r>
+        <w:rPr>
+          <w:sz w:val="24"/>
+          <w:szCs w:val="24"/>
+          <w:lang w:val="en-US"/>
+        </w:rPr>
+        <w:t>menampilkan</w:t>
+      </w:r>
+      <w:proofErr w:type="spellEnd"/>
+      <w:r>
+        <w:rPr>
+          <w:sz w:val="24"/>
+          <w:szCs w:val="24"/>
+          <w:lang w:val="en-US"/>
+        </w:rPr>
+        <w:t xml:space="preserve"> Doc. ID, Date, Customer ID, Name, Total Qty, Total </w:t>
+      </w:r>
+      <w:proofErr w:type="spellStart"/>
+      <w:r>
+        <w:rPr>
+          <w:sz w:val="24"/>
+          <w:szCs w:val="24"/>
+          <w:lang w:val="en-US"/>
+        </w:rPr>
+        <w:t>Tonase</w:t>
+      </w:r>
+      <w:proofErr w:type="spellEnd"/>
+      <w:r>
+        <w:rPr>
+          <w:sz w:val="24"/>
+          <w:szCs w:val="24"/>
+          <w:lang w:val="en-US"/>
+        </w:rPr>
+        <w:t xml:space="preserve">, Status, dan Notes </w:t>
+      </w:r>
+      <w:proofErr w:type="spellStart"/>
+      <w:r>
+        <w:rPr>
+          <w:sz w:val="24"/>
+          <w:szCs w:val="24"/>
+          <w:lang w:val="en-US"/>
+        </w:rPr>
+        <w:t>beserta</w:t>
+      </w:r>
+      <w:proofErr w:type="spellEnd"/>
+      <w:r>
+        <w:rPr>
+          <w:sz w:val="24"/>
+          <w:szCs w:val="24"/>
+          <w:lang w:val="en-US"/>
+        </w:rPr>
+        <w:t xml:space="preserve"> filter </w:t>
+      </w:r>
+      <w:proofErr w:type="spellStart"/>
+      <w:r>
+        <w:rPr>
+          <w:sz w:val="24"/>
+          <w:szCs w:val="24"/>
+          <w:lang w:val="en-US"/>
+        </w:rPr>
+        <w:t>rentang</w:t>
+      </w:r>
+      <w:proofErr w:type="spellEnd"/>
+      <w:r>
+        <w:rPr>
+          <w:sz w:val="24"/>
+          <w:szCs w:val="24"/>
+          <w:lang w:val="en-US"/>
+        </w:rPr>
+        <w:t xml:space="preserve"> </w:t>
+      </w:r>
+      <w:proofErr w:type="spellStart"/>
+      <w:r>
+        <w:rPr>
+          <w:sz w:val="24"/>
+          <w:szCs w:val="24"/>
+          <w:lang w:val="en-US"/>
+        </w:rPr>
+        <w:t>tanggal</w:t>
+      </w:r>
+      <w:proofErr w:type="spellEnd"/>
+      <w:r>
+        <w:rPr>
+          <w:sz w:val="24"/>
+          <w:szCs w:val="24"/>
+          <w:lang w:val="en-US"/>
+        </w:rPr>
+        <w:t xml:space="preserve">, customer, dan status. </w:t>
+      </w:r>
+      <w:proofErr w:type="spellStart"/>
+      <w:r>
+        <w:rPr>
+          <w:sz w:val="24"/>
+          <w:szCs w:val="24"/>
+          <w:lang w:val="en-US"/>
+        </w:rPr>
+        <w:t>Tombol</w:t>
+      </w:r>
+      <w:proofErr w:type="spellEnd"/>
+      <w:r>
+        <w:rPr>
+          <w:sz w:val="24"/>
+          <w:szCs w:val="24"/>
+          <w:lang w:val="en-US"/>
+        </w:rPr>
+        <w:t xml:space="preserve"> </w:t>
+      </w:r>
+      <w:proofErr w:type="spellStart"/>
+      <w:r>
+        <w:rPr>
+          <w:sz w:val="24"/>
+          <w:szCs w:val="24"/>
+          <w:lang w:val="en-US"/>
+        </w:rPr>
+        <w:t>Tambah</w:t>
+      </w:r>
+      <w:proofErr w:type="spellEnd"/>
+      <w:r>
+        <w:rPr>
+          <w:sz w:val="24"/>
+          <w:szCs w:val="24"/>
+          <w:lang w:val="en-US"/>
+        </w:rPr>
+        <w:t xml:space="preserve"> </w:t>
+      </w:r>
+      <w:proofErr w:type="spellStart"/>
+      <w:r>
+        <w:rPr>
+          <w:sz w:val="24"/>
+          <w:szCs w:val="24"/>
+          <w:lang w:val="en-US"/>
+        </w:rPr>
+        <w:t>memunculkan</w:t>
+      </w:r>
+      <w:proofErr w:type="spellEnd"/>
+      <w:r>
+        <w:rPr>
+          <w:sz w:val="24"/>
+          <w:szCs w:val="24"/>
+          <w:lang w:val="en-US"/>
+        </w:rPr>
+        <w:t xml:space="preserve"> Pop-up Modal Form </w:t>
+      </w:r>
+      <w:proofErr w:type="spellStart"/>
+      <w:r>
+        <w:rPr>
+          <w:sz w:val="24"/>
+          <w:szCs w:val="24"/>
+          <w:lang w:val="en-US"/>
+        </w:rPr>
+        <w:t>berstruktur</w:t>
+      </w:r>
+      <w:proofErr w:type="spellEnd"/>
+      <w:r>
+        <w:rPr>
+          <w:sz w:val="24"/>
+          <w:szCs w:val="24"/>
+          <w:lang w:val="en-US"/>
+        </w:rPr>
+        <w:t xml:space="preserve"> Header (Date, Customer ID, Name, Notes) dan Table Detail Items (Product ID, Target Qty, Target </w:t>
+      </w:r>
+      <w:proofErr w:type="spellStart"/>
+      <w:r>
+        <w:rPr>
+          <w:sz w:val="24"/>
+          <w:szCs w:val="24"/>
+          <w:lang w:val="en-US"/>
+        </w:rPr>
+        <w:t>Tonase</w:t>
+      </w:r>
+      <w:proofErr w:type="spellEnd"/>
+      <w:r>
+        <w:rPr>
+          <w:sz w:val="24"/>
+          <w:szCs w:val="24"/>
+          <w:lang w:val="en-US"/>
+        </w:rPr>
+        <w:t xml:space="preserve">). Edit </w:t>
+      </w:r>
+      <w:proofErr w:type="spellStart"/>
+      <w:r>
+        <w:rPr>
+          <w:sz w:val="24"/>
+          <w:szCs w:val="24"/>
+          <w:lang w:val="en-US"/>
+        </w:rPr>
+        <w:t>memunculkan</w:t>
+      </w:r>
+      <w:proofErr w:type="spellEnd"/>
+      <w:r>
+        <w:rPr>
+          <w:sz w:val="24"/>
+          <w:szCs w:val="24"/>
+          <w:lang w:val="en-US"/>
+        </w:rPr>
+        <w:t xml:space="preserve"> modal form </w:t>
+      </w:r>
+      <w:proofErr w:type="spellStart"/>
+      <w:r>
+        <w:rPr>
+          <w:sz w:val="24"/>
+          <w:szCs w:val="24"/>
+          <w:lang w:val="en-US"/>
+        </w:rPr>
+        <w:t>terisi</w:t>
+      </w:r>
+      <w:proofErr w:type="spellEnd"/>
+      <w:r>
+        <w:rPr>
+          <w:sz w:val="24"/>
+          <w:szCs w:val="24"/>
+          <w:lang w:val="en-US"/>
+        </w:rPr>
+        <w:t xml:space="preserve">, Hapus </w:t>
+      </w:r>
+      <w:proofErr w:type="spellStart"/>
+      <w:r>
+        <w:rPr>
+          <w:sz w:val="24"/>
+          <w:szCs w:val="24"/>
+          <w:lang w:val="en-US"/>
+        </w:rPr>
+        <w:t>memunculkan</w:t>
+      </w:r>
+      <w:proofErr w:type="spellEnd"/>
+      <w:r>
+        <w:rPr>
+          <w:sz w:val="24"/>
+          <w:szCs w:val="24"/>
+          <w:lang w:val="en-US"/>
+        </w:rPr>
+        <w:t xml:space="preserve"> alert </w:t>
+      </w:r>
+      <w:proofErr w:type="spellStart"/>
+      <w:r>
+        <w:rPr>
+          <w:sz w:val="24"/>
+          <w:szCs w:val="24"/>
+          <w:lang w:val="en-US"/>
+        </w:rPr>
+        <w:t>konfirmasi</w:t>
+      </w:r>
+      <w:proofErr w:type="spellEnd"/>
+      <w:r>
+        <w:rPr>
+          <w:sz w:val="24"/>
+          <w:szCs w:val="24"/>
+          <w:lang w:val="en-US"/>
+        </w:rPr>
+        <w:t>.</w:t>
+      </w:r>
+    </w:p>
+    <w:p>
+      <w:pPr>
+        <w:tabs>
+          <w:tab w:val="num" w:pos="2160"/>
+        </w:tabs>
+        <w:spacing w:line="360" w:lineRule="auto"/>
+        <w:ind w:left="1728"/>
+        <w:rPr>
+          <w:sz w:val="24"/>
+          <w:szCs w:val="24"/>
+          <w:lang w:val="en-US"/>
+        </w:rPr>
+      </w:pPr>
+      <w:r>
+        <w:rPr>
+          <w:noProof/>
+        </w:rPr>
+        <w:drawing>
+          <wp:inline distT="0" distB="0" distL="0" distR="0" wp14:anchorId="64EC2FAE" wp14:editId="6D03F729">
+            <wp:extent cx="5573395" cy="2555137"/>
+            <wp:effectExtent l="0" t="0" r="8255" b="0"/>
+            <wp:docPr id="665378454" name="Picture 1"/>
+            <wp:cNvGraphicFramePr>
+              <a:graphicFrameLocks xmlns:a="http://schemas.openxmlformats.org/drawingml/2006/main" noChangeAspect="1"/>
+            </wp:cNvGraphicFramePr>
+            <a:graphic xmlns:a="http://schemas.openxmlformats.org/drawingml/2006/main">
+              <a:graphicData uri="http://schemas.openxmlformats.org/drawingml/2006/picture">
+                <pic:pic xmlns:pic="http://schemas.openxmlformats.org/drawingml/2006/picture">
+                  <pic:nvPicPr>
+                    <pic:cNvPr id="665378454" name=""/>
+                    <pic:cNvPicPr/>
+                  </pic:nvPicPr>
+                  <pic:blipFill>
+                    <a:blip r:embed="rId11"/>
+                    <a:stretch>
+                      <a:fillRect/>
+                    </a:stretch>
+                  </pic:blipFill>
+                  <pic:spPr>
+                    <a:xfrm>
+                      <a:off x="0" y="0"/>
+                      <a:ext cx="5586527" cy="2561157"/>
+                    </a:xfrm>
+                    <a:prstGeom prst="rect">
+                      <a:avLst/>
+                    </a:prstGeom>
+                  </pic:spPr>
+                </pic:pic>
+              </a:graphicData>
+            </a:graphic>
+          </wp:inline>
+        </w:drawing>
+      </w:r>
+      <w:r>
+        <w:rPr>
+          <w:sz w:val="24"/>
+          <w:szCs w:val="24"/>
+          <w:lang w:val="en-US"/>
+        </w:rPr>
+        <w:t>\</w:t>
+      </w:r>
+    </w:p>
+    <w:p>
+      <w:pPr>
+        <w:tabs>
+          <w:tab w:val="num" w:pos="2160"/>
+        </w:tabs>
+        <w:spacing w:line="360" w:lineRule="auto"/>
+        <w:ind w:left="1728"/>
+        <w:rPr>
+          <w:sz w:val="24"/>
+          <w:szCs w:val="24"/>
+          <w:lang w:val="en-US"/>
+        </w:rPr>
+      </w:pPr>
+      <w:r>
+        <w:rPr>
+          <w:noProof/>
+        </w:rPr>
+        <w:drawing>
+          <wp:inline distT="0" distB="0" distL="0" distR="0" wp14:anchorId="64950E34" wp14:editId="22D67DF0">
+            <wp:extent cx="4916170" cy="2602161"/>
+            <wp:effectExtent l="0" t="0" r="0" b="8255"/>
+            <wp:docPr id="1975173050" name="Picture 1"/>
+            <wp:cNvGraphicFramePr>
+              <a:graphicFrameLocks xmlns:a="http://schemas.openxmlformats.org/drawingml/2006/main" noChangeAspect="1"/>
+            </wp:cNvGraphicFramePr>
+            <a:graphic xmlns:a="http://schemas.openxmlformats.org/drawingml/2006/main">
+              <a:graphicData uri="http://schemas.openxmlformats.org/drawingml/2006/picture">
+                <pic:pic xmlns:pic="http://schemas.openxmlformats.org/drawingml/2006/picture">
+                  <pic:nvPicPr>
+                    <pic:cNvPr id="1975173050" name=""/>
+                    <pic:cNvPicPr/>
+                  </pic:nvPicPr>
+                  <pic:blipFill>
+                    <a:blip r:embed="rId12"/>
+                    <a:stretch>
+                      <a:fillRect/>
+                    </a:stretch>
+                  </pic:blipFill>
+                  <pic:spPr>
+                    <a:xfrm>
+                      <a:off x="0" y="0"/>
+                      <a:ext cx="4927079" cy="2607935"/>
+                    </a:xfrm>
+                    <a:prstGeom prst="rect">
+                      <a:avLst/>
+                    </a:prstGeom>
+                  </pic:spPr>
+                </pic:pic>
+              </a:graphicData>
+            </a:graphic>
+          </wp:inline>
+        </w:drawing>
+      </w:r>
+    </w:p>
+    <w:p>
+      <w:pPr>
+        <w:numPr>
+          <w:ilvl w:val="1"/>
+          <w:numId w:val="26"/>
+        </w:numPr>
+        <w:tabs>
+          <w:tab w:val="num" w:pos="1440"/>
+        </w:tabs>
+        <w:spacing w:line="360" w:lineRule="auto"/>
+        <w:rPr>
+          <w:sz w:val="24"/>
+          <w:szCs w:val="24"/>
+          <w:lang w:val="en-US"/>
+        </w:rPr>
+      </w:pPr>
+      <w:r>
+        <w:rPr>
+          <w:b/>
+          <w:bCs/>
+          <w:sz w:val="24"/>
+          <w:szCs w:val="24"/>
+          <w:lang w:val="en-US"/>
+        </w:rPr>
+        <w:t>SPK List `</w:t>
+      </w:r>
+      <w:proofErr w:type="spellStart"/>
+      <w:r>
+        <w:rPr>
+          <w:b/>
+          <w:bCs/>
+          <w:sz w:val="24"/>
+          <w:szCs w:val="24"/>
+          <w:lang w:val="en-US"/>
+        </w:rPr>
+        <w:t>spk</w:t>
+      </w:r>
+      <w:proofErr w:type="spellEnd"/>
+      <w:r>
+        <w:rPr>
+          <w:b/>
+          <w:bCs/>
+          <w:sz w:val="24"/>
+          <w:szCs w:val="24"/>
+          <w:lang w:val="en-US"/>
+        </w:rPr>
+        <w:t>-list`</w:t>
+      </w:r>
+    </w:p>
+    <w:p>
+      <w:pPr>
+        <w:numPr>
+          <w:ilvl w:val="2"/>
+          <w:numId w:val="26"/>
+        </w:numPr>
+        <w:tabs>
+          <w:tab w:val="num" w:pos="2160"/>
+        </w:tabs>
+        <w:spacing w:line="360" w:lineRule="auto"/>
+        <w:rPr>
+          <w:sz w:val="24"/>
+          <w:szCs w:val="24"/>
+          <w:lang w:val="en-US"/>
+        </w:rPr>
+      </w:pPr>
+      <w:proofErr w:type="spellStart"/>
+      <w:r>
+        <w:rPr>
+          <w:b/>
+          <w:bCs/>
+          <w:sz w:val="24"/>
+          <w:szCs w:val="24"/>
+          <w:lang w:val="en-US"/>
+        </w:rPr>
+        <w:t>Komponen</w:t>
+      </w:r>
+      <w:proofErr w:type="spellEnd"/>
+      <w:r>
+        <w:rPr>
+          <w:b/>
+          <w:bCs/>
+          <w:sz w:val="24"/>
+          <w:szCs w:val="24"/>
+          <w:lang w:val="en-US"/>
+        </w:rPr>
+        <w:t>:</w:t>
+      </w:r>
+      <w:r>
+        <w:rPr>
+          <w:sz w:val="24"/>
+          <w:szCs w:val="24"/>
+          <w:lang w:val="en-US"/>
+        </w:rPr>
+        <w:t xml:space="preserve"> </w:t>
+      </w:r>
+      <w:r>
+        <w:rPr>
+          <w:sz w:val="24"/>
+          <w:szCs w:val="24"/>
+          <w:lang w:val="en-US"/>
+        </w:rPr>
+        <w:t xml:space="preserve">Doc. ID, Date, Delivery Date, Total Qty, Total </w:t>
+      </w:r>
+      <w:proofErr w:type="spellStart"/>
+      <w:r>
+        <w:rPr>
+          <w:sz w:val="24"/>
+          <w:szCs w:val="24"/>
+          <w:lang w:val="en-US"/>
+        </w:rPr>
+        <w:t>Tonase</w:t>
+      </w:r>
+      <w:proofErr w:type="spellEnd"/>
+      <w:r>
+        <w:rPr>
+          <w:sz w:val="24"/>
+          <w:szCs w:val="24"/>
+          <w:lang w:val="en-US"/>
+        </w:rPr>
+        <w:t xml:space="preserve">, Total Qty Needs, Total </w:t>
+      </w:r>
+      <w:proofErr w:type="spellStart"/>
+      <w:r>
+        <w:rPr>
+          <w:sz w:val="24"/>
+          <w:szCs w:val="24"/>
+          <w:lang w:val="en-US"/>
+        </w:rPr>
+        <w:t>Tonase</w:t>
+      </w:r>
+      <w:proofErr w:type="spellEnd"/>
+      <w:r>
+        <w:rPr>
+          <w:sz w:val="24"/>
+          <w:szCs w:val="24"/>
+          <w:lang w:val="en-US"/>
+        </w:rPr>
+        <w:t xml:space="preserve"> Needs, Warehouse, Notes, User ID, Status</w:t>
+      </w:r>
+    </w:p>
+    <w:p>
+      <w:pPr>
+        <w:numPr>
+          <w:ilvl w:val="2"/>
+          <w:numId w:val="26"/>
+        </w:numPr>
+        <w:tabs>
+          <w:tab w:val="num" w:pos="2160"/>
+        </w:tabs>
+        <w:spacing w:line="360" w:lineRule="auto"/>
+        <w:rPr>
+          <w:sz w:val="24"/>
+          <w:szCs w:val="24"/>
+          <w:lang w:val="en-US"/>
+        </w:rPr>
+      </w:pPr>
+      <w:proofErr w:type="spellStart"/>
+      <w:r>
+        <w:rPr>
+          <w:b/>
+          <w:bCs/>
+          <w:sz w:val="24"/>
+          <w:szCs w:val="24"/>
+          <w:lang w:val="en-US"/>
+        </w:rPr>
+        <w:t>Fungsi</w:t>
+      </w:r>
+      <w:proofErr w:type="spellEnd"/>
+      <w:r>
+        <w:rPr>
+          <w:b/>
+          <w:bCs/>
+          <w:sz w:val="24"/>
+          <w:szCs w:val="24"/>
+          <w:lang w:val="en-US"/>
+        </w:rPr>
+        <w:t>:</w:t>
+      </w:r>
+      <w:r>
+        <w:rPr>
+          <w:sz w:val="24"/>
+          <w:szCs w:val="24"/>
+          <w:lang w:val="en-US"/>
+        </w:rPr>
+        <w:t xml:space="preserve"> </w:t>
+      </w:r>
+      <w:proofErr w:type="spellStart"/>
+      <w:r>
+        <w:rPr>
+          <w:sz w:val="24"/>
+          <w:szCs w:val="24"/>
+          <w:lang w:val="en-US"/>
+        </w:rPr>
+        <w:t>Menampilkan</w:t>
+      </w:r>
+      <w:proofErr w:type="spellEnd"/>
+      <w:r>
+        <w:rPr>
+          <w:sz w:val="24"/>
+          <w:szCs w:val="24"/>
+          <w:lang w:val="en-US"/>
+        </w:rPr>
+        <w:t xml:space="preserve"> dan </w:t>
+      </w:r>
+      <w:proofErr w:type="spellStart"/>
+      <w:r>
+        <w:rPr>
+          <w:sz w:val="24"/>
+          <w:szCs w:val="24"/>
+          <w:lang w:val="en-US"/>
+        </w:rPr>
+        <w:t>mengelola</w:t>
+      </w:r>
+      <w:proofErr w:type="spellEnd"/>
+      <w:r>
+        <w:rPr>
+          <w:sz w:val="24"/>
+          <w:szCs w:val="24"/>
+          <w:lang w:val="en-US"/>
+        </w:rPr>
+        <w:t xml:space="preserve"> </w:t>
+      </w:r>
+      <w:proofErr w:type="spellStart"/>
+      <w:r>
+        <w:rPr>
+          <w:sz w:val="24"/>
+          <w:szCs w:val="24"/>
+          <w:lang w:val="en-US"/>
+        </w:rPr>
+        <w:t>dokumen</w:t>
+      </w:r>
+      <w:proofErr w:type="spellEnd"/>
+      <w:r>
+        <w:rPr>
+          <w:sz w:val="24"/>
+          <w:szCs w:val="24"/>
+          <w:lang w:val="en-US"/>
+        </w:rPr>
+        <w:t xml:space="preserve"> </w:t>
+      </w:r>
+      <w:proofErr w:type="spellStart"/>
+      <w:r>
+        <w:rPr>
+          <w:sz w:val="24"/>
+          <w:szCs w:val="24"/>
+          <w:lang w:val="en-US"/>
+        </w:rPr>
+        <w:t>Perintah</w:t>
+      </w:r>
+      <w:proofErr w:type="spellEnd"/>
+      <w:r>
+        <w:rPr>
+          <w:sz w:val="24"/>
+          <w:szCs w:val="24"/>
+          <w:lang w:val="en-US"/>
+        </w:rPr>
+        <w:t xml:space="preserve"> </w:t>
+      </w:r>
+      <w:proofErr w:type="spellStart"/>
+      <w:r>
+        <w:rPr>
+          <w:sz w:val="24"/>
+          <w:szCs w:val="24"/>
+          <w:lang w:val="en-US"/>
+        </w:rPr>
+        <w:t>Kerja</w:t>
+      </w:r>
+      <w:proofErr w:type="spellEnd"/>
+      <w:r>
+        <w:rPr>
+          <w:sz w:val="24"/>
+          <w:szCs w:val="24"/>
+          <w:lang w:val="en-US"/>
+        </w:rPr>
+        <w:t xml:space="preserve"> </w:t>
+      </w:r>
+      <w:proofErr w:type="spellStart"/>
+      <w:r>
+        <w:rPr>
+          <w:sz w:val="24"/>
+          <w:szCs w:val="24"/>
+          <w:lang w:val="en-US"/>
+        </w:rPr>
+        <w:t>produksi</w:t>
+      </w:r>
+      <w:proofErr w:type="spellEnd"/>
+      <w:r>
+        <w:rPr>
+          <w:sz w:val="24"/>
+          <w:szCs w:val="24"/>
+          <w:lang w:val="en-US"/>
+        </w:rPr>
+        <w:t xml:space="preserve"> </w:t>
+      </w:r>
+      <w:proofErr w:type="spellStart"/>
+      <w:r>
+        <w:rPr>
+          <w:sz w:val="24"/>
+          <w:szCs w:val="24"/>
+          <w:lang w:val="en-US"/>
+        </w:rPr>
+        <w:t>resmi</w:t>
+      </w:r>
+      <w:proofErr w:type="spellEnd"/>
+      <w:r>
+        <w:rPr>
+          <w:sz w:val="24"/>
+          <w:szCs w:val="24"/>
+          <w:lang w:val="en-US"/>
+        </w:rPr>
+        <w:t xml:space="preserve"> yang </w:t>
+      </w:r>
+      <w:proofErr w:type="spellStart"/>
+      <w:r>
+        <w:rPr>
+          <w:sz w:val="24"/>
+          <w:szCs w:val="24"/>
+          <w:lang w:val="en-US"/>
+        </w:rPr>
+        <w:t>menjadi</w:t>
+      </w:r>
+      <w:proofErr w:type="spellEnd"/>
+      <w:r>
+        <w:rPr>
+          <w:sz w:val="24"/>
+          <w:szCs w:val="24"/>
+          <w:lang w:val="en-US"/>
+        </w:rPr>
+        <w:t xml:space="preserve"> </w:t>
+      </w:r>
+      <w:proofErr w:type="spellStart"/>
+      <w:r>
+        <w:rPr>
+          <w:sz w:val="24"/>
+          <w:szCs w:val="24"/>
+          <w:lang w:val="en-US"/>
+        </w:rPr>
+        <w:lastRenderedPageBreak/>
+        <w:t>acuan</w:t>
+      </w:r>
+      <w:proofErr w:type="spellEnd"/>
+      <w:r>
+        <w:rPr>
+          <w:sz w:val="24"/>
+          <w:szCs w:val="24"/>
+          <w:lang w:val="en-US"/>
+        </w:rPr>
+        <w:t xml:space="preserve"> </w:t>
+      </w:r>
+      <w:proofErr w:type="spellStart"/>
+      <w:r>
+        <w:rPr>
+          <w:sz w:val="24"/>
+          <w:szCs w:val="24"/>
+          <w:lang w:val="en-US"/>
+        </w:rPr>
+        <w:t>jadwal</w:t>
+      </w:r>
+      <w:proofErr w:type="spellEnd"/>
+      <w:r>
+        <w:rPr>
+          <w:sz w:val="24"/>
+          <w:szCs w:val="24"/>
+          <w:lang w:val="en-US"/>
+        </w:rPr>
+        <w:t xml:space="preserve"> </w:t>
+      </w:r>
+      <w:proofErr w:type="spellStart"/>
+      <w:r>
+        <w:rPr>
+          <w:sz w:val="24"/>
+          <w:szCs w:val="24"/>
+          <w:lang w:val="en-US"/>
+        </w:rPr>
+        <w:t>pabrik</w:t>
+      </w:r>
+      <w:proofErr w:type="spellEnd"/>
+      <w:r>
+        <w:rPr>
+          <w:sz w:val="24"/>
+          <w:szCs w:val="24"/>
+          <w:lang w:val="en-US"/>
+        </w:rPr>
+        <w:t xml:space="preserve"> </w:t>
+      </w:r>
+      <w:proofErr w:type="spellStart"/>
+      <w:r>
+        <w:rPr>
+          <w:sz w:val="24"/>
+          <w:szCs w:val="24"/>
+          <w:lang w:val="en-US"/>
+        </w:rPr>
+        <w:t>serta</w:t>
+      </w:r>
+      <w:proofErr w:type="spellEnd"/>
+      <w:r>
+        <w:rPr>
+          <w:sz w:val="24"/>
+          <w:szCs w:val="24"/>
+          <w:lang w:val="en-US"/>
+        </w:rPr>
+        <w:t xml:space="preserve"> </w:t>
+      </w:r>
+      <w:proofErr w:type="spellStart"/>
+      <w:r>
+        <w:rPr>
+          <w:sz w:val="24"/>
+          <w:szCs w:val="24"/>
+          <w:lang w:val="en-US"/>
+        </w:rPr>
+        <w:t>kalkulasi</w:t>
+      </w:r>
+      <w:proofErr w:type="spellEnd"/>
+      <w:r>
+        <w:rPr>
+          <w:sz w:val="24"/>
+          <w:szCs w:val="24"/>
+          <w:lang w:val="en-US"/>
+        </w:rPr>
+        <w:t xml:space="preserve"> </w:t>
+      </w:r>
+      <w:proofErr w:type="spellStart"/>
+      <w:r>
+        <w:rPr>
+          <w:sz w:val="24"/>
+          <w:szCs w:val="24"/>
+          <w:lang w:val="en-US"/>
+        </w:rPr>
+        <w:t>pemenuhan</w:t>
+      </w:r>
+      <w:proofErr w:type="spellEnd"/>
+      <w:r>
+        <w:rPr>
+          <w:sz w:val="24"/>
+          <w:szCs w:val="24"/>
+          <w:lang w:val="en-US"/>
+        </w:rPr>
+        <w:t xml:space="preserve"> </w:t>
+      </w:r>
+      <w:proofErr w:type="spellStart"/>
+      <w:r>
+        <w:rPr>
+          <w:sz w:val="24"/>
+          <w:szCs w:val="24"/>
+          <w:lang w:val="en-US"/>
+        </w:rPr>
+        <w:t>stok</w:t>
+      </w:r>
+      <w:proofErr w:type="spellEnd"/>
+      <w:r>
+        <w:rPr>
+          <w:sz w:val="24"/>
+          <w:szCs w:val="24"/>
+          <w:lang w:val="en-US"/>
+        </w:rPr>
+        <w:t xml:space="preserve"> material.</w:t>
+      </w:r>
+    </w:p>
+    <w:p>
+      <w:pPr>
+        <w:numPr>
+          <w:ilvl w:val="2"/>
+          <w:numId w:val="26"/>
+        </w:numPr>
+        <w:tabs>
+          <w:tab w:val="num" w:pos="2160"/>
+        </w:tabs>
+        <w:spacing w:line="360" w:lineRule="auto"/>
+        <w:rPr>
+          <w:sz w:val="24"/>
+          <w:szCs w:val="24"/>
+          <w:lang w:val="en-US"/>
+        </w:rPr>
+      </w:pPr>
+      <w:proofErr w:type="spellStart"/>
+      <w:r>
+        <w:rPr>
+          <w:b/>
+          <w:bCs/>
+          <w:sz w:val="24"/>
+          <w:szCs w:val="24"/>
+          <w:lang w:val="en-US"/>
+        </w:rPr>
+        <w:t>Penjelasan</w:t>
+      </w:r>
+      <w:proofErr w:type="spellEnd"/>
+      <w:r>
+        <w:rPr>
+          <w:b/>
+          <w:bCs/>
+          <w:sz w:val="24"/>
+          <w:szCs w:val="24"/>
+          <w:lang w:val="en-US"/>
+        </w:rPr>
+        <w:t xml:space="preserve"> UI:</w:t>
+      </w:r>
+      <w:r>
+        <w:rPr>
+          <w:b/>
+          <w:bCs/>
+          <w:sz w:val="24"/>
+          <w:szCs w:val="24"/>
+          <w:lang w:val="en-US"/>
+        </w:rPr>
+        <w:t xml:space="preserve"> </w:t>
+      </w:r>
+      <w:proofErr w:type="spellStart"/>
+      <w:r>
+        <w:rPr>
+          <w:sz w:val="24"/>
+          <w:szCs w:val="24"/>
+          <w:lang w:val="en-US"/>
+        </w:rPr>
+        <w:t>Tampilan</w:t>
+      </w:r>
+      <w:proofErr w:type="spellEnd"/>
+      <w:r>
+        <w:rPr>
+          <w:sz w:val="24"/>
+          <w:szCs w:val="24"/>
+          <w:lang w:val="en-US"/>
+        </w:rPr>
+        <w:t xml:space="preserve"> </w:t>
+      </w:r>
+      <w:proofErr w:type="spellStart"/>
+      <w:r>
+        <w:rPr>
+          <w:sz w:val="24"/>
+          <w:szCs w:val="24"/>
+          <w:lang w:val="en-US"/>
+        </w:rPr>
+        <w:t>awal</w:t>
+      </w:r>
+      <w:proofErr w:type="spellEnd"/>
+      <w:r>
+        <w:rPr>
+          <w:sz w:val="24"/>
+          <w:szCs w:val="24"/>
+          <w:lang w:val="en-US"/>
+        </w:rPr>
+        <w:t xml:space="preserve"> </w:t>
+      </w:r>
+      <w:proofErr w:type="spellStart"/>
+      <w:r>
+        <w:rPr>
+          <w:sz w:val="24"/>
+          <w:szCs w:val="24"/>
+          <w:lang w:val="en-US"/>
+        </w:rPr>
+        <w:t>berupa</w:t>
+      </w:r>
+      <w:proofErr w:type="spellEnd"/>
+      <w:r>
+        <w:rPr>
+          <w:sz w:val="24"/>
+          <w:szCs w:val="24"/>
+          <w:lang w:val="en-US"/>
+        </w:rPr>
+        <w:t xml:space="preserve"> table data grid </w:t>
+      </w:r>
+      <w:proofErr w:type="spellStart"/>
+      <w:r>
+        <w:rPr>
+          <w:sz w:val="24"/>
+          <w:szCs w:val="24"/>
+          <w:lang w:val="en-US"/>
+        </w:rPr>
+        <w:t>menampilkan</w:t>
+      </w:r>
+      <w:proofErr w:type="spellEnd"/>
+      <w:r>
+        <w:rPr>
+          <w:sz w:val="24"/>
+          <w:szCs w:val="24"/>
+          <w:lang w:val="en-US"/>
+        </w:rPr>
+        <w:t xml:space="preserve"> Doc. ID, Date, Delivery Date, Warehouse, Total Qty, Total </w:t>
+      </w:r>
+      <w:proofErr w:type="spellStart"/>
+      <w:r>
+        <w:rPr>
+          <w:sz w:val="24"/>
+          <w:szCs w:val="24"/>
+          <w:lang w:val="en-US"/>
+        </w:rPr>
+        <w:t>Tonase</w:t>
+      </w:r>
+      <w:proofErr w:type="spellEnd"/>
+      <w:r>
+        <w:rPr>
+          <w:sz w:val="24"/>
+          <w:szCs w:val="24"/>
+          <w:lang w:val="en-US"/>
+        </w:rPr>
+        <w:t xml:space="preserve">, Status, dan User ID </w:t>
+      </w:r>
+      <w:proofErr w:type="spellStart"/>
+      <w:r>
+        <w:rPr>
+          <w:sz w:val="24"/>
+          <w:szCs w:val="24"/>
+          <w:lang w:val="en-US"/>
+        </w:rPr>
+        <w:t>beserta</w:t>
+      </w:r>
+      <w:proofErr w:type="spellEnd"/>
+      <w:r>
+        <w:rPr>
+          <w:sz w:val="24"/>
+          <w:szCs w:val="24"/>
+          <w:lang w:val="en-US"/>
+        </w:rPr>
+        <w:t xml:space="preserve"> filter </w:t>
+      </w:r>
+      <w:proofErr w:type="spellStart"/>
+      <w:r>
+        <w:rPr>
+          <w:sz w:val="24"/>
+          <w:szCs w:val="24"/>
+          <w:lang w:val="en-US"/>
+        </w:rPr>
+        <w:t>tanggal</w:t>
+      </w:r>
+      <w:proofErr w:type="spellEnd"/>
+      <w:r>
+        <w:rPr>
+          <w:sz w:val="24"/>
+          <w:szCs w:val="24"/>
+          <w:lang w:val="en-US"/>
+        </w:rPr>
+        <w:t xml:space="preserve">, warehouse, dan status. </w:t>
+      </w:r>
+      <w:proofErr w:type="spellStart"/>
+      <w:r>
+        <w:rPr>
+          <w:sz w:val="24"/>
+          <w:szCs w:val="24"/>
+          <w:lang w:val="en-US"/>
+        </w:rPr>
+        <w:t>Tombol</w:t>
+      </w:r>
+      <w:proofErr w:type="spellEnd"/>
+      <w:r>
+        <w:rPr>
+          <w:sz w:val="24"/>
+          <w:szCs w:val="24"/>
+          <w:lang w:val="en-US"/>
+        </w:rPr>
+        <w:t xml:space="preserve"> </w:t>
+      </w:r>
+      <w:proofErr w:type="spellStart"/>
+      <w:r>
+        <w:rPr>
+          <w:sz w:val="24"/>
+          <w:szCs w:val="24"/>
+          <w:lang w:val="en-US"/>
+        </w:rPr>
+        <w:t>Tambah</w:t>
+      </w:r>
+      <w:proofErr w:type="spellEnd"/>
+      <w:r>
+        <w:rPr>
+          <w:sz w:val="24"/>
+          <w:szCs w:val="24"/>
+          <w:lang w:val="en-US"/>
+        </w:rPr>
+        <w:t xml:space="preserve"> </w:t>
+      </w:r>
+      <w:proofErr w:type="spellStart"/>
+      <w:r>
+        <w:rPr>
+          <w:sz w:val="24"/>
+          <w:szCs w:val="24"/>
+          <w:lang w:val="en-US"/>
+        </w:rPr>
+        <w:t>memunculkan</w:t>
+      </w:r>
+      <w:proofErr w:type="spellEnd"/>
+      <w:r>
+        <w:rPr>
+          <w:sz w:val="24"/>
+          <w:szCs w:val="24"/>
+          <w:lang w:val="en-US"/>
+        </w:rPr>
+        <w:t xml:space="preserve"> Pop-up Modal Form </w:t>
+      </w:r>
+      <w:proofErr w:type="spellStart"/>
+      <w:r>
+        <w:rPr>
+          <w:sz w:val="24"/>
+          <w:szCs w:val="24"/>
+          <w:lang w:val="en-US"/>
+        </w:rPr>
+        <w:t>dengan</w:t>
+      </w:r>
+      <w:proofErr w:type="spellEnd"/>
+      <w:r>
+        <w:rPr>
+          <w:sz w:val="24"/>
+          <w:szCs w:val="24"/>
+          <w:lang w:val="en-US"/>
+        </w:rPr>
+        <w:t xml:space="preserve"> </w:t>
+      </w:r>
+      <w:proofErr w:type="spellStart"/>
+      <w:r>
+        <w:rPr>
+          <w:sz w:val="24"/>
+          <w:szCs w:val="24"/>
+          <w:lang w:val="en-US"/>
+        </w:rPr>
+        <w:t>penarikan</w:t>
+      </w:r>
+      <w:proofErr w:type="spellEnd"/>
+      <w:r>
+        <w:rPr>
+          <w:sz w:val="24"/>
+          <w:szCs w:val="24"/>
+          <w:lang w:val="en-US"/>
+        </w:rPr>
+        <w:t xml:space="preserve"> data </w:t>
+      </w:r>
+      <w:proofErr w:type="spellStart"/>
+      <w:r>
+        <w:rPr>
+          <w:sz w:val="24"/>
+          <w:szCs w:val="24"/>
+          <w:lang w:val="en-US"/>
+        </w:rPr>
+        <w:t>dari</w:t>
+      </w:r>
+      <w:proofErr w:type="spellEnd"/>
+      <w:r>
+        <w:rPr>
+          <w:sz w:val="24"/>
+          <w:szCs w:val="24"/>
+          <w:lang w:val="en-US"/>
+        </w:rPr>
+        <w:t xml:space="preserve"> Pre SPK, </w:t>
+      </w:r>
+      <w:proofErr w:type="spellStart"/>
+      <w:r>
+        <w:rPr>
+          <w:sz w:val="24"/>
+          <w:szCs w:val="24"/>
+          <w:lang w:val="en-US"/>
+        </w:rPr>
+        <w:t>mengalkulasi</w:t>
+      </w:r>
+      <w:proofErr w:type="spellEnd"/>
+      <w:r>
+        <w:rPr>
+          <w:sz w:val="24"/>
+          <w:szCs w:val="24"/>
+          <w:lang w:val="en-US"/>
+        </w:rPr>
+        <w:t xml:space="preserve"> </w:t>
+      </w:r>
+      <w:proofErr w:type="spellStart"/>
+      <w:r>
+        <w:rPr>
+          <w:sz w:val="24"/>
+          <w:szCs w:val="24"/>
+          <w:lang w:val="en-US"/>
+        </w:rPr>
+        <w:t>otomatis</w:t>
+      </w:r>
+      <w:proofErr w:type="spellEnd"/>
+      <w:r>
+        <w:rPr>
+          <w:sz w:val="24"/>
+          <w:szCs w:val="24"/>
+          <w:lang w:val="en-US"/>
+        </w:rPr>
+        <w:t xml:space="preserve"> </w:t>
+      </w:r>
+      <w:proofErr w:type="spellStart"/>
+      <w:r>
+        <w:rPr>
+          <w:sz w:val="24"/>
+          <w:szCs w:val="24"/>
+          <w:lang w:val="en-US"/>
+        </w:rPr>
+        <w:t>sisa</w:t>
+      </w:r>
+      <w:proofErr w:type="spellEnd"/>
+      <w:r>
+        <w:rPr>
+          <w:sz w:val="24"/>
+          <w:szCs w:val="24"/>
+          <w:lang w:val="en-US"/>
+        </w:rPr>
+        <w:t xml:space="preserve"> </w:t>
+      </w:r>
+      <w:proofErr w:type="spellStart"/>
+      <w:r>
+        <w:rPr>
+          <w:sz w:val="24"/>
+          <w:szCs w:val="24"/>
+          <w:lang w:val="en-US"/>
+        </w:rPr>
+        <w:t>kebutuhan</w:t>
+      </w:r>
+      <w:proofErr w:type="spellEnd"/>
+      <w:r>
+        <w:rPr>
+          <w:sz w:val="24"/>
+          <w:szCs w:val="24"/>
+          <w:lang w:val="en-US"/>
+        </w:rPr>
+        <w:t xml:space="preserve"> (Total Qty Needs / </w:t>
+      </w:r>
+      <w:proofErr w:type="spellStart"/>
+      <w:r>
+        <w:rPr>
+          <w:sz w:val="24"/>
+          <w:szCs w:val="24"/>
+          <w:lang w:val="en-US"/>
+        </w:rPr>
+        <w:t>Tonase</w:t>
+      </w:r>
+      <w:proofErr w:type="spellEnd"/>
+      <w:r>
+        <w:rPr>
+          <w:sz w:val="24"/>
+          <w:szCs w:val="24"/>
+          <w:lang w:val="en-US"/>
+        </w:rPr>
+        <w:t xml:space="preserve"> Needs), </w:t>
+      </w:r>
+      <w:proofErr w:type="spellStart"/>
+      <w:r>
+        <w:rPr>
+          <w:sz w:val="24"/>
+          <w:szCs w:val="24"/>
+          <w:lang w:val="en-US"/>
+        </w:rPr>
+        <w:t>serta</w:t>
+      </w:r>
+      <w:proofErr w:type="spellEnd"/>
+      <w:r>
+        <w:rPr>
+          <w:sz w:val="24"/>
+          <w:szCs w:val="24"/>
+          <w:lang w:val="en-US"/>
+        </w:rPr>
+        <w:t xml:space="preserve"> </w:t>
+      </w:r>
+      <w:proofErr w:type="spellStart"/>
+      <w:r>
+        <w:rPr>
+          <w:sz w:val="24"/>
+          <w:szCs w:val="24"/>
+          <w:lang w:val="en-US"/>
+        </w:rPr>
+        <w:t>menentukan</w:t>
+      </w:r>
+      <w:proofErr w:type="spellEnd"/>
+      <w:r>
+        <w:rPr>
+          <w:sz w:val="24"/>
+          <w:szCs w:val="24"/>
+          <w:lang w:val="en-US"/>
+        </w:rPr>
+        <w:t xml:space="preserve"> </w:t>
+      </w:r>
+      <w:proofErr w:type="spellStart"/>
+      <w:r>
+        <w:rPr>
+          <w:sz w:val="24"/>
+          <w:szCs w:val="24"/>
+          <w:lang w:val="en-US"/>
+        </w:rPr>
+        <w:t>gudang</w:t>
+      </w:r>
+      <w:proofErr w:type="spellEnd"/>
+      <w:r>
+        <w:rPr>
+          <w:sz w:val="24"/>
+          <w:szCs w:val="24"/>
+          <w:lang w:val="en-US"/>
+        </w:rPr>
+        <w:t xml:space="preserve"> </w:t>
+      </w:r>
+      <w:proofErr w:type="spellStart"/>
+      <w:r>
+        <w:rPr>
+          <w:sz w:val="24"/>
+          <w:szCs w:val="24"/>
+          <w:lang w:val="en-US"/>
+        </w:rPr>
+        <w:t>alokasi</w:t>
+      </w:r>
+      <w:proofErr w:type="spellEnd"/>
+      <w:r>
+        <w:rPr>
+          <w:sz w:val="24"/>
+          <w:szCs w:val="24"/>
+          <w:lang w:val="en-US"/>
+        </w:rPr>
+        <w:t xml:space="preserve">. Edit </w:t>
+      </w:r>
+      <w:proofErr w:type="spellStart"/>
+      <w:r>
+        <w:rPr>
+          <w:sz w:val="24"/>
+          <w:szCs w:val="24"/>
+          <w:lang w:val="en-US"/>
+        </w:rPr>
+        <w:t>memunculkan</w:t>
+      </w:r>
+      <w:proofErr w:type="spellEnd"/>
+      <w:r>
+        <w:rPr>
+          <w:sz w:val="24"/>
+          <w:szCs w:val="24"/>
+          <w:lang w:val="en-US"/>
+        </w:rPr>
+        <w:t xml:space="preserve"> modal form </w:t>
+      </w:r>
+      <w:proofErr w:type="spellStart"/>
+      <w:r>
+        <w:rPr>
+          <w:sz w:val="24"/>
+          <w:szCs w:val="24"/>
+          <w:lang w:val="en-US"/>
+        </w:rPr>
+        <w:t>terisi</w:t>
+      </w:r>
+      <w:proofErr w:type="spellEnd"/>
+      <w:r>
+        <w:rPr>
+          <w:sz w:val="24"/>
+          <w:szCs w:val="24"/>
+          <w:lang w:val="en-US"/>
+        </w:rPr>
+        <w:t xml:space="preserve">, Hapus </w:t>
+      </w:r>
+      <w:proofErr w:type="spellStart"/>
+      <w:r>
+        <w:rPr>
+          <w:sz w:val="24"/>
+          <w:szCs w:val="24"/>
+          <w:lang w:val="en-US"/>
+        </w:rPr>
+        <w:t>memunculkan</w:t>
+      </w:r>
+      <w:proofErr w:type="spellEnd"/>
+      <w:r>
+        <w:rPr>
+          <w:sz w:val="24"/>
+          <w:szCs w:val="24"/>
+          <w:lang w:val="en-US"/>
+        </w:rPr>
+        <w:t xml:space="preserve"> alert </w:t>
+      </w:r>
+      <w:proofErr w:type="spellStart"/>
+      <w:r>
+        <w:rPr>
+          <w:sz w:val="24"/>
+          <w:szCs w:val="24"/>
+          <w:lang w:val="en-US"/>
+        </w:rPr>
+        <w:t>konfirmasi</w:t>
+      </w:r>
+      <w:proofErr w:type="spellEnd"/>
+      <w:r>
+        <w:rPr>
+          <w:sz w:val="24"/>
+          <w:szCs w:val="24"/>
+          <w:lang w:val="en-US"/>
+        </w:rPr>
+        <w:t>.</w:t>
+      </w:r>
+    </w:p>
+    <w:p>
+      <w:pPr>
+        <w:spacing w:line="360" w:lineRule="auto"/>
+        <w:ind w:left="1728"/>
+        <w:rPr>
+          <w:sz w:val="24"/>
+          <w:szCs w:val="24"/>
+          <w:lang w:val="en-US"/>
+        </w:rPr>
+      </w:pPr>
+      <w:r>
+        <w:rPr>
+          <w:noProof/>
+        </w:rPr>
+        <w:drawing>
+          <wp:inline distT="0" distB="0" distL="0" distR="0" wp14:anchorId="02FE77C6" wp14:editId="7A0539FE">
+            <wp:extent cx="5401945" cy="2467847"/>
+            <wp:effectExtent l="0" t="0" r="8255" b="8890"/>
+            <wp:docPr id="394454695" name="Picture 1"/>
+            <wp:cNvGraphicFramePr>
+              <a:graphicFrameLocks xmlns:a="http://schemas.openxmlformats.org/drawingml/2006/main" noChangeAspect="1"/>
+            </wp:cNvGraphicFramePr>
+            <a:graphic xmlns:a="http://schemas.openxmlformats.org/drawingml/2006/main">
+              <a:graphicData uri="http://schemas.openxmlformats.org/drawingml/2006/picture">
+                <pic:pic xmlns:pic="http://schemas.openxmlformats.org/drawingml/2006/picture">
+                  <pic:nvPicPr>
+                    <pic:cNvPr id="394454695" name=""/>
+                    <pic:cNvPicPr/>
+                  </pic:nvPicPr>
+                  <pic:blipFill>
+                    <a:blip r:embed="rId13"/>
+                    <a:stretch>
+                      <a:fillRect/>
+                    </a:stretch>
+                  </pic:blipFill>
+                  <pic:spPr>
+                    <a:xfrm>
+                      <a:off x="0" y="0"/>
+                      <a:ext cx="5408506" cy="2470844"/>
+                    </a:xfrm>
+                    <a:prstGeom prst="rect">
+                      <a:avLst/>
+                    </a:prstGeom>
+                  </pic:spPr>
+                </pic:pic>
+              </a:graphicData>
+            </a:graphic>
+          </wp:inline>
+        </w:drawing>
+      </w:r>
+    </w:p>
+    <w:p>
+      <w:pPr>
+        <w:spacing w:line="360" w:lineRule="auto"/>
+        <w:ind w:left="1728"/>
+        <w:rPr>
+          <w:sz w:val="24"/>
+          <w:szCs w:val="24"/>
+          <w:lang w:val="en-US"/>
+        </w:rPr>
+      </w:pPr>
+      <w:r>
+        <w:rPr>
+          <w:noProof/>
+        </w:rPr>
+        <w:drawing>
+          <wp:inline distT="0" distB="0" distL="0" distR="0" wp14:anchorId="71423896" wp14:editId="1B1B8BCE">
+            <wp:extent cx="4687570" cy="2432577"/>
+            <wp:effectExtent l="0" t="0" r="0" b="6350"/>
+            <wp:docPr id="354856545" name="Picture 1"/>
+            <wp:cNvGraphicFramePr>
+              <a:graphicFrameLocks xmlns:a="http://schemas.openxmlformats.org/drawingml/2006/main" noChangeAspect="1"/>
+            </wp:cNvGraphicFramePr>
+            <a:graphic xmlns:a="http://schemas.openxmlformats.org/drawingml/2006/main">
+              <a:graphicData uri="http://schemas.openxmlformats.org/drawingml/2006/picture">
+                <pic:pic xmlns:pic="http://schemas.openxmlformats.org/drawingml/2006/picture">
+                  <pic:nvPicPr>
+                    <pic:cNvPr id="354856545" name=""/>
+                    <pic:cNvPicPr/>
+                  </pic:nvPicPr>
+                  <pic:blipFill>
+                    <a:blip r:embed="rId14"/>
+                    <a:stretch>
+                      <a:fillRect/>
+                    </a:stretch>
+                  </pic:blipFill>
+                  <pic:spPr>
+                    <a:xfrm>
+                      <a:off x="0" y="0"/>
+                      <a:ext cx="4695079" cy="2436474"/>
+                    </a:xfrm>
+                    <a:prstGeom prst="rect">
+                      <a:avLst/>
+                    </a:prstGeom>
+                  </pic:spPr>
+                </pic:pic>
+              </a:graphicData>
+            </a:graphic>
+          </wp:inline>
+        </w:drawing>
+      </w:r>
+    </w:p>
+    <w:p>
+      <w:pPr>
+        <w:numPr>
+          <w:ilvl w:val="1"/>
+          <w:numId w:val="26"/>
+        </w:numPr>
+        <w:tabs>
+          <w:tab w:val="num" w:pos="1440"/>
+        </w:tabs>
+        <w:spacing w:line="360" w:lineRule="auto"/>
+        <w:rPr>
+          <w:sz w:val="24"/>
+          <w:szCs w:val="24"/>
+          <w:lang w:val="en-US"/>
+        </w:rPr>
+      </w:pPr>
+      <w:r>
+        <w:rPr>
+          <w:b/>
+          <w:bCs/>
+          <w:sz w:val="24"/>
+          <w:szCs w:val="24"/>
+          <w:lang w:val="en-US"/>
+        </w:rPr>
+        <w:t>Production Scheduling `production-scheduling`</w:t>
+      </w:r>
+    </w:p>
+    <w:p>
+      <w:pPr>
+        <w:numPr>
+          <w:ilvl w:val="2"/>
+          <w:numId w:val="26"/>
+        </w:numPr>
+        <w:tabs>
+          <w:tab w:val="num" w:pos="2160"/>
+        </w:tabs>
+        <w:spacing w:line="360" w:lineRule="auto"/>
+        <w:rPr>
+          <w:sz w:val="24"/>
+          <w:szCs w:val="24"/>
+          <w:lang w:val="en-US"/>
+        </w:rPr>
+      </w:pPr>
+      <w:proofErr w:type="spellStart"/>
+      <w:r>
+        <w:rPr>
+          <w:b/>
+          <w:bCs/>
+          <w:sz w:val="24"/>
+          <w:szCs w:val="24"/>
+          <w:lang w:val="en-US"/>
+        </w:rPr>
+        <w:t>Komponen</w:t>
+      </w:r>
+      <w:proofErr w:type="spellEnd"/>
+      <w:r>
+        <w:rPr>
+          <w:b/>
+          <w:bCs/>
+          <w:sz w:val="24"/>
+          <w:szCs w:val="24"/>
+          <w:lang w:val="en-US"/>
+        </w:rPr>
+        <w:t>:</w:t>
+      </w:r>
+      <w:r>
+        <w:rPr>
+          <w:sz w:val="24"/>
+          <w:szCs w:val="24"/>
+          <w:lang w:val="en-US"/>
+        </w:rPr>
+        <w:t xml:space="preserve"> </w:t>
+      </w:r>
+    </w:p>
+    <w:p>
+      <w:pPr>
+        <w:numPr>
+          <w:ilvl w:val="2"/>
+          <w:numId w:val="26"/>
+        </w:numPr>
+        <w:tabs>
+          <w:tab w:val="num" w:pos="2160"/>
+        </w:tabs>
+        <w:spacing w:line="360" w:lineRule="auto"/>
+        <w:rPr>
+          <w:sz w:val="24"/>
+          <w:szCs w:val="24"/>
+          <w:lang w:val="en-US"/>
+        </w:rPr>
+      </w:pPr>
+      <w:proofErr w:type="spellStart"/>
+      <w:r>
+        <w:rPr>
+          <w:b/>
+          <w:bCs/>
+          <w:sz w:val="24"/>
+          <w:szCs w:val="24"/>
+          <w:lang w:val="en-US"/>
+        </w:rPr>
+        <w:t>Fungsi</w:t>
+      </w:r>
+      <w:proofErr w:type="spellEnd"/>
+      <w:r>
+        <w:rPr>
+          <w:b/>
+          <w:bCs/>
+          <w:sz w:val="24"/>
+          <w:szCs w:val="24"/>
+          <w:lang w:val="en-US"/>
+        </w:rPr>
+        <w:t>:</w:t>
+      </w:r>
+      <w:r>
+        <w:rPr>
+          <w:sz w:val="24"/>
+          <w:szCs w:val="24"/>
+          <w:lang w:val="en-US"/>
+        </w:rPr>
+        <w:t xml:space="preserve"> </w:t>
+      </w:r>
+    </w:p>
+    <w:p>
+      <w:pPr>
+        <w:numPr>
+          <w:ilvl w:val="2"/>
+          <w:numId w:val="26"/>
+        </w:numPr>
+        <w:tabs>
+          <w:tab w:val="num" w:pos="2160"/>
+        </w:tabs>
+        <w:spacing w:line="360" w:lineRule="auto"/>
+        <w:rPr>
+          <w:sz w:val="24"/>
+          <w:szCs w:val="24"/>
+          <w:lang w:val="en-US"/>
+        </w:rPr>
+      </w:pPr>
+      <w:proofErr w:type="spellStart"/>
+      <w:r>
+        <w:rPr>
+          <w:b/>
+          <w:bCs/>
+          <w:sz w:val="24"/>
+          <w:szCs w:val="24"/>
+          <w:lang w:val="en-US"/>
+        </w:rPr>
+        <w:t>Penjelasan</w:t>
+      </w:r>
+      <w:proofErr w:type="spellEnd"/>
+      <w:r>
+        <w:rPr>
+          <w:b/>
+          <w:bCs/>
+          <w:sz w:val="24"/>
+          <w:szCs w:val="24"/>
+          <w:lang w:val="en-US"/>
+        </w:rPr>
+        <w:t xml:space="preserve"> UI:</w:t>
+      </w:r>
+    </w:p>
+    <w:p>
+      <w:pPr>
+        <w:numPr>
+          <w:ilvl w:val="1"/>
+          <w:numId w:val="26"/>
+        </w:numPr>
+        <w:tabs>
+          <w:tab w:val="num" w:pos="1440"/>
+        </w:tabs>
+        <w:spacing w:line="360" w:lineRule="auto"/>
+        <w:rPr>
+          <w:sz w:val="24"/>
+          <w:szCs w:val="24"/>
+          <w:lang w:val="en-US"/>
+        </w:rPr>
+      </w:pPr>
+      <w:r>
+        <w:rPr>
+          <w:b/>
+          <w:bCs/>
+          <w:sz w:val="24"/>
+          <w:szCs w:val="24"/>
+          <w:lang w:val="en-US"/>
+        </w:rPr>
+        <w:t>Daily Schedule Report `daily-schedule-report`</w:t>
+      </w:r>
+    </w:p>
+    <w:p>
+      <w:pPr>
+        <w:numPr>
+          <w:ilvl w:val="2"/>
+          <w:numId w:val="26"/>
+        </w:numPr>
+        <w:tabs>
+          <w:tab w:val="num" w:pos="2160"/>
+        </w:tabs>
+        <w:spacing w:line="360" w:lineRule="auto"/>
+        <w:rPr>
+          <w:sz w:val="24"/>
+          <w:szCs w:val="24"/>
+          <w:lang w:val="en-US"/>
+        </w:rPr>
+      </w:pPr>
+      <w:proofErr w:type="spellStart"/>
+      <w:r>
+        <w:rPr>
+          <w:b/>
+          <w:bCs/>
+          <w:sz w:val="24"/>
+          <w:szCs w:val="24"/>
+          <w:lang w:val="en-US"/>
+        </w:rPr>
+        <w:t>Komponen</w:t>
+      </w:r>
+      <w:proofErr w:type="spellEnd"/>
+      <w:r>
+        <w:rPr>
+          <w:b/>
+          <w:bCs/>
+          <w:sz w:val="24"/>
+          <w:szCs w:val="24"/>
+          <w:lang w:val="en-US"/>
+        </w:rPr>
+        <w:t>:</w:t>
+      </w:r>
+      <w:r>
+        <w:rPr>
+          <w:sz w:val="24"/>
+          <w:szCs w:val="24"/>
+          <w:lang w:val="en-US"/>
+        </w:rPr>
+        <w:t xml:space="preserve"> </w:t>
+      </w:r>
+    </w:p>
+    <w:p>
+      <w:pPr>
+        <w:numPr>
+          <w:ilvl w:val="2"/>
+          <w:numId w:val="26"/>
+        </w:numPr>
+        <w:tabs>
+          <w:tab w:val="num" w:pos="2160"/>
+        </w:tabs>
+        <w:spacing w:line="360" w:lineRule="auto"/>
+        <w:rPr>
+          <w:sz w:val="24"/>
+          <w:szCs w:val="24"/>
+          <w:lang w:val="en-US"/>
+        </w:rPr>
+      </w:pPr>
+      <w:proofErr w:type="spellStart"/>
+      <w:r>
+        <w:rPr>
+          <w:b/>
+          <w:bCs/>
+          <w:sz w:val="24"/>
+          <w:szCs w:val="24"/>
+          <w:lang w:val="en-US"/>
+        </w:rPr>
+        <w:t>Fungsi</w:t>
+      </w:r>
+      <w:proofErr w:type="spellEnd"/>
+      <w:r>
+        <w:rPr>
+          <w:b/>
+          <w:bCs/>
+          <w:sz w:val="24"/>
+          <w:szCs w:val="24"/>
+          <w:lang w:val="en-US"/>
+        </w:rPr>
+        <w:t>:</w:t>
+      </w:r>
+      <w:r>
+        <w:rPr>
+          <w:sz w:val="24"/>
+          <w:szCs w:val="24"/>
+          <w:lang w:val="en-US"/>
+        </w:rPr>
+        <w:t xml:space="preserve"> </w:t>
+      </w:r>
+    </w:p>
+    <w:p>
+      <w:pPr>
+        <w:numPr>
+          <w:ilvl w:val="2"/>
+          <w:numId w:val="26"/>
+        </w:numPr>
+        <w:tabs>
+          <w:tab w:val="num" w:pos="2160"/>
+        </w:tabs>
+        <w:spacing w:line="360" w:lineRule="auto"/>
+        <w:rPr>
+          <w:sz w:val="24"/>
+          <w:szCs w:val="24"/>
+          <w:lang w:val="en-US"/>
+        </w:rPr>
+      </w:pPr>
+      <w:proofErr w:type="spellStart"/>
+      <w:r>
+        <w:rPr>
+          <w:b/>
+          <w:bCs/>
+          <w:sz w:val="24"/>
+          <w:szCs w:val="24"/>
+          <w:lang w:val="en-US"/>
+        </w:rPr>
+        <w:t>Penjelasan</w:t>
+      </w:r>
+      <w:proofErr w:type="spellEnd"/>
+      <w:r>
+        <w:rPr>
+          <w:b/>
+          <w:bCs/>
+          <w:sz w:val="24"/>
+          <w:szCs w:val="24"/>
+          <w:lang w:val="en-US"/>
+        </w:rPr>
+        <w:t xml:space="preserve"> UI:</w:t>
+      </w:r>
+    </w:p>
+    <w:p>
+      <w:pPr>
+        <w:spacing w:line="360" w:lineRule="auto"/>
+        <w:ind w:left="1440"/>
+        <w:rPr>
+          <w:sz w:val="24"/>
+          <w:szCs w:val="24"/>
+          <w:lang w:val="en-US"/>
+        </w:rPr>
+      </w:pPr>
     </w:p>
     <w:p>
       <w:pPr>
@@ -7711,6 +11064,7 @@
         <w:spacing w:before="136"/>
       </w:pPr>
       <w:r>
+        <w:lastRenderedPageBreak/>
         <w:t>Kemasan</w:t>
       </w:r>
     </w:p>
@@ -8125,7 +11479,6 @@
         <w:spacing w:before="136"/>
       </w:pPr>
       <w:r>
-        <w:lastRenderedPageBreak/>
         <w:t>Production Report</w:t>
       </w:r>
     </w:p>
@@ -8982,6 +12335,7 @@
           <w:szCs w:val="24"/>
           <w:lang w:val="en-US"/>
         </w:rPr>
+        <w:lastRenderedPageBreak/>
         <w:t xml:space="preserve">Dashboard </w:t>
       </w:r>
       <w:r>
@@ -9396,7 +12750,6 @@
           <w:szCs w:val="24"/>
           <w:lang w:val="en-US"/>
         </w:rPr>
-        <w:lastRenderedPageBreak/>
         <w:t xml:space="preserve">Dashboard </w:t>
       </w:r>
       <w:r>
@@ -10283,6 +13636,7 @@
           <w:szCs w:val="24"/>
           <w:lang w:val="en-US"/>
         </w:rPr>
+        <w:lastRenderedPageBreak/>
         <w:t>Komponen</w:t>
       </w:r>
       <w:proofErr w:type="spellEnd"/>

</xml_diff>

<commit_message>
feat: add Jadwal Kemasan with calendar grid (Production Planning)
</commit_message>
<xml_diff>
--- a/blueprint/DRAFT_Blueprint_ERP_ProductionPlaning_CWA.docx
+++ b/blueprint/DRAFT_Blueprint_ERP_ProductionPlaning_CWA.docx
@@ -10793,6 +10793,32 @@
         </w:rPr>
         <w:t xml:space="preserve"> </w:t>
       </w:r>
+      <w:r>
+        <w:rPr>
+          <w:sz w:val="24"/>
+          <w:szCs w:val="24"/>
+          <w:lang w:val="en-US"/>
+        </w:rPr>
+        <w:t xml:space="preserve">Doc. ID, </w:t>
+      </w:r>
+      <w:proofErr w:type="spellStart"/>
+      <w:r>
+        <w:rPr>
+          <w:sz w:val="24"/>
+          <w:szCs w:val="24"/>
+          <w:lang w:val="en-US"/>
+        </w:rPr>
+        <w:t>Tipe</w:t>
+      </w:r>
+      <w:proofErr w:type="spellEnd"/>
+      <w:r>
+        <w:rPr>
+          <w:sz w:val="24"/>
+          <w:szCs w:val="24"/>
+          <w:lang w:val="en-US"/>
+        </w:rPr>
+        <w:t>, FK, Date, SPK, SPK From Date, SPK To Date, Notes, User ID, Line Machine ID</w:t>
+      </w:r>
     </w:p>
     <w:p>
       <w:pPr>
@@ -10840,6 +10866,204 @@
         </w:rPr>
         <w:t xml:space="preserve"> </w:t>
       </w:r>
+      <w:proofErr w:type="spellStart"/>
+      <w:r>
+        <w:rPr>
+          <w:sz w:val="24"/>
+          <w:szCs w:val="24"/>
+          <w:lang w:val="en-US"/>
+        </w:rPr>
+        <w:t>Mengatur</w:t>
+      </w:r>
+      <w:proofErr w:type="spellEnd"/>
+      <w:r>
+        <w:rPr>
+          <w:sz w:val="24"/>
+          <w:szCs w:val="24"/>
+          <w:lang w:val="en-US"/>
+        </w:rPr>
+        <w:t xml:space="preserve"> plotting </w:t>
+      </w:r>
+      <w:proofErr w:type="spellStart"/>
+      <w:r>
+        <w:rPr>
+          <w:sz w:val="24"/>
+          <w:szCs w:val="24"/>
+          <w:lang w:val="en-US"/>
+        </w:rPr>
+        <w:t>waktu</w:t>
+      </w:r>
+      <w:proofErr w:type="spellEnd"/>
+      <w:r>
+        <w:rPr>
+          <w:sz w:val="24"/>
+          <w:szCs w:val="24"/>
+          <w:lang w:val="en-US"/>
+        </w:rPr>
+        <w:t xml:space="preserve">, </w:t>
+      </w:r>
+      <w:proofErr w:type="spellStart"/>
+      <w:r>
+        <w:rPr>
+          <w:sz w:val="24"/>
+          <w:szCs w:val="24"/>
+          <w:lang w:val="en-US"/>
+        </w:rPr>
+        <w:t>durasi</w:t>
+      </w:r>
+      <w:proofErr w:type="spellEnd"/>
+      <w:r>
+        <w:rPr>
+          <w:sz w:val="24"/>
+          <w:szCs w:val="24"/>
+          <w:lang w:val="en-US"/>
+        </w:rPr>
+        <w:t xml:space="preserve"> </w:t>
+      </w:r>
+      <w:proofErr w:type="spellStart"/>
+      <w:r>
+        <w:rPr>
+          <w:sz w:val="24"/>
+          <w:szCs w:val="24"/>
+          <w:lang w:val="en-US"/>
+        </w:rPr>
+        <w:t>pengerjaan</w:t>
+      </w:r>
+      <w:proofErr w:type="spellEnd"/>
+      <w:r>
+        <w:rPr>
+          <w:sz w:val="24"/>
+          <w:szCs w:val="24"/>
+          <w:lang w:val="en-US"/>
+        </w:rPr>
+        <w:t xml:space="preserve">, dan </w:t>
+      </w:r>
+      <w:proofErr w:type="spellStart"/>
+      <w:r>
+        <w:rPr>
+          <w:sz w:val="24"/>
+          <w:szCs w:val="24"/>
+          <w:lang w:val="en-US"/>
+        </w:rPr>
+        <w:t>pengalokasian</w:t>
+      </w:r>
+      <w:proofErr w:type="spellEnd"/>
+      <w:r>
+        <w:rPr>
+          <w:sz w:val="24"/>
+          <w:szCs w:val="24"/>
+          <w:lang w:val="en-US"/>
+        </w:rPr>
+        <w:t xml:space="preserve"> </w:t>
+      </w:r>
+      <w:proofErr w:type="spellStart"/>
+      <w:r>
+        <w:rPr>
+          <w:sz w:val="24"/>
+          <w:szCs w:val="24"/>
+          <w:lang w:val="en-US"/>
+        </w:rPr>
+        <w:t>mesin</w:t>
+      </w:r>
+      <w:proofErr w:type="spellEnd"/>
+      <w:r>
+        <w:rPr>
+          <w:sz w:val="24"/>
+          <w:szCs w:val="24"/>
+          <w:lang w:val="en-US"/>
+        </w:rPr>
+        <w:t>/</w:t>
+      </w:r>
+      <w:proofErr w:type="spellStart"/>
+      <w:r>
+        <w:rPr>
+          <w:sz w:val="24"/>
+          <w:szCs w:val="24"/>
+          <w:lang w:val="en-US"/>
+        </w:rPr>
+        <w:t>lini</w:t>
+      </w:r>
+      <w:proofErr w:type="spellEnd"/>
+      <w:r>
+        <w:rPr>
+          <w:sz w:val="24"/>
+          <w:szCs w:val="24"/>
+          <w:lang w:val="en-US"/>
+        </w:rPr>
+        <w:t xml:space="preserve"> </w:t>
+      </w:r>
+      <w:proofErr w:type="spellStart"/>
+      <w:r>
+        <w:rPr>
+          <w:sz w:val="24"/>
+          <w:szCs w:val="24"/>
+          <w:lang w:val="en-US"/>
+        </w:rPr>
+        <w:t>produksi</w:t>
+      </w:r>
+      <w:proofErr w:type="spellEnd"/>
+      <w:r>
+        <w:rPr>
+          <w:sz w:val="24"/>
+          <w:szCs w:val="24"/>
+          <w:lang w:val="en-US"/>
+        </w:rPr>
+        <w:t xml:space="preserve"> </w:t>
+      </w:r>
+      <w:proofErr w:type="spellStart"/>
+      <w:r>
+        <w:rPr>
+          <w:sz w:val="24"/>
+          <w:szCs w:val="24"/>
+          <w:lang w:val="en-US"/>
+        </w:rPr>
+        <w:t>berdasarkan</w:t>
+      </w:r>
+      <w:proofErr w:type="spellEnd"/>
+      <w:r>
+        <w:rPr>
+          <w:sz w:val="24"/>
+          <w:szCs w:val="24"/>
+          <w:lang w:val="en-US"/>
+        </w:rPr>
+        <w:t xml:space="preserve"> </w:t>
+      </w:r>
+      <w:proofErr w:type="spellStart"/>
+      <w:r>
+        <w:rPr>
+          <w:sz w:val="24"/>
+          <w:szCs w:val="24"/>
+          <w:lang w:val="en-US"/>
+        </w:rPr>
+        <w:t>dokumen</w:t>
+      </w:r>
+      <w:proofErr w:type="spellEnd"/>
+      <w:r>
+        <w:rPr>
+          <w:sz w:val="24"/>
+          <w:szCs w:val="24"/>
+          <w:lang w:val="en-US"/>
+        </w:rPr>
+        <w:t xml:space="preserve"> SPK yang </w:t>
+      </w:r>
+      <w:proofErr w:type="spellStart"/>
+      <w:r>
+        <w:rPr>
+          <w:sz w:val="24"/>
+          <w:szCs w:val="24"/>
+          <w:lang w:val="en-US"/>
+        </w:rPr>
+        <w:t>terbit</w:t>
+      </w:r>
+      <w:proofErr w:type="spellEnd"/>
+      <w:r>
+        <w:rPr>
+          <w:sz w:val="24"/>
+          <w:szCs w:val="24"/>
+          <w:lang w:val="en-US"/>
+        </w:rPr>
+        <w:t>.</w:t>
+      </w:r>
     </w:p>
     <w:p>
       <w:pPr>
@@ -10879,6 +11103,616 @@
         </w:rPr>
         <w:t xml:space="preserve"> UI:</w:t>
       </w:r>
+      <w:r>
+        <w:t xml:space="preserve"> </w:t>
+      </w:r>
+      <w:proofErr w:type="spellStart"/>
+      <w:r>
+        <w:rPr>
+          <w:sz w:val="24"/>
+          <w:szCs w:val="24"/>
+          <w:lang w:val="en-US"/>
+        </w:rPr>
+        <w:t>Tampilan</w:t>
+      </w:r>
+      <w:proofErr w:type="spellEnd"/>
+      <w:r>
+        <w:rPr>
+          <w:sz w:val="24"/>
+          <w:szCs w:val="24"/>
+          <w:lang w:val="en-US"/>
+        </w:rPr>
+        <w:t xml:space="preserve"> </w:t>
+      </w:r>
+      <w:proofErr w:type="spellStart"/>
+      <w:r>
+        <w:rPr>
+          <w:sz w:val="24"/>
+          <w:szCs w:val="24"/>
+          <w:lang w:val="en-US"/>
+        </w:rPr>
+        <w:t>awal</w:t>
+      </w:r>
+      <w:proofErr w:type="spellEnd"/>
+      <w:r>
+        <w:rPr>
+          <w:sz w:val="24"/>
+          <w:szCs w:val="24"/>
+          <w:lang w:val="en-US"/>
+        </w:rPr>
+        <w:t xml:space="preserve"> </w:t>
+      </w:r>
+      <w:proofErr w:type="spellStart"/>
+      <w:r>
+        <w:rPr>
+          <w:sz w:val="24"/>
+          <w:szCs w:val="24"/>
+          <w:lang w:val="en-US"/>
+        </w:rPr>
+        <w:t>berupa</w:t>
+      </w:r>
+      <w:proofErr w:type="spellEnd"/>
+      <w:r>
+        <w:rPr>
+          <w:sz w:val="24"/>
+          <w:szCs w:val="24"/>
+          <w:lang w:val="en-US"/>
+        </w:rPr>
+        <w:t xml:space="preserve"> </w:t>
+      </w:r>
+      <w:proofErr w:type="spellStart"/>
+      <w:r>
+        <w:rPr>
+          <w:sz w:val="24"/>
+          <w:szCs w:val="24"/>
+          <w:lang w:val="en-US"/>
+        </w:rPr>
+        <w:t>visualisasi</w:t>
+      </w:r>
+      <w:proofErr w:type="spellEnd"/>
+      <w:r>
+        <w:rPr>
+          <w:sz w:val="24"/>
+          <w:szCs w:val="24"/>
+          <w:lang w:val="en-US"/>
+        </w:rPr>
+        <w:t xml:space="preserve"> Gantt Chart </w:t>
+      </w:r>
+      <w:proofErr w:type="spellStart"/>
+      <w:r>
+        <w:rPr>
+          <w:sz w:val="24"/>
+          <w:szCs w:val="24"/>
+          <w:lang w:val="en-US"/>
+        </w:rPr>
+        <w:t>interaktif</w:t>
+      </w:r>
+      <w:proofErr w:type="spellEnd"/>
+      <w:r>
+        <w:rPr>
+          <w:sz w:val="24"/>
+          <w:szCs w:val="24"/>
+          <w:lang w:val="en-US"/>
+        </w:rPr>
+        <w:t xml:space="preserve"> dan </w:t>
+      </w:r>
+      <w:proofErr w:type="spellStart"/>
+      <w:r>
+        <w:rPr>
+          <w:sz w:val="24"/>
+          <w:szCs w:val="24"/>
+          <w:lang w:val="en-US"/>
+        </w:rPr>
+        <w:t>tabel</w:t>
+      </w:r>
+      <w:proofErr w:type="spellEnd"/>
+      <w:r>
+        <w:rPr>
+          <w:sz w:val="24"/>
+          <w:szCs w:val="24"/>
+          <w:lang w:val="en-US"/>
+        </w:rPr>
+        <w:t xml:space="preserve"> grid </w:t>
+      </w:r>
+      <w:proofErr w:type="spellStart"/>
+      <w:r>
+        <w:rPr>
+          <w:sz w:val="24"/>
+          <w:szCs w:val="24"/>
+          <w:lang w:val="en-US"/>
+        </w:rPr>
+        <w:t>jadwal</w:t>
+      </w:r>
+      <w:proofErr w:type="spellEnd"/>
+      <w:r>
+        <w:rPr>
+          <w:sz w:val="24"/>
+          <w:szCs w:val="24"/>
+          <w:lang w:val="en-US"/>
+        </w:rPr>
+        <w:t xml:space="preserve"> </w:t>
+      </w:r>
+      <w:proofErr w:type="spellStart"/>
+      <w:r>
+        <w:rPr>
+          <w:sz w:val="24"/>
+          <w:szCs w:val="24"/>
+          <w:lang w:val="en-US"/>
+        </w:rPr>
+        <w:t>produksi</w:t>
+      </w:r>
+      <w:proofErr w:type="spellEnd"/>
+      <w:r>
+        <w:rPr>
+          <w:sz w:val="24"/>
+          <w:szCs w:val="24"/>
+          <w:lang w:val="en-US"/>
+        </w:rPr>
+        <w:t xml:space="preserve">. </w:t>
+      </w:r>
+      <w:proofErr w:type="spellStart"/>
+      <w:r>
+        <w:rPr>
+          <w:sz w:val="24"/>
+          <w:szCs w:val="24"/>
+          <w:lang w:val="en-US"/>
+        </w:rPr>
+        <w:t>Dilengkapi</w:t>
+      </w:r>
+      <w:proofErr w:type="spellEnd"/>
+      <w:r>
+        <w:rPr>
+          <w:sz w:val="24"/>
+          <w:szCs w:val="24"/>
+          <w:lang w:val="en-US"/>
+        </w:rPr>
+        <w:t xml:space="preserve"> filter </w:t>
+      </w:r>
+      <w:proofErr w:type="spellStart"/>
+      <w:r>
+        <w:rPr>
+          <w:sz w:val="24"/>
+          <w:szCs w:val="24"/>
+          <w:lang w:val="en-US"/>
+        </w:rPr>
+        <w:t>rentang</w:t>
+      </w:r>
+      <w:proofErr w:type="spellEnd"/>
+      <w:r>
+        <w:rPr>
+          <w:sz w:val="24"/>
+          <w:szCs w:val="24"/>
+          <w:lang w:val="en-US"/>
+        </w:rPr>
+        <w:t xml:space="preserve"> </w:t>
+      </w:r>
+      <w:proofErr w:type="spellStart"/>
+      <w:r>
+        <w:rPr>
+          <w:sz w:val="24"/>
+          <w:szCs w:val="24"/>
+          <w:lang w:val="en-US"/>
+        </w:rPr>
+        <w:t>tanggal</w:t>
+      </w:r>
+      <w:proofErr w:type="spellEnd"/>
+      <w:r>
+        <w:rPr>
+          <w:sz w:val="24"/>
+          <w:szCs w:val="24"/>
+          <w:lang w:val="en-US"/>
+        </w:rPr>
+        <w:t xml:space="preserve"> SPK (From-To Date), </w:t>
+      </w:r>
+      <w:proofErr w:type="spellStart"/>
+      <w:r>
+        <w:rPr>
+          <w:sz w:val="24"/>
+          <w:szCs w:val="24"/>
+          <w:lang w:val="en-US"/>
+        </w:rPr>
+        <w:t>tipe</w:t>
+      </w:r>
+      <w:proofErr w:type="spellEnd"/>
+      <w:r>
+        <w:rPr>
+          <w:sz w:val="24"/>
+          <w:szCs w:val="24"/>
+          <w:lang w:val="en-US"/>
+        </w:rPr>
+        <w:t xml:space="preserve"> </w:t>
+      </w:r>
+      <w:proofErr w:type="spellStart"/>
+      <w:r>
+        <w:rPr>
+          <w:sz w:val="24"/>
+          <w:szCs w:val="24"/>
+          <w:lang w:val="en-US"/>
+        </w:rPr>
+        <w:t>adonan</w:t>
+      </w:r>
+      <w:proofErr w:type="spellEnd"/>
+      <w:r>
+        <w:rPr>
+          <w:sz w:val="24"/>
+          <w:szCs w:val="24"/>
+          <w:lang w:val="en-US"/>
+        </w:rPr>
+        <w:t xml:space="preserve">, dan </w:t>
+      </w:r>
+      <w:proofErr w:type="spellStart"/>
+      <w:r>
+        <w:rPr>
+          <w:sz w:val="24"/>
+          <w:szCs w:val="24"/>
+          <w:lang w:val="en-US"/>
+        </w:rPr>
+        <w:t>pilihan</w:t>
+      </w:r>
+      <w:proofErr w:type="spellEnd"/>
+      <w:r>
+        <w:rPr>
+          <w:sz w:val="24"/>
+          <w:szCs w:val="24"/>
+          <w:lang w:val="en-US"/>
+        </w:rPr>
+        <w:t xml:space="preserve"> </w:t>
+      </w:r>
+      <w:proofErr w:type="spellStart"/>
+      <w:r>
+        <w:rPr>
+          <w:sz w:val="24"/>
+          <w:szCs w:val="24"/>
+          <w:lang w:val="en-US"/>
+        </w:rPr>
+        <w:t>mesin</w:t>
+      </w:r>
+      <w:proofErr w:type="spellEnd"/>
+      <w:r>
+        <w:rPr>
+          <w:sz w:val="24"/>
+          <w:szCs w:val="24"/>
+          <w:lang w:val="en-US"/>
+        </w:rPr>
+        <w:t xml:space="preserve">. </w:t>
+      </w:r>
+      <w:proofErr w:type="spellStart"/>
+      <w:r>
+        <w:rPr>
+          <w:sz w:val="24"/>
+          <w:szCs w:val="24"/>
+          <w:lang w:val="en-US"/>
+        </w:rPr>
+        <w:t>Pengguna</w:t>
+      </w:r>
+      <w:proofErr w:type="spellEnd"/>
+      <w:r>
+        <w:rPr>
+          <w:sz w:val="24"/>
+          <w:szCs w:val="24"/>
+          <w:lang w:val="en-US"/>
+        </w:rPr>
+        <w:t xml:space="preserve"> </w:t>
+      </w:r>
+      <w:proofErr w:type="spellStart"/>
+      <w:r>
+        <w:rPr>
+          <w:sz w:val="24"/>
+          <w:szCs w:val="24"/>
+          <w:lang w:val="en-US"/>
+        </w:rPr>
+        <w:t>dapat</w:t>
+      </w:r>
+      <w:proofErr w:type="spellEnd"/>
+      <w:r>
+        <w:rPr>
+          <w:sz w:val="24"/>
+          <w:szCs w:val="24"/>
+          <w:lang w:val="en-US"/>
+        </w:rPr>
+        <w:t xml:space="preserve"> </w:t>
+      </w:r>
+      <w:proofErr w:type="spellStart"/>
+      <w:r>
+        <w:rPr>
+          <w:sz w:val="24"/>
+          <w:szCs w:val="24"/>
+          <w:lang w:val="en-US"/>
+        </w:rPr>
+        <w:t>menggeser</w:t>
+      </w:r>
+      <w:proofErr w:type="spellEnd"/>
+      <w:r>
+        <w:rPr>
+          <w:sz w:val="24"/>
+          <w:szCs w:val="24"/>
+          <w:lang w:val="en-US"/>
+        </w:rPr>
+        <w:t>/</w:t>
+      </w:r>
+      <w:proofErr w:type="spellStart"/>
+      <w:r>
+        <w:rPr>
+          <w:sz w:val="24"/>
+          <w:szCs w:val="24"/>
+          <w:lang w:val="en-US"/>
+        </w:rPr>
+        <w:t>mengatur</w:t>
+      </w:r>
+      <w:proofErr w:type="spellEnd"/>
+      <w:r>
+        <w:rPr>
+          <w:sz w:val="24"/>
+          <w:szCs w:val="24"/>
+          <w:lang w:val="en-US"/>
+        </w:rPr>
+        <w:t xml:space="preserve"> </w:t>
+      </w:r>
+      <w:proofErr w:type="spellStart"/>
+      <w:r>
+        <w:rPr>
+          <w:sz w:val="24"/>
+          <w:szCs w:val="24"/>
+          <w:lang w:val="en-US"/>
+        </w:rPr>
+        <w:t>alokasi</w:t>
+      </w:r>
+      <w:proofErr w:type="spellEnd"/>
+      <w:r>
+        <w:rPr>
+          <w:sz w:val="24"/>
+          <w:szCs w:val="24"/>
+          <w:lang w:val="en-US"/>
+        </w:rPr>
+        <w:t xml:space="preserve"> </w:t>
+      </w:r>
+      <w:proofErr w:type="spellStart"/>
+      <w:r>
+        <w:rPr>
+          <w:sz w:val="24"/>
+          <w:szCs w:val="24"/>
+          <w:lang w:val="en-US"/>
+        </w:rPr>
+        <w:t>waktu</w:t>
+      </w:r>
+      <w:proofErr w:type="spellEnd"/>
+      <w:r>
+        <w:rPr>
+          <w:sz w:val="24"/>
+          <w:szCs w:val="24"/>
+          <w:lang w:val="en-US"/>
+        </w:rPr>
+        <w:t xml:space="preserve"> </w:t>
+      </w:r>
+      <w:proofErr w:type="spellStart"/>
+      <w:r>
+        <w:rPr>
+          <w:sz w:val="24"/>
+          <w:szCs w:val="24"/>
+          <w:lang w:val="en-US"/>
+        </w:rPr>
+        <w:t>jadwal</w:t>
+      </w:r>
+      <w:proofErr w:type="spellEnd"/>
+      <w:r>
+        <w:rPr>
+          <w:sz w:val="24"/>
+          <w:szCs w:val="24"/>
+          <w:lang w:val="en-US"/>
+        </w:rPr>
+        <w:t xml:space="preserve"> </w:t>
+      </w:r>
+      <w:proofErr w:type="spellStart"/>
+      <w:r>
+        <w:rPr>
+          <w:sz w:val="24"/>
+          <w:szCs w:val="24"/>
+          <w:lang w:val="en-US"/>
+        </w:rPr>
+        <w:t>produksi</w:t>
+      </w:r>
+      <w:proofErr w:type="spellEnd"/>
+      <w:r>
+        <w:rPr>
+          <w:sz w:val="24"/>
+          <w:szCs w:val="24"/>
+          <w:lang w:val="en-US"/>
+        </w:rPr>
+        <w:t xml:space="preserve"> </w:t>
+      </w:r>
+      <w:proofErr w:type="spellStart"/>
+      <w:r>
+        <w:rPr>
+          <w:sz w:val="24"/>
+          <w:szCs w:val="24"/>
+          <w:lang w:val="en-US"/>
+        </w:rPr>
+        <w:t>secara</w:t>
+      </w:r>
+      <w:proofErr w:type="spellEnd"/>
+      <w:r>
+        <w:rPr>
+          <w:sz w:val="24"/>
+          <w:szCs w:val="24"/>
+          <w:lang w:val="en-US"/>
+        </w:rPr>
+        <w:t xml:space="preserve"> drag-and-drop </w:t>
+      </w:r>
+      <w:proofErr w:type="spellStart"/>
+      <w:r>
+        <w:rPr>
+          <w:sz w:val="24"/>
+          <w:szCs w:val="24"/>
+          <w:lang w:val="en-US"/>
+        </w:rPr>
+        <w:t>atau</w:t>
+      </w:r>
+      <w:proofErr w:type="spellEnd"/>
+      <w:r>
+        <w:rPr>
+          <w:sz w:val="24"/>
+          <w:szCs w:val="24"/>
+          <w:lang w:val="en-US"/>
+        </w:rPr>
+        <w:t xml:space="preserve"> </w:t>
+      </w:r>
+      <w:proofErr w:type="spellStart"/>
+      <w:r>
+        <w:rPr>
+          <w:sz w:val="24"/>
+          <w:szCs w:val="24"/>
+          <w:lang w:val="en-US"/>
+        </w:rPr>
+        <w:t>memunculkan</w:t>
+      </w:r>
+      <w:proofErr w:type="spellEnd"/>
+      <w:r>
+        <w:rPr>
+          <w:sz w:val="24"/>
+          <w:szCs w:val="24"/>
+          <w:lang w:val="en-US"/>
+        </w:rPr>
+        <w:t xml:space="preserve"> modal form input plotting </w:t>
+      </w:r>
+      <w:proofErr w:type="spellStart"/>
+      <w:r>
+        <w:rPr>
+          <w:sz w:val="24"/>
+          <w:szCs w:val="24"/>
+          <w:lang w:val="en-US"/>
+        </w:rPr>
+        <w:t>jadwal</w:t>
+      </w:r>
+      <w:proofErr w:type="spellEnd"/>
+      <w:r>
+        <w:rPr>
+          <w:sz w:val="24"/>
+          <w:szCs w:val="24"/>
+          <w:lang w:val="en-US"/>
+        </w:rPr>
+        <w:t xml:space="preserve"> </w:t>
+      </w:r>
+      <w:proofErr w:type="spellStart"/>
+      <w:r>
+        <w:rPr>
+          <w:sz w:val="24"/>
+          <w:szCs w:val="24"/>
+          <w:lang w:val="en-US"/>
+        </w:rPr>
+        <w:t>baru</w:t>
+      </w:r>
+      <w:proofErr w:type="spellEnd"/>
+      <w:r>
+        <w:rPr>
+          <w:sz w:val="24"/>
+          <w:szCs w:val="24"/>
+          <w:lang w:val="en-US"/>
+        </w:rPr>
+        <w:t>.</w:t>
+      </w:r>
+    </w:p>
+    <w:p>
+      <w:pPr>
+        <w:spacing w:line="360" w:lineRule="auto"/>
+        <w:ind w:left="1728"/>
+        <w:rPr>
+          <w:sz w:val="24"/>
+          <w:szCs w:val="24"/>
+          <w:lang w:val="en-US"/>
+        </w:rPr>
+      </w:pPr>
+      <w:r>
+        <w:rPr>
+          <w:noProof/>
+        </w:rPr>
+        <w:lastRenderedPageBreak/>
+        <w:drawing>
+          <wp:inline distT="0" distB="0" distL="0" distR="0" wp14:anchorId="4E453C11" wp14:editId="222E9190">
+            <wp:extent cx="5049520" cy="2280676"/>
+            <wp:effectExtent l="0" t="0" r="0" b="5715"/>
+            <wp:docPr id="431466443" name="Picture 1"/>
+            <wp:cNvGraphicFramePr>
+              <a:graphicFrameLocks xmlns:a="http://schemas.openxmlformats.org/drawingml/2006/main" noChangeAspect="1"/>
+            </wp:cNvGraphicFramePr>
+            <a:graphic xmlns:a="http://schemas.openxmlformats.org/drawingml/2006/main">
+              <a:graphicData uri="http://schemas.openxmlformats.org/drawingml/2006/picture">
+                <pic:pic xmlns:pic="http://schemas.openxmlformats.org/drawingml/2006/picture">
+                  <pic:nvPicPr>
+                    <pic:cNvPr id="431466443" name=""/>
+                    <pic:cNvPicPr/>
+                  </pic:nvPicPr>
+                  <pic:blipFill>
+                    <a:blip r:embed="rId15"/>
+                    <a:stretch>
+                      <a:fillRect/>
+                    </a:stretch>
+                  </pic:blipFill>
+                  <pic:spPr>
+                    <a:xfrm>
+                      <a:off x="0" y="0"/>
+                      <a:ext cx="5057804" cy="2284418"/>
+                    </a:xfrm>
+                    <a:prstGeom prst="rect">
+                      <a:avLst/>
+                    </a:prstGeom>
+                  </pic:spPr>
+                </pic:pic>
+              </a:graphicData>
+            </a:graphic>
+          </wp:inline>
+        </w:drawing>
+      </w:r>
+    </w:p>
+    <w:p>
+      <w:pPr>
+        <w:spacing w:line="360" w:lineRule="auto"/>
+        <w:ind w:left="1728"/>
+        <w:rPr>
+          <w:sz w:val="24"/>
+          <w:szCs w:val="24"/>
+          <w:lang w:val="en-US"/>
+        </w:rPr>
+      </w:pPr>
+      <w:r>
+        <w:rPr>
+          <w:noProof/>
+        </w:rPr>
+        <w:drawing>
+          <wp:inline distT="0" distB="0" distL="0" distR="0" wp14:anchorId="795E1F58" wp14:editId="2906C5E5">
+            <wp:extent cx="4325620" cy="2464660"/>
+            <wp:effectExtent l="0" t="0" r="0" b="0"/>
+            <wp:docPr id="1461086661" name="Picture 1"/>
+            <wp:cNvGraphicFramePr>
+              <a:graphicFrameLocks xmlns:a="http://schemas.openxmlformats.org/drawingml/2006/main" noChangeAspect="1"/>
+            </wp:cNvGraphicFramePr>
+            <a:graphic xmlns:a="http://schemas.openxmlformats.org/drawingml/2006/main">
+              <a:graphicData uri="http://schemas.openxmlformats.org/drawingml/2006/picture">
+                <pic:pic xmlns:pic="http://schemas.openxmlformats.org/drawingml/2006/picture">
+                  <pic:nvPicPr>
+                    <pic:cNvPr id="1461086661" name=""/>
+                    <pic:cNvPicPr/>
+                  </pic:nvPicPr>
+                  <pic:blipFill>
+                    <a:blip r:embed="rId16"/>
+                    <a:stretch>
+                      <a:fillRect/>
+                    </a:stretch>
+                  </pic:blipFill>
+                  <pic:spPr>
+                    <a:xfrm>
+                      <a:off x="0" y="0"/>
+                      <a:ext cx="4328198" cy="2466129"/>
+                    </a:xfrm>
+                    <a:prstGeom prst="rect">
+                      <a:avLst/>
+                    </a:prstGeom>
+                  </pic:spPr>
+                </pic:pic>
+              </a:graphicData>
+            </a:graphic>
+          </wp:inline>
+        </w:drawing>
+      </w:r>
     </w:p>
     <w:p>
       <w:pPr>
@@ -10953,6 +11787,78 @@
         </w:rPr>
         <w:t xml:space="preserve"> </w:t>
       </w:r>
+      <w:proofErr w:type="spellStart"/>
+      <w:r>
+        <w:rPr>
+          <w:sz w:val="24"/>
+          <w:szCs w:val="24"/>
+          <w:lang w:val="en-US"/>
+        </w:rPr>
+        <w:t>Tanggal</w:t>
+      </w:r>
+      <w:proofErr w:type="spellEnd"/>
+      <w:r>
+        <w:rPr>
+          <w:sz w:val="24"/>
+          <w:szCs w:val="24"/>
+          <w:lang w:val="en-US"/>
+        </w:rPr>
+        <w:t xml:space="preserve">, Product Id, Name, Base, </w:t>
+      </w:r>
+      <w:proofErr w:type="spellStart"/>
+      <w:r>
+        <w:rPr>
+          <w:sz w:val="24"/>
+          <w:szCs w:val="24"/>
+          <w:lang w:val="en-US"/>
+        </w:rPr>
+        <w:t>Formulasi</w:t>
+      </w:r>
+      <w:proofErr w:type="spellEnd"/>
+      <w:r>
+        <w:rPr>
+          <w:sz w:val="24"/>
+          <w:szCs w:val="24"/>
+          <w:lang w:val="en-US"/>
+        </w:rPr>
+        <w:t xml:space="preserve">, Batch NR, Basis, Basis (Kg), Total Basis (Kg), Hasil CM, Kode </w:t>
+      </w:r>
+      <w:proofErr w:type="spellStart"/>
+      <w:r>
+        <w:rPr>
+          <w:sz w:val="24"/>
+          <w:szCs w:val="24"/>
+          <w:lang w:val="en-US"/>
+        </w:rPr>
+        <w:t>Mesin</w:t>
+      </w:r>
+      <w:proofErr w:type="spellEnd"/>
+      <w:r>
+        <w:rPr>
+          <w:sz w:val="24"/>
+          <w:szCs w:val="24"/>
+          <w:lang w:val="en-US"/>
+        </w:rPr>
+        <w:t xml:space="preserve">, Status, </w:t>
+      </w:r>
+      <w:proofErr w:type="spellStart"/>
+      <w:r>
+        <w:rPr>
+          <w:sz w:val="24"/>
+          <w:szCs w:val="24"/>
+          <w:lang w:val="en-US"/>
+        </w:rPr>
+        <w:t>Realisasi</w:t>
+      </w:r>
+      <w:proofErr w:type="spellEnd"/>
+      <w:r>
+        <w:rPr>
+          <w:sz w:val="24"/>
+          <w:szCs w:val="24"/>
+          <w:lang w:val="en-US"/>
+        </w:rPr>
+        <w:t>, Lead Time, Dateline, No / On Time</w:t>
+      </w:r>
     </w:p>
     <w:p>
       <w:pPr>
@@ -11000,6 +11906,258 @@
         </w:rPr>
         <w:t xml:space="preserve"> </w:t>
       </w:r>
+      <w:proofErr w:type="spellStart"/>
+      <w:r>
+        <w:rPr>
+          <w:sz w:val="24"/>
+          <w:szCs w:val="24"/>
+          <w:lang w:val="en-US"/>
+        </w:rPr>
+        <w:t>Menyajikan</w:t>
+      </w:r>
+      <w:proofErr w:type="spellEnd"/>
+      <w:r>
+        <w:rPr>
+          <w:sz w:val="24"/>
+          <w:szCs w:val="24"/>
+          <w:lang w:val="en-US"/>
+        </w:rPr>
+        <w:t xml:space="preserve"> </w:t>
+      </w:r>
+      <w:proofErr w:type="spellStart"/>
+      <w:r>
+        <w:rPr>
+          <w:sz w:val="24"/>
+          <w:szCs w:val="24"/>
+          <w:lang w:val="en-US"/>
+        </w:rPr>
+        <w:t>laporan</w:t>
+      </w:r>
+      <w:proofErr w:type="spellEnd"/>
+      <w:r>
+        <w:rPr>
+          <w:sz w:val="24"/>
+          <w:szCs w:val="24"/>
+          <w:lang w:val="en-US"/>
+        </w:rPr>
+        <w:t xml:space="preserve"> </w:t>
+      </w:r>
+      <w:proofErr w:type="spellStart"/>
+      <w:r>
+        <w:rPr>
+          <w:sz w:val="24"/>
+          <w:szCs w:val="24"/>
+          <w:lang w:val="en-US"/>
+        </w:rPr>
+        <w:t>harian</w:t>
+      </w:r>
+      <w:proofErr w:type="spellEnd"/>
+      <w:r>
+        <w:rPr>
+          <w:sz w:val="24"/>
+          <w:szCs w:val="24"/>
+          <w:lang w:val="en-US"/>
+        </w:rPr>
+        <w:t xml:space="preserve"> </w:t>
+      </w:r>
+      <w:proofErr w:type="spellStart"/>
+      <w:r>
+        <w:rPr>
+          <w:sz w:val="24"/>
+          <w:szCs w:val="24"/>
+          <w:lang w:val="en-US"/>
+        </w:rPr>
+        <w:t>rekapitulasi</w:t>
+      </w:r>
+      <w:proofErr w:type="spellEnd"/>
+      <w:r>
+        <w:rPr>
+          <w:sz w:val="24"/>
+          <w:szCs w:val="24"/>
+          <w:lang w:val="en-US"/>
+        </w:rPr>
+        <w:t xml:space="preserve"> </w:t>
+      </w:r>
+      <w:proofErr w:type="spellStart"/>
+      <w:r>
+        <w:rPr>
+          <w:sz w:val="24"/>
+          <w:szCs w:val="24"/>
+          <w:lang w:val="en-US"/>
+        </w:rPr>
+        <w:t>jadwal</w:t>
+      </w:r>
+      <w:proofErr w:type="spellEnd"/>
+      <w:r>
+        <w:rPr>
+          <w:sz w:val="24"/>
+          <w:szCs w:val="24"/>
+          <w:lang w:val="en-US"/>
+        </w:rPr>
+        <w:t xml:space="preserve"> </w:t>
+      </w:r>
+      <w:proofErr w:type="spellStart"/>
+      <w:r>
+        <w:rPr>
+          <w:sz w:val="24"/>
+          <w:szCs w:val="24"/>
+          <w:lang w:val="en-US"/>
+        </w:rPr>
+        <w:t>produksi</w:t>
+      </w:r>
+      <w:proofErr w:type="spellEnd"/>
+      <w:r>
+        <w:rPr>
+          <w:sz w:val="24"/>
+          <w:szCs w:val="24"/>
+          <w:lang w:val="en-US"/>
+        </w:rPr>
+        <w:t xml:space="preserve">, </w:t>
+      </w:r>
+      <w:proofErr w:type="spellStart"/>
+      <w:r>
+        <w:rPr>
+          <w:sz w:val="24"/>
+          <w:szCs w:val="24"/>
+          <w:lang w:val="en-US"/>
+        </w:rPr>
+        <w:t>evaluasi</w:t>
+      </w:r>
+      <w:proofErr w:type="spellEnd"/>
+      <w:r>
+        <w:rPr>
+          <w:sz w:val="24"/>
+          <w:szCs w:val="24"/>
+          <w:lang w:val="en-US"/>
+        </w:rPr>
+        <w:t xml:space="preserve"> </w:t>
+      </w:r>
+      <w:proofErr w:type="spellStart"/>
+      <w:r>
+        <w:rPr>
+          <w:sz w:val="24"/>
+          <w:szCs w:val="24"/>
+          <w:lang w:val="en-US"/>
+        </w:rPr>
+        <w:t>capaian</w:t>
+      </w:r>
+      <w:proofErr w:type="spellEnd"/>
+      <w:r>
+        <w:rPr>
+          <w:sz w:val="24"/>
+          <w:szCs w:val="24"/>
+          <w:lang w:val="en-US"/>
+        </w:rPr>
+        <w:t xml:space="preserve"> target, </w:t>
+      </w:r>
+      <w:proofErr w:type="spellStart"/>
+      <w:r>
+        <w:rPr>
+          <w:sz w:val="24"/>
+          <w:szCs w:val="24"/>
+          <w:lang w:val="en-US"/>
+        </w:rPr>
+        <w:t>waktu</w:t>
+      </w:r>
+      <w:proofErr w:type="spellEnd"/>
+      <w:r>
+        <w:rPr>
+          <w:sz w:val="24"/>
+          <w:szCs w:val="24"/>
+          <w:lang w:val="en-US"/>
+        </w:rPr>
+        <w:t xml:space="preserve"> </w:t>
+      </w:r>
+      <w:proofErr w:type="spellStart"/>
+      <w:r>
+        <w:rPr>
+          <w:sz w:val="24"/>
+          <w:szCs w:val="24"/>
+          <w:lang w:val="en-US"/>
+        </w:rPr>
+        <w:t>pengerjaan</w:t>
+      </w:r>
+      <w:proofErr w:type="spellEnd"/>
+      <w:r>
+        <w:rPr>
+          <w:sz w:val="24"/>
+          <w:szCs w:val="24"/>
+          <w:lang w:val="en-US"/>
+        </w:rPr>
+        <w:t xml:space="preserve"> (lead time vs dateline), </w:t>
+      </w:r>
+      <w:proofErr w:type="spellStart"/>
+      <w:r>
+        <w:rPr>
+          <w:sz w:val="24"/>
+          <w:szCs w:val="24"/>
+          <w:lang w:val="en-US"/>
+        </w:rPr>
+        <w:t>serta</w:t>
+      </w:r>
+      <w:proofErr w:type="spellEnd"/>
+      <w:r>
+        <w:rPr>
+          <w:sz w:val="24"/>
+          <w:szCs w:val="24"/>
+          <w:lang w:val="en-US"/>
+        </w:rPr>
+        <w:t xml:space="preserve"> </w:t>
+      </w:r>
+      <w:proofErr w:type="spellStart"/>
+      <w:r>
+        <w:rPr>
+          <w:sz w:val="24"/>
+          <w:szCs w:val="24"/>
+          <w:lang w:val="en-US"/>
+        </w:rPr>
+        <w:t>indikator</w:t>
+      </w:r>
+      <w:proofErr w:type="spellEnd"/>
+      <w:r>
+        <w:rPr>
+          <w:sz w:val="24"/>
+          <w:szCs w:val="24"/>
+          <w:lang w:val="en-US"/>
+        </w:rPr>
+        <w:t xml:space="preserve"> </w:t>
+      </w:r>
+      <w:proofErr w:type="spellStart"/>
+      <w:r>
+        <w:rPr>
+          <w:sz w:val="24"/>
+          <w:szCs w:val="24"/>
+          <w:lang w:val="en-US"/>
+        </w:rPr>
+        <w:t>ketepatan</w:t>
+      </w:r>
+      <w:proofErr w:type="spellEnd"/>
+      <w:r>
+        <w:rPr>
+          <w:sz w:val="24"/>
+          <w:szCs w:val="24"/>
+          <w:lang w:val="en-US"/>
+        </w:rPr>
+        <w:t xml:space="preserve"> </w:t>
+      </w:r>
+      <w:proofErr w:type="spellStart"/>
+      <w:r>
+        <w:rPr>
+          <w:sz w:val="24"/>
+          <w:szCs w:val="24"/>
+          <w:lang w:val="en-US"/>
+        </w:rPr>
+        <w:t>waktu</w:t>
+      </w:r>
+      <w:proofErr w:type="spellEnd"/>
+      <w:r>
+        <w:rPr>
+          <w:sz w:val="24"/>
+          <w:szCs w:val="24"/>
+          <w:lang w:val="en-US"/>
+        </w:rPr>
+        <w:t xml:space="preserve"> (On Time / Late).</w:t>
+      </w:r>
     </w:p>
     <w:p>
       <w:pPr>
@@ -11039,6 +12197,387 @@
         </w:rPr>
         <w:t xml:space="preserve"> UI:</w:t>
       </w:r>
+      <w:r>
+        <w:t xml:space="preserve"> </w:t>
+      </w:r>
+      <w:proofErr w:type="spellStart"/>
+      <w:r>
+        <w:rPr>
+          <w:sz w:val="24"/>
+          <w:szCs w:val="24"/>
+          <w:lang w:val="en-US"/>
+        </w:rPr>
+        <w:t>Tampilan</w:t>
+      </w:r>
+      <w:proofErr w:type="spellEnd"/>
+      <w:r>
+        <w:rPr>
+          <w:sz w:val="24"/>
+          <w:szCs w:val="24"/>
+          <w:lang w:val="en-US"/>
+        </w:rPr>
+        <w:t xml:space="preserve"> </w:t>
+      </w:r>
+      <w:proofErr w:type="spellStart"/>
+      <w:r>
+        <w:rPr>
+          <w:sz w:val="24"/>
+          <w:szCs w:val="24"/>
+          <w:lang w:val="en-US"/>
+        </w:rPr>
+        <w:t>awal</w:t>
+      </w:r>
+      <w:proofErr w:type="spellEnd"/>
+      <w:r>
+        <w:rPr>
+          <w:sz w:val="24"/>
+          <w:szCs w:val="24"/>
+          <w:lang w:val="en-US"/>
+        </w:rPr>
+        <w:t xml:space="preserve"> </w:t>
+      </w:r>
+      <w:proofErr w:type="spellStart"/>
+      <w:r>
+        <w:rPr>
+          <w:sz w:val="24"/>
+          <w:szCs w:val="24"/>
+          <w:lang w:val="en-US"/>
+        </w:rPr>
+        <w:t>berupa</w:t>
+      </w:r>
+      <w:proofErr w:type="spellEnd"/>
+      <w:r>
+        <w:rPr>
+          <w:sz w:val="24"/>
+          <w:szCs w:val="24"/>
+          <w:lang w:val="en-US"/>
+        </w:rPr>
+        <w:t xml:space="preserve"> table </w:t>
+      </w:r>
+      <w:proofErr w:type="spellStart"/>
+      <w:r>
+        <w:rPr>
+          <w:sz w:val="24"/>
+          <w:szCs w:val="24"/>
+          <w:lang w:val="en-US"/>
+        </w:rPr>
+        <w:t>analitik</w:t>
+      </w:r>
+      <w:proofErr w:type="spellEnd"/>
+      <w:r>
+        <w:rPr>
+          <w:sz w:val="24"/>
+          <w:szCs w:val="24"/>
+          <w:lang w:val="en-US"/>
+        </w:rPr>
+        <w:t xml:space="preserve"> Read-Only </w:t>
+      </w:r>
+      <w:proofErr w:type="spellStart"/>
+      <w:r>
+        <w:rPr>
+          <w:sz w:val="24"/>
+          <w:szCs w:val="24"/>
+          <w:lang w:val="en-US"/>
+        </w:rPr>
+        <w:t>menampilkan</w:t>
+      </w:r>
+      <w:proofErr w:type="spellEnd"/>
+      <w:r>
+        <w:rPr>
+          <w:sz w:val="24"/>
+          <w:szCs w:val="24"/>
+          <w:lang w:val="en-US"/>
+        </w:rPr>
+        <w:t xml:space="preserve"> </w:t>
+      </w:r>
+      <w:proofErr w:type="spellStart"/>
+      <w:r>
+        <w:rPr>
+          <w:sz w:val="24"/>
+          <w:szCs w:val="24"/>
+          <w:lang w:val="en-US"/>
+        </w:rPr>
+        <w:t>seluruh</w:t>
+      </w:r>
+      <w:proofErr w:type="spellEnd"/>
+      <w:r>
+        <w:rPr>
+          <w:sz w:val="24"/>
+          <w:szCs w:val="24"/>
+          <w:lang w:val="en-US"/>
+        </w:rPr>
+        <w:t xml:space="preserve"> </w:t>
+      </w:r>
+      <w:proofErr w:type="spellStart"/>
+      <w:r>
+        <w:rPr>
+          <w:sz w:val="24"/>
+          <w:szCs w:val="24"/>
+          <w:lang w:val="en-US"/>
+        </w:rPr>
+        <w:t>komponen</w:t>
+      </w:r>
+      <w:proofErr w:type="spellEnd"/>
+      <w:r>
+        <w:rPr>
+          <w:sz w:val="24"/>
+          <w:szCs w:val="24"/>
+          <w:lang w:val="en-US"/>
+        </w:rPr>
+        <w:t xml:space="preserve"> </w:t>
+      </w:r>
+      <w:proofErr w:type="spellStart"/>
+      <w:r>
+        <w:rPr>
+          <w:sz w:val="24"/>
+          <w:szCs w:val="24"/>
+          <w:lang w:val="en-US"/>
+        </w:rPr>
+        <w:t>jadwal</w:t>
+      </w:r>
+      <w:proofErr w:type="spellEnd"/>
+      <w:r>
+        <w:rPr>
+          <w:sz w:val="24"/>
+          <w:szCs w:val="24"/>
+          <w:lang w:val="en-US"/>
+        </w:rPr>
+        <w:t xml:space="preserve"> </w:t>
+      </w:r>
+      <w:proofErr w:type="spellStart"/>
+      <w:r>
+        <w:rPr>
+          <w:sz w:val="24"/>
+          <w:szCs w:val="24"/>
+          <w:lang w:val="en-US"/>
+        </w:rPr>
+        <w:t>harian</w:t>
+      </w:r>
+      <w:proofErr w:type="spellEnd"/>
+      <w:r>
+        <w:rPr>
+          <w:sz w:val="24"/>
+          <w:szCs w:val="24"/>
+          <w:lang w:val="en-US"/>
+        </w:rPr>
+        <w:t xml:space="preserve"> </w:t>
+      </w:r>
+      <w:proofErr w:type="spellStart"/>
+      <w:r>
+        <w:rPr>
+          <w:sz w:val="24"/>
+          <w:szCs w:val="24"/>
+          <w:lang w:val="en-US"/>
+        </w:rPr>
+        <w:t>dilengkapi</w:t>
+      </w:r>
+      <w:proofErr w:type="spellEnd"/>
+      <w:r>
+        <w:rPr>
+          <w:sz w:val="24"/>
+          <w:szCs w:val="24"/>
+          <w:lang w:val="en-US"/>
+        </w:rPr>
+        <w:t xml:space="preserve"> badge </w:t>
+      </w:r>
+      <w:proofErr w:type="spellStart"/>
+      <w:r>
+        <w:rPr>
+          <w:sz w:val="24"/>
+          <w:szCs w:val="24"/>
+          <w:lang w:val="en-US"/>
+        </w:rPr>
+        <w:t>indikator</w:t>
+      </w:r>
+      <w:proofErr w:type="spellEnd"/>
+      <w:r>
+        <w:rPr>
+          <w:sz w:val="24"/>
+          <w:szCs w:val="24"/>
+          <w:lang w:val="en-US"/>
+        </w:rPr>
+        <w:t xml:space="preserve"> visual </w:t>
+      </w:r>
+      <w:proofErr w:type="spellStart"/>
+      <w:r>
+        <w:rPr>
+          <w:sz w:val="24"/>
+          <w:szCs w:val="24"/>
+          <w:lang w:val="en-US"/>
+        </w:rPr>
+        <w:t>warna</w:t>
+      </w:r>
+      <w:proofErr w:type="spellEnd"/>
+      <w:r>
+        <w:rPr>
+          <w:sz w:val="24"/>
+          <w:szCs w:val="24"/>
+          <w:lang w:val="en-US"/>
+        </w:rPr>
+        <w:t xml:space="preserve"> </w:t>
+      </w:r>
+      <w:proofErr w:type="spellStart"/>
+      <w:r>
+        <w:rPr>
+          <w:sz w:val="24"/>
+          <w:szCs w:val="24"/>
+          <w:lang w:val="en-US"/>
+        </w:rPr>
+        <w:t>hijau</w:t>
+      </w:r>
+      <w:proofErr w:type="spellEnd"/>
+      <w:r>
+        <w:rPr>
+          <w:sz w:val="24"/>
+          <w:szCs w:val="24"/>
+          <w:lang w:val="en-US"/>
+        </w:rPr>
+        <w:t>/</w:t>
+      </w:r>
+      <w:proofErr w:type="spellStart"/>
+      <w:r>
+        <w:rPr>
+          <w:sz w:val="24"/>
+          <w:szCs w:val="24"/>
+          <w:lang w:val="en-US"/>
+        </w:rPr>
+        <w:t>merah</w:t>
+      </w:r>
+      <w:proofErr w:type="spellEnd"/>
+      <w:r>
+        <w:rPr>
+          <w:sz w:val="24"/>
+          <w:szCs w:val="24"/>
+          <w:lang w:val="en-US"/>
+        </w:rPr>
+        <w:t xml:space="preserve"> pada </w:t>
+      </w:r>
+      <w:proofErr w:type="spellStart"/>
+      <w:r>
+        <w:rPr>
+          <w:sz w:val="24"/>
+          <w:szCs w:val="24"/>
+          <w:lang w:val="en-US"/>
+        </w:rPr>
+        <w:t>kolom</w:t>
+      </w:r>
+      <w:proofErr w:type="spellEnd"/>
+      <w:r>
+        <w:rPr>
+          <w:sz w:val="24"/>
+          <w:szCs w:val="24"/>
+          <w:lang w:val="en-US"/>
+        </w:rPr>
+        <w:t xml:space="preserve"> On Time/Late Status. </w:t>
+      </w:r>
+      <w:proofErr w:type="spellStart"/>
+      <w:r>
+        <w:rPr>
+          <w:sz w:val="24"/>
+          <w:szCs w:val="24"/>
+          <w:lang w:val="en-US"/>
+        </w:rPr>
+        <w:t>Dilengkapi</w:t>
+      </w:r>
+      <w:proofErr w:type="spellEnd"/>
+      <w:r>
+        <w:rPr>
+          <w:sz w:val="24"/>
+          <w:szCs w:val="24"/>
+          <w:lang w:val="en-US"/>
+        </w:rPr>
+        <w:t xml:space="preserve"> filter </w:t>
+      </w:r>
+      <w:proofErr w:type="spellStart"/>
+      <w:r>
+        <w:rPr>
+          <w:sz w:val="24"/>
+          <w:szCs w:val="24"/>
+          <w:lang w:val="en-US"/>
+        </w:rPr>
+        <w:t>tanggal</w:t>
+      </w:r>
+      <w:proofErr w:type="spellEnd"/>
+      <w:r>
+        <w:rPr>
+          <w:sz w:val="24"/>
+          <w:szCs w:val="24"/>
+          <w:lang w:val="en-US"/>
+        </w:rPr>
+        <w:t xml:space="preserve">, </w:t>
+      </w:r>
+      <w:proofErr w:type="spellStart"/>
+      <w:r>
+        <w:rPr>
+          <w:sz w:val="24"/>
+          <w:szCs w:val="24"/>
+          <w:lang w:val="en-US"/>
+        </w:rPr>
+        <w:t>mesin</w:t>
+      </w:r>
+      <w:proofErr w:type="spellEnd"/>
+      <w:r>
+        <w:rPr>
+          <w:sz w:val="24"/>
+          <w:szCs w:val="24"/>
+          <w:lang w:val="en-US"/>
+        </w:rPr>
+        <w:t xml:space="preserve">, status </w:t>
+      </w:r>
+      <w:proofErr w:type="spellStart"/>
+      <w:r>
+        <w:rPr>
+          <w:sz w:val="24"/>
+          <w:szCs w:val="24"/>
+          <w:lang w:val="en-US"/>
+        </w:rPr>
+        <w:t>realisasi</w:t>
+      </w:r>
+      <w:proofErr w:type="spellEnd"/>
+      <w:r>
+        <w:rPr>
+          <w:sz w:val="24"/>
+          <w:szCs w:val="24"/>
+          <w:lang w:val="en-US"/>
+        </w:rPr>
+        <w:t xml:space="preserve">, </w:t>
+      </w:r>
+      <w:proofErr w:type="spellStart"/>
+      <w:r>
+        <w:rPr>
+          <w:sz w:val="24"/>
+          <w:szCs w:val="24"/>
+          <w:lang w:val="en-US"/>
+        </w:rPr>
+        <w:t>serta</w:t>
+      </w:r>
+      <w:proofErr w:type="spellEnd"/>
+      <w:r>
+        <w:rPr>
+          <w:sz w:val="24"/>
+          <w:szCs w:val="24"/>
+          <w:lang w:val="en-US"/>
+        </w:rPr>
+        <w:t xml:space="preserve"> </w:t>
+      </w:r>
+      <w:proofErr w:type="spellStart"/>
+      <w:r>
+        <w:rPr>
+          <w:sz w:val="24"/>
+          <w:szCs w:val="24"/>
+          <w:lang w:val="en-US"/>
+        </w:rPr>
+        <w:t>tombol</w:t>
+      </w:r>
+      <w:proofErr w:type="spellEnd"/>
+      <w:r>
+        <w:rPr>
+          <w:sz w:val="24"/>
+          <w:szCs w:val="24"/>
+          <w:lang w:val="en-US"/>
+        </w:rPr>
+        <w:t xml:space="preserve"> Export Excel/PDF.</w:t>
+      </w:r>
     </w:p>
     <w:p>
       <w:pPr>
@@ -11050,6 +12589,49 @@
           <w:lang w:val="en-US"/>
         </w:rPr>
       </w:pPr>
+      <w:r>
+        <w:rPr>
+          <w:sz w:val="24"/>
+          <w:szCs w:val="24"/>
+          <w:lang w:val="en-US"/>
+        </w:rPr>
+        <w:lastRenderedPageBreak/>
+        <w:drawing>
+          <wp:inline distT="0" distB="0" distL="0" distR="0" wp14:anchorId="14562D60" wp14:editId="5137F35F">
+            <wp:extent cx="5411470" cy="2478001"/>
+            <wp:effectExtent l="0" t="0" r="0" b="0"/>
+            <wp:docPr id="1180511343" name="Picture 1"/>
+            <wp:cNvGraphicFramePr>
+              <a:graphicFrameLocks xmlns:a="http://schemas.openxmlformats.org/drawingml/2006/main" noChangeAspect="1"/>
+            </wp:cNvGraphicFramePr>
+            <a:graphic xmlns:a="http://schemas.openxmlformats.org/drawingml/2006/main">
+              <a:graphicData uri="http://schemas.openxmlformats.org/drawingml/2006/picture">
+                <pic:pic xmlns:pic="http://schemas.openxmlformats.org/drawingml/2006/picture">
+                  <pic:nvPicPr>
+                    <pic:cNvPr id="1180511343" name=""/>
+                    <pic:cNvPicPr/>
+                  </pic:nvPicPr>
+                  <pic:blipFill>
+                    <a:blip r:embed="rId17"/>
+                    <a:stretch>
+                      <a:fillRect/>
+                    </a:stretch>
+                  </pic:blipFill>
+                  <pic:spPr>
+                    <a:xfrm>
+                      <a:off x="0" y="0"/>
+                      <a:ext cx="5418673" cy="2481299"/>
+                    </a:xfrm>
+                    <a:prstGeom prst="rect">
+                      <a:avLst/>
+                    </a:prstGeom>
+                  </pic:spPr>
+                </pic:pic>
+              </a:graphicData>
+            </a:graphic>
+          </wp:inline>
+        </w:drawing>
+      </w:r>
     </w:p>
     <w:p>
       <w:pPr>
@@ -11064,7 +12646,6 @@
         <w:spacing w:before="136"/>
       </w:pPr>
       <w:r>
-        <w:lastRenderedPageBreak/>
         <w:t>Kemasan</w:t>
       </w:r>
     </w:p>
@@ -11093,8 +12674,9 @@
           <w:szCs w:val="24"/>
           <w:lang w:val="en-US"/>
         </w:rPr>
-        <w:t xml:space="preserve">Dashboard </w:t>
-      </w:r>
+        <w:t xml:space="preserve">SPK </w:t>
+      </w:r>
+      <w:proofErr w:type="spellStart"/>
       <w:r>
         <w:rPr>
           <w:b/>
@@ -11103,9 +12685,9 @@
           <w:szCs w:val="24"/>
           <w:lang w:val="en-US"/>
         </w:rPr>
-        <w:t xml:space="preserve">Production </w:t>
-      </w:r>
-      <w:proofErr w:type="spellStart"/>
+        <w:t>Kemasan</w:t>
+      </w:r>
+      <w:proofErr w:type="spellEnd"/>
       <w:r>
         <w:rPr>
           <w:b/>
@@ -11114,16 +12696,33 @@
           <w:szCs w:val="24"/>
           <w:lang w:val="en-US"/>
         </w:rPr>
-        <w:t>Planing</w:t>
-      </w:r>
-      <w:proofErr w:type="spellEnd"/>
-      <w:r>
-        <w:rPr>
-          <w:sz w:val="24"/>
-          <w:szCs w:val="24"/>
-          <w:lang w:val="en-US"/>
-        </w:rPr>
-        <w:t xml:space="preserve"> `material-dashboard`</w:t>
+        <w:t xml:space="preserve"> </w:t>
+      </w:r>
+      <w:r>
+        <w:rPr>
+          <w:sz w:val="24"/>
+          <w:szCs w:val="24"/>
+          <w:lang w:val="en-US"/>
+        </w:rPr>
+        <w:t>`</w:t>
+      </w:r>
+      <w:proofErr w:type="spellStart"/>
+      <w:r>
+        <w:rPr>
+          <w:sz w:val="24"/>
+          <w:szCs w:val="24"/>
+          <w:lang w:val="en-US"/>
+        </w:rPr>
+        <w:t>spk-kemasan</w:t>
+      </w:r>
+      <w:proofErr w:type="spellEnd"/>
+      <w:r>
+        <w:rPr>
+          <w:sz w:val="24"/>
+          <w:szCs w:val="24"/>
+          <w:lang w:val="en-US"/>
+        </w:rPr>
+        <w:t>`</w:t>
       </w:r>
     </w:p>
     <w:p>
@@ -11172,6 +12771,104 @@
         </w:rPr>
         <w:t xml:space="preserve"> </w:t>
       </w:r>
+      <w:r>
+        <w:rPr>
+          <w:sz w:val="24"/>
+          <w:szCs w:val="24"/>
+          <w:lang w:val="en-US"/>
+        </w:rPr>
+        <w:t xml:space="preserve">Doc. ID, Date, </w:t>
+      </w:r>
+      <w:proofErr w:type="spellStart"/>
+      <w:r>
+        <w:rPr>
+          <w:sz w:val="24"/>
+          <w:szCs w:val="24"/>
+          <w:lang w:val="en-US"/>
+        </w:rPr>
+        <w:t>SPK_Ref_No</w:t>
+      </w:r>
+      <w:proofErr w:type="spellEnd"/>
+      <w:r>
+        <w:rPr>
+          <w:sz w:val="24"/>
+          <w:szCs w:val="24"/>
+          <w:lang w:val="en-US"/>
+        </w:rPr>
+        <w:t xml:space="preserve">, Product_ID, </w:t>
+      </w:r>
+      <w:proofErr w:type="spellStart"/>
+      <w:r>
+        <w:rPr>
+          <w:sz w:val="24"/>
+          <w:szCs w:val="24"/>
+          <w:lang w:val="en-US"/>
+        </w:rPr>
+        <w:t>Package_Type</w:t>
+      </w:r>
+      <w:proofErr w:type="spellEnd"/>
+      <w:r>
+        <w:rPr>
+          <w:sz w:val="24"/>
+          <w:szCs w:val="24"/>
+          <w:lang w:val="en-US"/>
+        </w:rPr>
+        <w:t xml:space="preserve">, </w:t>
+      </w:r>
+      <w:proofErr w:type="spellStart"/>
+      <w:r>
+        <w:rPr>
+          <w:sz w:val="24"/>
+          <w:szCs w:val="24"/>
+          <w:lang w:val="en-US"/>
+        </w:rPr>
+        <w:t>Target_Qty_Pcs</w:t>
+      </w:r>
+      <w:proofErr w:type="spellEnd"/>
+      <w:r>
+        <w:rPr>
+          <w:sz w:val="24"/>
+          <w:szCs w:val="24"/>
+          <w:lang w:val="en-US"/>
+        </w:rPr>
+        <w:t xml:space="preserve">, </w:t>
+      </w:r>
+      <w:proofErr w:type="spellStart"/>
+      <w:r>
+        <w:rPr>
+          <w:sz w:val="24"/>
+          <w:szCs w:val="24"/>
+          <w:lang w:val="en-US"/>
+        </w:rPr>
+        <w:t>Target_Tonase</w:t>
+      </w:r>
+      <w:proofErr w:type="spellEnd"/>
+      <w:r>
+        <w:rPr>
+          <w:sz w:val="24"/>
+          <w:szCs w:val="24"/>
+          <w:lang w:val="en-US"/>
+        </w:rPr>
+        <w:t xml:space="preserve">, Status, Notes, </w:t>
+      </w:r>
+      <w:proofErr w:type="spellStart"/>
+      <w:r>
+        <w:rPr>
+          <w:sz w:val="24"/>
+          <w:szCs w:val="24"/>
+          <w:lang w:val="en-US"/>
+        </w:rPr>
+        <w:t>User_ID</w:t>
+      </w:r>
+      <w:proofErr w:type="spellEnd"/>
+      <w:r>
+        <w:rPr>
+          <w:sz w:val="24"/>
+          <w:szCs w:val="24"/>
+          <w:lang w:val="en-US"/>
+        </w:rPr>
+        <w:t>.</w:t>
+      </w:r>
     </w:p>
     <w:p>
       <w:pPr>
@@ -11219,6 +12916,204 @@
         </w:rPr>
         <w:t xml:space="preserve"> </w:t>
       </w:r>
+      <w:proofErr w:type="spellStart"/>
+      <w:r>
+        <w:rPr>
+          <w:sz w:val="24"/>
+          <w:szCs w:val="24"/>
+          <w:lang w:val="en-US"/>
+        </w:rPr>
+        <w:t>Menerbitkan</w:t>
+      </w:r>
+      <w:proofErr w:type="spellEnd"/>
+      <w:r>
+        <w:rPr>
+          <w:sz w:val="24"/>
+          <w:szCs w:val="24"/>
+          <w:lang w:val="en-US"/>
+        </w:rPr>
+        <w:t xml:space="preserve"> dan </w:t>
+      </w:r>
+      <w:proofErr w:type="spellStart"/>
+      <w:r>
+        <w:rPr>
+          <w:sz w:val="24"/>
+          <w:szCs w:val="24"/>
+          <w:lang w:val="en-US"/>
+        </w:rPr>
+        <w:t>mengelola</w:t>
+      </w:r>
+      <w:proofErr w:type="spellEnd"/>
+      <w:r>
+        <w:rPr>
+          <w:sz w:val="24"/>
+          <w:szCs w:val="24"/>
+          <w:lang w:val="en-US"/>
+        </w:rPr>
+        <w:t xml:space="preserve"> Surat </w:t>
+      </w:r>
+      <w:proofErr w:type="spellStart"/>
+      <w:r>
+        <w:rPr>
+          <w:sz w:val="24"/>
+          <w:szCs w:val="24"/>
+          <w:lang w:val="en-US"/>
+        </w:rPr>
+        <w:t>Perintah</w:t>
+      </w:r>
+      <w:proofErr w:type="spellEnd"/>
+      <w:r>
+        <w:rPr>
+          <w:sz w:val="24"/>
+          <w:szCs w:val="24"/>
+          <w:lang w:val="en-US"/>
+        </w:rPr>
+        <w:t xml:space="preserve"> </w:t>
+      </w:r>
+      <w:proofErr w:type="spellStart"/>
+      <w:r>
+        <w:rPr>
+          <w:sz w:val="24"/>
+          <w:szCs w:val="24"/>
+          <w:lang w:val="en-US"/>
+        </w:rPr>
+        <w:t>Kerja</w:t>
+      </w:r>
+      <w:proofErr w:type="spellEnd"/>
+      <w:r>
+        <w:rPr>
+          <w:sz w:val="24"/>
+          <w:szCs w:val="24"/>
+          <w:lang w:val="en-US"/>
+        </w:rPr>
+        <w:t xml:space="preserve"> </w:t>
+      </w:r>
+      <w:proofErr w:type="spellStart"/>
+      <w:r>
+        <w:rPr>
+          <w:sz w:val="24"/>
+          <w:szCs w:val="24"/>
+          <w:lang w:val="en-US"/>
+        </w:rPr>
+        <w:t>khusus</w:t>
+      </w:r>
+      <w:proofErr w:type="spellEnd"/>
+      <w:r>
+        <w:rPr>
+          <w:sz w:val="24"/>
+          <w:szCs w:val="24"/>
+          <w:lang w:val="en-US"/>
+        </w:rPr>
+        <w:t xml:space="preserve"> </w:t>
+      </w:r>
+      <w:proofErr w:type="spellStart"/>
+      <w:r>
+        <w:rPr>
+          <w:sz w:val="24"/>
+          <w:szCs w:val="24"/>
+          <w:lang w:val="en-US"/>
+        </w:rPr>
+        <w:t>persiapan</w:t>
+      </w:r>
+      <w:proofErr w:type="spellEnd"/>
+      <w:r>
+        <w:rPr>
+          <w:sz w:val="24"/>
+          <w:szCs w:val="24"/>
+          <w:lang w:val="en-US"/>
+        </w:rPr>
+        <w:t xml:space="preserve">, </w:t>
+      </w:r>
+      <w:proofErr w:type="spellStart"/>
+      <w:r>
+        <w:rPr>
+          <w:sz w:val="24"/>
+          <w:szCs w:val="24"/>
+          <w:lang w:val="en-US"/>
+        </w:rPr>
+        <w:t>pencetakan</w:t>
+      </w:r>
+      <w:proofErr w:type="spellEnd"/>
+      <w:r>
+        <w:rPr>
+          <w:sz w:val="24"/>
+          <w:szCs w:val="24"/>
+          <w:lang w:val="en-US"/>
+        </w:rPr>
+        <w:t xml:space="preserve">, dan </w:t>
+      </w:r>
+      <w:proofErr w:type="spellStart"/>
+      <w:r>
+        <w:rPr>
+          <w:sz w:val="24"/>
+          <w:szCs w:val="24"/>
+          <w:lang w:val="en-US"/>
+        </w:rPr>
+        <w:t>penyediaan</w:t>
+      </w:r>
+      <w:proofErr w:type="spellEnd"/>
+      <w:r>
+        <w:rPr>
+          <w:sz w:val="24"/>
+          <w:szCs w:val="24"/>
+          <w:lang w:val="en-US"/>
+        </w:rPr>
+        <w:t xml:space="preserve"> material </w:t>
+      </w:r>
+      <w:proofErr w:type="spellStart"/>
+      <w:r>
+        <w:rPr>
+          <w:sz w:val="24"/>
+          <w:szCs w:val="24"/>
+          <w:lang w:val="en-US"/>
+        </w:rPr>
+        <w:t>kemasan</w:t>
+      </w:r>
+      <w:proofErr w:type="spellEnd"/>
+      <w:r>
+        <w:rPr>
+          <w:sz w:val="24"/>
+          <w:szCs w:val="24"/>
+          <w:lang w:val="en-US"/>
+        </w:rPr>
+        <w:t xml:space="preserve"> (</w:t>
+      </w:r>
+      <w:proofErr w:type="spellStart"/>
+      <w:r>
+        <w:rPr>
+          <w:sz w:val="24"/>
+          <w:szCs w:val="24"/>
+          <w:lang w:val="en-US"/>
+        </w:rPr>
+        <w:t>kaleng</w:t>
+      </w:r>
+      <w:proofErr w:type="spellEnd"/>
+      <w:r>
+        <w:rPr>
+          <w:sz w:val="24"/>
+          <w:szCs w:val="24"/>
+          <w:lang w:val="en-US"/>
+        </w:rPr>
+        <w:t>/</w:t>
+      </w:r>
+      <w:proofErr w:type="spellStart"/>
+      <w:r>
+        <w:rPr>
+          <w:sz w:val="24"/>
+          <w:szCs w:val="24"/>
+          <w:lang w:val="en-US"/>
+        </w:rPr>
+        <w:t>galon</w:t>
+      </w:r>
+      <w:proofErr w:type="spellEnd"/>
+      <w:r>
+        <w:rPr>
+          <w:sz w:val="24"/>
+          <w:szCs w:val="24"/>
+          <w:lang w:val="en-US"/>
+        </w:rPr>
+        <w:t>/pail).</w:t>
+      </w:r>
     </w:p>
     <w:p>
       <w:pPr>
@@ -11258,6 +13153,1221 @@
         </w:rPr>
         <w:t xml:space="preserve"> UI:</w:t>
       </w:r>
+      <w:r>
+        <w:rPr>
+          <w:b/>
+          <w:bCs/>
+          <w:sz w:val="24"/>
+          <w:szCs w:val="24"/>
+          <w:lang w:val="en-US"/>
+        </w:rPr>
+        <w:t xml:space="preserve"> </w:t>
+      </w:r>
+      <w:proofErr w:type="spellStart"/>
+      <w:r>
+        <w:rPr>
+          <w:sz w:val="24"/>
+          <w:szCs w:val="24"/>
+          <w:lang w:val="en-US"/>
+        </w:rPr>
+        <w:t>Tampilan</w:t>
+      </w:r>
+      <w:proofErr w:type="spellEnd"/>
+      <w:r>
+        <w:rPr>
+          <w:sz w:val="24"/>
+          <w:szCs w:val="24"/>
+          <w:lang w:val="en-US"/>
+        </w:rPr>
+        <w:t xml:space="preserve"> </w:t>
+      </w:r>
+      <w:proofErr w:type="spellStart"/>
+      <w:r>
+        <w:rPr>
+          <w:sz w:val="24"/>
+          <w:szCs w:val="24"/>
+          <w:lang w:val="en-US"/>
+        </w:rPr>
+        <w:t>awal</w:t>
+      </w:r>
+      <w:proofErr w:type="spellEnd"/>
+      <w:r>
+        <w:rPr>
+          <w:sz w:val="24"/>
+          <w:szCs w:val="24"/>
+          <w:lang w:val="en-US"/>
+        </w:rPr>
+        <w:t xml:space="preserve"> </w:t>
+      </w:r>
+      <w:proofErr w:type="spellStart"/>
+      <w:r>
+        <w:rPr>
+          <w:sz w:val="24"/>
+          <w:szCs w:val="24"/>
+          <w:lang w:val="en-US"/>
+        </w:rPr>
+        <w:t>berupa</w:t>
+      </w:r>
+      <w:proofErr w:type="spellEnd"/>
+      <w:r>
+        <w:rPr>
+          <w:sz w:val="24"/>
+          <w:szCs w:val="24"/>
+          <w:lang w:val="en-US"/>
+        </w:rPr>
+        <w:t xml:space="preserve"> table data grid </w:t>
+      </w:r>
+      <w:proofErr w:type="spellStart"/>
+      <w:r>
+        <w:rPr>
+          <w:sz w:val="24"/>
+          <w:szCs w:val="24"/>
+          <w:lang w:val="en-US"/>
+        </w:rPr>
+        <w:t>menampilkan</w:t>
+      </w:r>
+      <w:proofErr w:type="spellEnd"/>
+      <w:r>
+        <w:rPr>
+          <w:sz w:val="24"/>
+          <w:szCs w:val="24"/>
+          <w:lang w:val="en-US"/>
+        </w:rPr>
+        <w:t xml:space="preserve"> Doc. ID, Date, </w:t>
+      </w:r>
+      <w:proofErr w:type="spellStart"/>
+      <w:r>
+        <w:rPr>
+          <w:sz w:val="24"/>
+          <w:szCs w:val="24"/>
+          <w:lang w:val="en-US"/>
+        </w:rPr>
+        <w:t>SPK_Ref_No</w:t>
+      </w:r>
+      <w:proofErr w:type="spellEnd"/>
+      <w:r>
+        <w:rPr>
+          <w:sz w:val="24"/>
+          <w:szCs w:val="24"/>
+          <w:lang w:val="en-US"/>
+        </w:rPr>
+        <w:t xml:space="preserve">, Product_ID, </w:t>
+      </w:r>
+      <w:proofErr w:type="spellStart"/>
+      <w:r>
+        <w:rPr>
+          <w:sz w:val="24"/>
+          <w:szCs w:val="24"/>
+          <w:lang w:val="en-US"/>
+        </w:rPr>
+        <w:t>Package_Type</w:t>
+      </w:r>
+      <w:proofErr w:type="spellEnd"/>
+      <w:r>
+        <w:rPr>
+          <w:sz w:val="24"/>
+          <w:szCs w:val="24"/>
+          <w:lang w:val="en-US"/>
+        </w:rPr>
+        <w:t xml:space="preserve">, </w:t>
+      </w:r>
+      <w:proofErr w:type="spellStart"/>
+      <w:r>
+        <w:rPr>
+          <w:sz w:val="24"/>
+          <w:szCs w:val="24"/>
+          <w:lang w:val="en-US"/>
+        </w:rPr>
+        <w:t>Target_Qty_Pcs</w:t>
+      </w:r>
+      <w:proofErr w:type="spellEnd"/>
+      <w:r>
+        <w:rPr>
+          <w:sz w:val="24"/>
+          <w:szCs w:val="24"/>
+          <w:lang w:val="en-US"/>
+        </w:rPr>
+        <w:t xml:space="preserve">, Status, dan Notes </w:t>
+      </w:r>
+      <w:proofErr w:type="spellStart"/>
+      <w:r>
+        <w:rPr>
+          <w:sz w:val="24"/>
+          <w:szCs w:val="24"/>
+          <w:lang w:val="en-US"/>
+        </w:rPr>
+        <w:t>beserta</w:t>
+      </w:r>
+      <w:proofErr w:type="spellEnd"/>
+      <w:r>
+        <w:rPr>
+          <w:sz w:val="24"/>
+          <w:szCs w:val="24"/>
+          <w:lang w:val="en-US"/>
+        </w:rPr>
+        <w:t xml:space="preserve"> filter </w:t>
+      </w:r>
+      <w:proofErr w:type="spellStart"/>
+      <w:r>
+        <w:rPr>
+          <w:sz w:val="24"/>
+          <w:szCs w:val="24"/>
+          <w:lang w:val="en-US"/>
+        </w:rPr>
+        <w:t>tanggal</w:t>
+      </w:r>
+      <w:proofErr w:type="spellEnd"/>
+      <w:r>
+        <w:rPr>
+          <w:sz w:val="24"/>
+          <w:szCs w:val="24"/>
+          <w:lang w:val="en-US"/>
+        </w:rPr>
+        <w:t xml:space="preserve"> dan </w:t>
+      </w:r>
+      <w:proofErr w:type="spellStart"/>
+      <w:r>
+        <w:rPr>
+          <w:sz w:val="24"/>
+          <w:szCs w:val="24"/>
+          <w:lang w:val="en-US"/>
+        </w:rPr>
+        <w:t>jenis</w:t>
+      </w:r>
+      <w:proofErr w:type="spellEnd"/>
+      <w:r>
+        <w:rPr>
+          <w:sz w:val="24"/>
+          <w:szCs w:val="24"/>
+          <w:lang w:val="en-US"/>
+        </w:rPr>
+        <w:t xml:space="preserve"> </w:t>
+      </w:r>
+      <w:proofErr w:type="spellStart"/>
+      <w:r>
+        <w:rPr>
+          <w:sz w:val="24"/>
+          <w:szCs w:val="24"/>
+          <w:lang w:val="en-US"/>
+        </w:rPr>
+        <w:t>kemasan</w:t>
+      </w:r>
+      <w:proofErr w:type="spellEnd"/>
+      <w:r>
+        <w:rPr>
+          <w:sz w:val="24"/>
+          <w:szCs w:val="24"/>
+          <w:lang w:val="en-US"/>
+        </w:rPr>
+        <w:t xml:space="preserve">. </w:t>
+      </w:r>
+      <w:proofErr w:type="spellStart"/>
+      <w:r>
+        <w:rPr>
+          <w:sz w:val="24"/>
+          <w:szCs w:val="24"/>
+          <w:lang w:val="en-US"/>
+        </w:rPr>
+        <w:t>Tombol</w:t>
+      </w:r>
+      <w:proofErr w:type="spellEnd"/>
+      <w:r>
+        <w:rPr>
+          <w:sz w:val="24"/>
+          <w:szCs w:val="24"/>
+          <w:lang w:val="en-US"/>
+        </w:rPr>
+        <w:t xml:space="preserve"> </w:t>
+      </w:r>
+      <w:proofErr w:type="spellStart"/>
+      <w:r>
+        <w:rPr>
+          <w:sz w:val="24"/>
+          <w:szCs w:val="24"/>
+          <w:lang w:val="en-US"/>
+        </w:rPr>
+        <w:t>Tambah</w:t>
+      </w:r>
+      <w:proofErr w:type="spellEnd"/>
+      <w:r>
+        <w:rPr>
+          <w:sz w:val="24"/>
+          <w:szCs w:val="24"/>
+          <w:lang w:val="en-US"/>
+        </w:rPr>
+        <w:t xml:space="preserve"> </w:t>
+      </w:r>
+      <w:proofErr w:type="spellStart"/>
+      <w:r>
+        <w:rPr>
+          <w:sz w:val="24"/>
+          <w:szCs w:val="24"/>
+          <w:lang w:val="en-US"/>
+        </w:rPr>
+        <w:t>memunculkan</w:t>
+      </w:r>
+      <w:proofErr w:type="spellEnd"/>
+      <w:r>
+        <w:rPr>
+          <w:sz w:val="24"/>
+          <w:szCs w:val="24"/>
+          <w:lang w:val="en-US"/>
+        </w:rPr>
+        <w:t xml:space="preserve"> Pop-up Modal Form </w:t>
+      </w:r>
+      <w:proofErr w:type="spellStart"/>
+      <w:r>
+        <w:rPr>
+          <w:sz w:val="24"/>
+          <w:szCs w:val="24"/>
+          <w:lang w:val="en-US"/>
+        </w:rPr>
+        <w:t>berstruktur</w:t>
+      </w:r>
+      <w:proofErr w:type="spellEnd"/>
+      <w:r>
+        <w:rPr>
+          <w:sz w:val="24"/>
+          <w:szCs w:val="24"/>
+          <w:lang w:val="en-US"/>
+        </w:rPr>
+        <w:t xml:space="preserve"> Header (Date, SPK Ref, Package Type, Target Pcs) dan Table Detail Packaging Specs. Edit </w:t>
+      </w:r>
+      <w:proofErr w:type="spellStart"/>
+      <w:r>
+        <w:rPr>
+          <w:sz w:val="24"/>
+          <w:szCs w:val="24"/>
+          <w:lang w:val="en-US"/>
+        </w:rPr>
+        <w:t>memunculkan</w:t>
+      </w:r>
+      <w:proofErr w:type="spellEnd"/>
+      <w:r>
+        <w:rPr>
+          <w:sz w:val="24"/>
+          <w:szCs w:val="24"/>
+          <w:lang w:val="en-US"/>
+        </w:rPr>
+        <w:t xml:space="preserve"> modal form </w:t>
+      </w:r>
+      <w:proofErr w:type="spellStart"/>
+      <w:r>
+        <w:rPr>
+          <w:sz w:val="24"/>
+          <w:szCs w:val="24"/>
+          <w:lang w:val="en-US"/>
+        </w:rPr>
+        <w:t>terisi</w:t>
+      </w:r>
+      <w:proofErr w:type="spellEnd"/>
+      <w:r>
+        <w:rPr>
+          <w:sz w:val="24"/>
+          <w:szCs w:val="24"/>
+          <w:lang w:val="en-US"/>
+        </w:rPr>
+        <w:t xml:space="preserve">, Hapus </w:t>
+      </w:r>
+      <w:proofErr w:type="spellStart"/>
+      <w:r>
+        <w:rPr>
+          <w:sz w:val="24"/>
+          <w:szCs w:val="24"/>
+          <w:lang w:val="en-US"/>
+        </w:rPr>
+        <w:t>memunculkan</w:t>
+      </w:r>
+      <w:proofErr w:type="spellEnd"/>
+      <w:r>
+        <w:rPr>
+          <w:sz w:val="24"/>
+          <w:szCs w:val="24"/>
+          <w:lang w:val="en-US"/>
+        </w:rPr>
+        <w:t xml:space="preserve"> alert </w:t>
+      </w:r>
+      <w:proofErr w:type="spellStart"/>
+      <w:r>
+        <w:rPr>
+          <w:sz w:val="24"/>
+          <w:szCs w:val="24"/>
+          <w:lang w:val="en-US"/>
+        </w:rPr>
+        <w:t>konfirmasi</w:t>
+      </w:r>
+      <w:proofErr w:type="spellEnd"/>
+      <w:r>
+        <w:rPr>
+          <w:sz w:val="24"/>
+          <w:szCs w:val="24"/>
+          <w:lang w:val="en-US"/>
+        </w:rPr>
+        <w:t>.</w:t>
+      </w:r>
+    </w:p>
+    <w:p>
+      <w:pPr>
+        <w:tabs>
+          <w:tab w:val="num" w:pos="2160"/>
+        </w:tabs>
+        <w:spacing w:line="360" w:lineRule="auto"/>
+        <w:ind w:left="1728"/>
+        <w:rPr>
+          <w:sz w:val="24"/>
+          <w:szCs w:val="24"/>
+          <w:lang w:val="en-US"/>
+        </w:rPr>
+      </w:pPr>
+    </w:p>
+    <w:p>
+      <w:pPr>
+        <w:numPr>
+          <w:ilvl w:val="1"/>
+          <w:numId w:val="26"/>
+        </w:numPr>
+        <w:tabs>
+          <w:tab w:val="num" w:pos="1440"/>
+        </w:tabs>
+        <w:spacing w:line="360" w:lineRule="auto"/>
+        <w:rPr>
+          <w:sz w:val="24"/>
+          <w:szCs w:val="24"/>
+          <w:lang w:val="en-US"/>
+        </w:rPr>
+      </w:pPr>
+      <w:r>
+        <w:rPr>
+          <w:b/>
+          <w:sz w:val="24"/>
+          <w:szCs w:val="24"/>
+          <w:lang w:val="en-US"/>
+        </w:rPr>
+        <w:t>Jadwal Kemasan</w:t>
+      </w:r>
+      <w:r>
+        <w:rPr>
+          <w:bCs/>
+          <w:sz w:val="24"/>
+          <w:szCs w:val="24"/>
+          <w:lang w:val="en-US"/>
+        </w:rPr>
+        <w:t xml:space="preserve"> `</w:t>
+      </w:r>
+      <w:proofErr w:type="spellStart"/>
+      <w:r>
+        <w:rPr>
+          <w:bCs/>
+          <w:sz w:val="24"/>
+          <w:szCs w:val="24"/>
+          <w:lang w:val="en-US"/>
+        </w:rPr>
+        <w:t>jadwal-kemasan</w:t>
+      </w:r>
+      <w:proofErr w:type="spellEnd"/>
+      <w:r>
+        <w:rPr>
+          <w:bCs/>
+          <w:sz w:val="24"/>
+          <w:szCs w:val="24"/>
+          <w:lang w:val="en-US"/>
+        </w:rPr>
+        <w:t>`</w:t>
+      </w:r>
+    </w:p>
+    <w:p>
+      <w:pPr>
+        <w:numPr>
+          <w:ilvl w:val="2"/>
+          <w:numId w:val="26"/>
+        </w:numPr>
+        <w:tabs>
+          <w:tab w:val="num" w:pos="2160"/>
+        </w:tabs>
+        <w:spacing w:line="360" w:lineRule="auto"/>
+        <w:rPr>
+          <w:sz w:val="24"/>
+          <w:szCs w:val="24"/>
+          <w:lang w:val="en-US"/>
+        </w:rPr>
+      </w:pPr>
+      <w:proofErr w:type="spellStart"/>
+      <w:r>
+        <w:rPr>
+          <w:b/>
+          <w:bCs/>
+          <w:sz w:val="24"/>
+          <w:szCs w:val="24"/>
+          <w:lang w:val="en-US"/>
+        </w:rPr>
+        <w:t>Komponen</w:t>
+      </w:r>
+      <w:proofErr w:type="spellEnd"/>
+      <w:r>
+        <w:rPr>
+          <w:b/>
+          <w:bCs/>
+          <w:sz w:val="24"/>
+          <w:szCs w:val="24"/>
+          <w:lang w:val="en-US"/>
+        </w:rPr>
+        <w:t>:</w:t>
+      </w:r>
+      <w:r>
+        <w:rPr>
+          <w:sz w:val="24"/>
+          <w:szCs w:val="24"/>
+          <w:lang w:val="en-US"/>
+        </w:rPr>
+        <w:t xml:space="preserve"> </w:t>
+      </w:r>
+      <w:proofErr w:type="spellStart"/>
+      <w:r>
+        <w:rPr>
+          <w:sz w:val="24"/>
+          <w:szCs w:val="24"/>
+          <w:lang w:val="en-US"/>
+        </w:rPr>
+        <w:t>Schedule_ID</w:t>
+      </w:r>
+      <w:proofErr w:type="spellEnd"/>
+      <w:r>
+        <w:rPr>
+          <w:sz w:val="24"/>
+          <w:szCs w:val="24"/>
+          <w:lang w:val="en-US"/>
+        </w:rPr>
+        <w:t xml:space="preserve">, Date, </w:t>
+      </w:r>
+      <w:proofErr w:type="spellStart"/>
+      <w:r>
+        <w:rPr>
+          <w:sz w:val="24"/>
+          <w:szCs w:val="24"/>
+          <w:lang w:val="en-US"/>
+        </w:rPr>
+        <w:t>SPK_Kemasan_Ref</w:t>
+      </w:r>
+      <w:proofErr w:type="spellEnd"/>
+      <w:r>
+        <w:rPr>
+          <w:sz w:val="24"/>
+          <w:szCs w:val="24"/>
+          <w:lang w:val="en-US"/>
+        </w:rPr>
+        <w:t xml:space="preserve">, </w:t>
+      </w:r>
+      <w:proofErr w:type="spellStart"/>
+      <w:r>
+        <w:rPr>
+          <w:sz w:val="24"/>
+          <w:szCs w:val="24"/>
+          <w:lang w:val="en-US"/>
+        </w:rPr>
+        <w:t>Line_Packaging_ID</w:t>
+      </w:r>
+      <w:proofErr w:type="spellEnd"/>
+      <w:r>
+        <w:rPr>
+          <w:sz w:val="24"/>
+          <w:szCs w:val="24"/>
+          <w:lang w:val="en-US"/>
+        </w:rPr>
+        <w:t xml:space="preserve">, </w:t>
+      </w:r>
+      <w:proofErr w:type="spellStart"/>
+      <w:r>
+        <w:rPr>
+          <w:sz w:val="24"/>
+          <w:szCs w:val="24"/>
+          <w:lang w:val="en-US"/>
+        </w:rPr>
+        <w:t>Product_Name</w:t>
+      </w:r>
+      <w:proofErr w:type="spellEnd"/>
+      <w:r>
+        <w:rPr>
+          <w:sz w:val="24"/>
+          <w:szCs w:val="24"/>
+          <w:lang w:val="en-US"/>
+        </w:rPr>
+        <w:t xml:space="preserve">, </w:t>
+      </w:r>
+      <w:proofErr w:type="spellStart"/>
+      <w:r>
+        <w:rPr>
+          <w:sz w:val="24"/>
+          <w:szCs w:val="24"/>
+          <w:lang w:val="en-US"/>
+        </w:rPr>
+        <w:t>Target_Pcs</w:t>
+      </w:r>
+      <w:proofErr w:type="spellEnd"/>
+      <w:r>
+        <w:rPr>
+          <w:sz w:val="24"/>
+          <w:szCs w:val="24"/>
+          <w:lang w:val="en-US"/>
+        </w:rPr>
+        <w:t xml:space="preserve">, Shift, </w:t>
+      </w:r>
+      <w:proofErr w:type="spellStart"/>
+      <w:r>
+        <w:rPr>
+          <w:sz w:val="24"/>
+          <w:szCs w:val="24"/>
+          <w:lang w:val="en-US"/>
+        </w:rPr>
+        <w:t>Operator_In_Charge</w:t>
+      </w:r>
+      <w:proofErr w:type="spellEnd"/>
+      <w:r>
+        <w:rPr>
+          <w:sz w:val="24"/>
+          <w:szCs w:val="24"/>
+          <w:lang w:val="en-US"/>
+        </w:rPr>
+        <w:t>, Status, Notes</w:t>
+      </w:r>
+    </w:p>
+    <w:p>
+      <w:pPr>
+        <w:numPr>
+          <w:ilvl w:val="2"/>
+          <w:numId w:val="26"/>
+        </w:numPr>
+        <w:tabs>
+          <w:tab w:val="num" w:pos="2160"/>
+        </w:tabs>
+        <w:spacing w:line="360" w:lineRule="auto"/>
+        <w:rPr>
+          <w:sz w:val="24"/>
+          <w:szCs w:val="24"/>
+          <w:lang w:val="en-US"/>
+        </w:rPr>
+      </w:pPr>
+      <w:proofErr w:type="spellStart"/>
+      <w:r>
+        <w:rPr>
+          <w:b/>
+          <w:bCs/>
+          <w:sz w:val="24"/>
+          <w:szCs w:val="24"/>
+          <w:lang w:val="en-US"/>
+        </w:rPr>
+        <w:t>Fungsi</w:t>
+      </w:r>
+      <w:proofErr w:type="spellEnd"/>
+      <w:r>
+        <w:rPr>
+          <w:b/>
+          <w:bCs/>
+          <w:sz w:val="24"/>
+          <w:szCs w:val="24"/>
+          <w:lang w:val="en-US"/>
+        </w:rPr>
+        <w:t>:</w:t>
+      </w:r>
+      <w:r>
+        <w:rPr>
+          <w:sz w:val="24"/>
+          <w:szCs w:val="24"/>
+          <w:lang w:val="en-US"/>
+        </w:rPr>
+        <w:t xml:space="preserve"> </w:t>
+      </w:r>
+      <w:proofErr w:type="spellStart"/>
+      <w:r>
+        <w:rPr>
+          <w:sz w:val="24"/>
+          <w:szCs w:val="24"/>
+          <w:lang w:val="en-US"/>
+        </w:rPr>
+        <w:t>Menjadwalkan</w:t>
+      </w:r>
+      <w:proofErr w:type="spellEnd"/>
+      <w:r>
+        <w:rPr>
+          <w:sz w:val="24"/>
+          <w:szCs w:val="24"/>
+          <w:lang w:val="en-US"/>
+        </w:rPr>
+        <w:t xml:space="preserve"> plotting </w:t>
+      </w:r>
+      <w:proofErr w:type="spellStart"/>
+      <w:r>
+        <w:rPr>
+          <w:sz w:val="24"/>
+          <w:szCs w:val="24"/>
+          <w:lang w:val="en-US"/>
+        </w:rPr>
+        <w:t>pengoperasian</w:t>
+      </w:r>
+      <w:proofErr w:type="spellEnd"/>
+      <w:r>
+        <w:rPr>
+          <w:sz w:val="24"/>
+          <w:szCs w:val="24"/>
+          <w:lang w:val="en-US"/>
+        </w:rPr>
+        <w:t xml:space="preserve"> </w:t>
+      </w:r>
+      <w:proofErr w:type="spellStart"/>
+      <w:r>
+        <w:rPr>
+          <w:sz w:val="24"/>
+          <w:szCs w:val="24"/>
+          <w:lang w:val="en-US"/>
+        </w:rPr>
+        <w:t>lini</w:t>
+      </w:r>
+      <w:proofErr w:type="spellEnd"/>
+      <w:r>
+        <w:rPr>
+          <w:sz w:val="24"/>
+          <w:szCs w:val="24"/>
+          <w:lang w:val="en-US"/>
+        </w:rPr>
+        <w:t xml:space="preserve"> </w:t>
+      </w:r>
+      <w:proofErr w:type="spellStart"/>
+      <w:r>
+        <w:rPr>
+          <w:sz w:val="24"/>
+          <w:szCs w:val="24"/>
+          <w:lang w:val="en-US"/>
+        </w:rPr>
+        <w:t>mesin</w:t>
+      </w:r>
+      <w:proofErr w:type="spellEnd"/>
+      <w:r>
+        <w:rPr>
+          <w:sz w:val="24"/>
+          <w:szCs w:val="24"/>
+          <w:lang w:val="en-US"/>
+        </w:rPr>
+        <w:t xml:space="preserve"> </w:t>
+      </w:r>
+      <w:proofErr w:type="spellStart"/>
+      <w:r>
+        <w:rPr>
+          <w:sz w:val="24"/>
+          <w:szCs w:val="24"/>
+          <w:lang w:val="en-US"/>
+        </w:rPr>
+        <w:t>pengemasan</w:t>
+      </w:r>
+      <w:proofErr w:type="spellEnd"/>
+      <w:r>
+        <w:rPr>
+          <w:sz w:val="24"/>
+          <w:szCs w:val="24"/>
+          <w:lang w:val="en-US"/>
+        </w:rPr>
+        <w:t xml:space="preserve"> (packaging line) dan </w:t>
+      </w:r>
+      <w:proofErr w:type="spellStart"/>
+      <w:r>
+        <w:rPr>
+          <w:sz w:val="24"/>
+          <w:szCs w:val="24"/>
+          <w:lang w:val="en-US"/>
+        </w:rPr>
+        <w:t>alokasi</w:t>
+      </w:r>
+      <w:proofErr w:type="spellEnd"/>
+      <w:r>
+        <w:rPr>
+          <w:sz w:val="24"/>
+          <w:szCs w:val="24"/>
+          <w:lang w:val="en-US"/>
+        </w:rPr>
+        <w:t xml:space="preserve"> </w:t>
+      </w:r>
+      <w:proofErr w:type="spellStart"/>
+      <w:r>
+        <w:rPr>
+          <w:sz w:val="24"/>
+          <w:szCs w:val="24"/>
+          <w:lang w:val="en-US"/>
+        </w:rPr>
+        <w:t>tim</w:t>
+      </w:r>
+      <w:proofErr w:type="spellEnd"/>
+      <w:r>
+        <w:rPr>
+          <w:sz w:val="24"/>
+          <w:szCs w:val="24"/>
+          <w:lang w:val="en-US"/>
+        </w:rPr>
+        <w:t xml:space="preserve"> operator </w:t>
+      </w:r>
+      <w:proofErr w:type="spellStart"/>
+      <w:r>
+        <w:rPr>
+          <w:sz w:val="24"/>
+          <w:szCs w:val="24"/>
+          <w:lang w:val="en-US"/>
+        </w:rPr>
+        <w:t>berdasarkan</w:t>
+      </w:r>
+      <w:proofErr w:type="spellEnd"/>
+      <w:r>
+        <w:rPr>
+          <w:sz w:val="24"/>
+          <w:szCs w:val="24"/>
+          <w:lang w:val="en-US"/>
+        </w:rPr>
+        <w:t xml:space="preserve"> SPK </w:t>
+      </w:r>
+      <w:proofErr w:type="spellStart"/>
+      <w:r>
+        <w:rPr>
+          <w:sz w:val="24"/>
+          <w:szCs w:val="24"/>
+          <w:lang w:val="en-US"/>
+        </w:rPr>
+        <w:t>Kemasan</w:t>
+      </w:r>
+      <w:proofErr w:type="spellEnd"/>
+      <w:r>
+        <w:rPr>
+          <w:sz w:val="24"/>
+          <w:szCs w:val="24"/>
+          <w:lang w:val="en-US"/>
+        </w:rPr>
+        <w:t>.</w:t>
+      </w:r>
+    </w:p>
+    <w:p>
+      <w:pPr>
+        <w:numPr>
+          <w:ilvl w:val="2"/>
+          <w:numId w:val="26"/>
+        </w:numPr>
+        <w:tabs>
+          <w:tab w:val="num" w:pos="2160"/>
+        </w:tabs>
+        <w:spacing w:line="360" w:lineRule="auto"/>
+        <w:rPr>
+          <w:sz w:val="24"/>
+          <w:szCs w:val="24"/>
+          <w:lang w:val="en-US"/>
+        </w:rPr>
+      </w:pPr>
+      <w:proofErr w:type="spellStart"/>
+      <w:r>
+        <w:rPr>
+          <w:b/>
+          <w:bCs/>
+          <w:sz w:val="24"/>
+          <w:szCs w:val="24"/>
+          <w:lang w:val="en-US"/>
+        </w:rPr>
+        <w:t>Penjelasan</w:t>
+      </w:r>
+      <w:proofErr w:type="spellEnd"/>
+      <w:r>
+        <w:rPr>
+          <w:b/>
+          <w:bCs/>
+          <w:sz w:val="24"/>
+          <w:szCs w:val="24"/>
+          <w:lang w:val="en-US"/>
+        </w:rPr>
+        <w:t xml:space="preserve"> UI:</w:t>
+      </w:r>
+      <w:r>
+        <w:t xml:space="preserve"> </w:t>
+      </w:r>
+      <w:proofErr w:type="spellStart"/>
+      <w:r>
+        <w:rPr>
+          <w:sz w:val="24"/>
+          <w:szCs w:val="24"/>
+          <w:lang w:val="en-US"/>
+        </w:rPr>
+        <w:t>Tampilan</w:t>
+      </w:r>
+      <w:proofErr w:type="spellEnd"/>
+      <w:r>
+        <w:rPr>
+          <w:sz w:val="24"/>
+          <w:szCs w:val="24"/>
+          <w:lang w:val="en-US"/>
+        </w:rPr>
+        <w:t xml:space="preserve"> </w:t>
+      </w:r>
+      <w:proofErr w:type="spellStart"/>
+      <w:r>
+        <w:rPr>
+          <w:sz w:val="24"/>
+          <w:szCs w:val="24"/>
+          <w:lang w:val="en-US"/>
+        </w:rPr>
+        <w:t>awal</w:t>
+      </w:r>
+      <w:proofErr w:type="spellEnd"/>
+      <w:r>
+        <w:rPr>
+          <w:sz w:val="24"/>
+          <w:szCs w:val="24"/>
+          <w:lang w:val="en-US"/>
+        </w:rPr>
+        <w:t xml:space="preserve"> </w:t>
+      </w:r>
+      <w:proofErr w:type="spellStart"/>
+      <w:r>
+        <w:rPr>
+          <w:sz w:val="24"/>
+          <w:szCs w:val="24"/>
+          <w:lang w:val="en-US"/>
+        </w:rPr>
+        <w:t>berupa</w:t>
+      </w:r>
+      <w:proofErr w:type="spellEnd"/>
+      <w:r>
+        <w:rPr>
+          <w:sz w:val="24"/>
+          <w:szCs w:val="24"/>
+          <w:lang w:val="en-US"/>
+        </w:rPr>
+        <w:t xml:space="preserve"> </w:t>
+      </w:r>
+      <w:proofErr w:type="spellStart"/>
+      <w:r>
+        <w:rPr>
+          <w:sz w:val="24"/>
+          <w:szCs w:val="24"/>
+          <w:lang w:val="en-US"/>
+        </w:rPr>
+        <w:t>kalender</w:t>
+      </w:r>
+      <w:proofErr w:type="spellEnd"/>
+      <w:r>
+        <w:rPr>
+          <w:sz w:val="24"/>
+          <w:szCs w:val="24"/>
+          <w:lang w:val="en-US"/>
+        </w:rPr>
+        <w:t xml:space="preserve"> </w:t>
+      </w:r>
+      <w:proofErr w:type="spellStart"/>
+      <w:r>
+        <w:rPr>
+          <w:sz w:val="24"/>
+          <w:szCs w:val="24"/>
+          <w:lang w:val="en-US"/>
+        </w:rPr>
+        <w:t>kerja</w:t>
+      </w:r>
+      <w:proofErr w:type="spellEnd"/>
+      <w:r>
+        <w:rPr>
+          <w:sz w:val="24"/>
+          <w:szCs w:val="24"/>
+          <w:lang w:val="en-US"/>
+        </w:rPr>
+        <w:t xml:space="preserve">/grid </w:t>
+      </w:r>
+      <w:proofErr w:type="spellStart"/>
+      <w:r>
+        <w:rPr>
+          <w:sz w:val="24"/>
+          <w:szCs w:val="24"/>
+          <w:lang w:val="en-US"/>
+        </w:rPr>
+        <w:t>jadwal</w:t>
+      </w:r>
+      <w:proofErr w:type="spellEnd"/>
+      <w:r>
+        <w:rPr>
+          <w:sz w:val="24"/>
+          <w:szCs w:val="24"/>
+          <w:lang w:val="en-US"/>
+        </w:rPr>
+        <w:t xml:space="preserve"> </w:t>
+      </w:r>
+      <w:proofErr w:type="spellStart"/>
+      <w:r>
+        <w:rPr>
+          <w:sz w:val="24"/>
+          <w:szCs w:val="24"/>
+          <w:lang w:val="en-US"/>
+        </w:rPr>
+        <w:t>harian</w:t>
+      </w:r>
+      <w:proofErr w:type="spellEnd"/>
+      <w:r>
+        <w:rPr>
+          <w:sz w:val="24"/>
+          <w:szCs w:val="24"/>
+          <w:lang w:val="en-US"/>
+        </w:rPr>
+        <w:t xml:space="preserve"> per packaging line </w:t>
+      </w:r>
+      <w:proofErr w:type="spellStart"/>
+      <w:r>
+        <w:rPr>
+          <w:sz w:val="24"/>
+          <w:szCs w:val="24"/>
+          <w:lang w:val="en-US"/>
+        </w:rPr>
+        <w:t>dengan</w:t>
+      </w:r>
+      <w:proofErr w:type="spellEnd"/>
+      <w:r>
+        <w:rPr>
+          <w:sz w:val="24"/>
+          <w:szCs w:val="24"/>
+          <w:lang w:val="en-US"/>
+        </w:rPr>
+        <w:t xml:space="preserve"> </w:t>
+      </w:r>
+      <w:proofErr w:type="spellStart"/>
+      <w:r>
+        <w:rPr>
+          <w:sz w:val="24"/>
+          <w:szCs w:val="24"/>
+          <w:lang w:val="en-US"/>
+        </w:rPr>
+        <w:t>penanda</w:t>
+      </w:r>
+      <w:proofErr w:type="spellEnd"/>
+      <w:r>
+        <w:rPr>
+          <w:sz w:val="24"/>
+          <w:szCs w:val="24"/>
+          <w:lang w:val="en-US"/>
+        </w:rPr>
+        <w:t xml:space="preserve"> </w:t>
+      </w:r>
+      <w:proofErr w:type="spellStart"/>
+      <w:r>
+        <w:rPr>
+          <w:sz w:val="24"/>
+          <w:szCs w:val="24"/>
+          <w:lang w:val="en-US"/>
+        </w:rPr>
+        <w:t>warna</w:t>
+      </w:r>
+      <w:proofErr w:type="spellEnd"/>
+      <w:r>
+        <w:rPr>
+          <w:sz w:val="24"/>
+          <w:szCs w:val="24"/>
+          <w:lang w:val="en-US"/>
+        </w:rPr>
+        <w:t xml:space="preserve"> shift. </w:t>
+      </w:r>
+      <w:proofErr w:type="spellStart"/>
+      <w:r>
+        <w:rPr>
+          <w:sz w:val="24"/>
+          <w:szCs w:val="24"/>
+          <w:lang w:val="en-US"/>
+        </w:rPr>
+        <w:t>Dilengkapi</w:t>
+      </w:r>
+      <w:proofErr w:type="spellEnd"/>
+      <w:r>
+        <w:rPr>
+          <w:sz w:val="24"/>
+          <w:szCs w:val="24"/>
+          <w:lang w:val="en-US"/>
+        </w:rPr>
+        <w:t xml:space="preserve"> filter </w:t>
+      </w:r>
+      <w:proofErr w:type="spellStart"/>
+      <w:r>
+        <w:rPr>
+          <w:sz w:val="24"/>
+          <w:szCs w:val="24"/>
+          <w:lang w:val="en-US"/>
+        </w:rPr>
+        <w:t>tanggal</w:t>
+      </w:r>
+      <w:proofErr w:type="spellEnd"/>
+      <w:r>
+        <w:rPr>
+          <w:sz w:val="24"/>
+          <w:szCs w:val="24"/>
+          <w:lang w:val="en-US"/>
+        </w:rPr>
+        <w:t xml:space="preserve">, </w:t>
+      </w:r>
+      <w:proofErr w:type="spellStart"/>
+      <w:r>
+        <w:rPr>
+          <w:sz w:val="24"/>
+          <w:szCs w:val="24"/>
+          <w:lang w:val="en-US"/>
+        </w:rPr>
+        <w:t>lini</w:t>
+      </w:r>
+      <w:proofErr w:type="spellEnd"/>
+      <w:r>
+        <w:rPr>
+          <w:sz w:val="24"/>
+          <w:szCs w:val="24"/>
+          <w:lang w:val="en-US"/>
+        </w:rPr>
+        <w:t xml:space="preserve"> </w:t>
+      </w:r>
+      <w:proofErr w:type="spellStart"/>
+      <w:r>
+        <w:rPr>
+          <w:sz w:val="24"/>
+          <w:szCs w:val="24"/>
+          <w:lang w:val="en-US"/>
+        </w:rPr>
+        <w:t>kemasan</w:t>
+      </w:r>
+      <w:proofErr w:type="spellEnd"/>
+      <w:r>
+        <w:rPr>
+          <w:sz w:val="24"/>
+          <w:szCs w:val="24"/>
+          <w:lang w:val="en-US"/>
+        </w:rPr>
+        <w:t xml:space="preserve">, dan shift. </w:t>
+      </w:r>
+      <w:proofErr w:type="spellStart"/>
+      <w:r>
+        <w:rPr>
+          <w:sz w:val="24"/>
+          <w:szCs w:val="24"/>
+          <w:lang w:val="en-US"/>
+        </w:rPr>
+        <w:t>Tombol</w:t>
+      </w:r>
+      <w:proofErr w:type="spellEnd"/>
+      <w:r>
+        <w:rPr>
+          <w:sz w:val="24"/>
+          <w:szCs w:val="24"/>
+          <w:lang w:val="en-US"/>
+        </w:rPr>
+        <w:t xml:space="preserve"> </w:t>
+      </w:r>
+      <w:proofErr w:type="spellStart"/>
+      <w:r>
+        <w:rPr>
+          <w:sz w:val="24"/>
+          <w:szCs w:val="24"/>
+          <w:lang w:val="en-US"/>
+        </w:rPr>
+        <w:t>Tambah</w:t>
+      </w:r>
+      <w:proofErr w:type="spellEnd"/>
+      <w:r>
+        <w:rPr>
+          <w:sz w:val="24"/>
+          <w:szCs w:val="24"/>
+          <w:lang w:val="en-US"/>
+        </w:rPr>
+        <w:t xml:space="preserve"> </w:t>
+      </w:r>
+      <w:proofErr w:type="spellStart"/>
+      <w:r>
+        <w:rPr>
+          <w:sz w:val="24"/>
+          <w:szCs w:val="24"/>
+          <w:lang w:val="en-US"/>
+        </w:rPr>
+        <w:t>memunculkan</w:t>
+      </w:r>
+      <w:proofErr w:type="spellEnd"/>
+      <w:r>
+        <w:rPr>
+          <w:sz w:val="24"/>
+          <w:szCs w:val="24"/>
+          <w:lang w:val="en-US"/>
+        </w:rPr>
+        <w:t xml:space="preserve"> modal form </w:t>
+      </w:r>
+      <w:proofErr w:type="spellStart"/>
+      <w:r>
+        <w:rPr>
+          <w:sz w:val="24"/>
+          <w:szCs w:val="24"/>
+          <w:lang w:val="en-US"/>
+        </w:rPr>
+        <w:t>pemilihan</w:t>
+      </w:r>
+      <w:proofErr w:type="spellEnd"/>
+      <w:r>
+        <w:rPr>
+          <w:sz w:val="24"/>
+          <w:szCs w:val="24"/>
+          <w:lang w:val="en-US"/>
+        </w:rPr>
+        <w:t xml:space="preserve"> SPK </w:t>
+      </w:r>
+      <w:proofErr w:type="spellStart"/>
+      <w:r>
+        <w:rPr>
+          <w:sz w:val="24"/>
+          <w:szCs w:val="24"/>
+          <w:lang w:val="en-US"/>
+        </w:rPr>
+        <w:t>Kemasan</w:t>
+      </w:r>
+      <w:proofErr w:type="spellEnd"/>
+      <w:r>
+        <w:rPr>
+          <w:sz w:val="24"/>
+          <w:szCs w:val="24"/>
+          <w:lang w:val="en-US"/>
+        </w:rPr>
+        <w:t xml:space="preserve"> Ref, Line ID, Shift, dan </w:t>
+      </w:r>
+      <w:proofErr w:type="spellStart"/>
+      <w:r>
+        <w:rPr>
+          <w:sz w:val="24"/>
+          <w:szCs w:val="24"/>
+          <w:lang w:val="en-US"/>
+        </w:rPr>
+        <w:t>penetapan</w:t>
+      </w:r>
+      <w:proofErr w:type="spellEnd"/>
+      <w:r>
+        <w:rPr>
+          <w:sz w:val="24"/>
+          <w:szCs w:val="24"/>
+          <w:lang w:val="en-US"/>
+        </w:rPr>
+        <w:t xml:space="preserve"> Operator </w:t>
+      </w:r>
+      <w:proofErr w:type="gramStart"/>
+      <w:r>
+        <w:rPr>
+          <w:sz w:val="24"/>
+          <w:szCs w:val="24"/>
+          <w:lang w:val="en-US"/>
+        </w:rPr>
+        <w:t>In</w:t>
+      </w:r>
+      <w:proofErr w:type="gramEnd"/>
+      <w:r>
+        <w:rPr>
+          <w:sz w:val="24"/>
+          <w:szCs w:val="24"/>
+          <w:lang w:val="en-US"/>
+        </w:rPr>
+        <w:t xml:space="preserve"> Charge.</w:t>
+      </w:r>
+    </w:p>
+    <w:p>
+      <w:pPr>
+        <w:spacing w:line="360" w:lineRule="auto"/>
+        <w:rPr>
+          <w:sz w:val="24"/>
+          <w:szCs w:val="24"/>
+          <w:lang w:val="en-US"/>
+        </w:rPr>
+      </w:pPr>
     </w:p>
     <w:p>
       <w:pPr>
@@ -11358,6 +14468,7 @@
           <w:szCs w:val="24"/>
           <w:lang w:val="en-US"/>
         </w:rPr>
+        <w:lastRenderedPageBreak/>
         <w:t>Komponen</w:t>
       </w:r>
       <w:proofErr w:type="spellEnd"/>
@@ -12335,7 +15446,6 @@
           <w:szCs w:val="24"/>
           <w:lang w:val="en-US"/>
         </w:rPr>
-        <w:lastRenderedPageBreak/>
         <w:t xml:space="preserve">Dashboard </w:t>
       </w:r>
       <w:r>
@@ -12648,6 +15758,7 @@
           <w:szCs w:val="24"/>
           <w:lang w:val="en-US"/>
         </w:rPr>
+        <w:lastRenderedPageBreak/>
         <w:t>Fungsi</w:t>
       </w:r>
       <w:proofErr w:type="spellEnd"/>
@@ -13636,7 +16747,6 @@
           <w:szCs w:val="24"/>
           <w:lang w:val="en-US"/>
         </w:rPr>
-        <w:lastRenderedPageBreak/>
         <w:t>Komponen</w:t>
       </w:r>
       <w:proofErr w:type="spellEnd"/>
@@ -18272,7 +21382,7 @@
   <w:style w:type="paragraph" w:default="1" w:styleId="Normal">
     <w:name w:val="Normal"/>
     <w:qFormat/>
-    <w:rsid w:val="00FA0D1E"/>
+    <w:rsid w:val="003C1881"/>
     <w:rPr>
       <w:rFonts w:ascii="Times New Roman" w:eastAsia="Times New Roman" w:hAnsi="Times New Roman" w:cs="Times New Roman"/>
       <w:lang w:val="id"/>

</xml_diff>

<commit_message>
feat: add Daily Production Result COGS Report with cost breakdown (Production Planning)
</commit_message>
<xml_diff>
--- a/blueprint/DRAFT_Blueprint_ERP_ProductionPlaning_CWA.docx
+++ b/blueprint/DRAFT_Blueprint_ERP_ProductionPlaning_CWA.docx
@@ -7235,7 +7235,7 @@
           <w:szCs w:val="24"/>
           <w:lang w:val="en-US"/>
         </w:rPr>
-        <w:t>Tampilan awal berupa dashboard interaktif berisi ringkasan widget angka (card stat) indikator performa utama (KPI), modul visual pipeline status SPK, diagram grafik garis/batang trend realisasi output tonase harian &amp; per jam, grafik perbandingan tahapan produksi (Base vs CM vs Packing), serta tabel ringkas notifikasi SPK mendesak dan material yang kurang (shortage). Halaman bersifat Read-Only dan hanya menyediakan filter periode tanggal, shift, tipe adonan (Water Based/Solvent Based), dan lokasi gudang/pabrik.</w:t>
+        <w:t>Tampilan awal berupa dashboard interaktif berisi ringkasan widget angka (card stat) indikator performa utama (KPI), modul visual pipeline status SPK, diagram grafik garis/batang trend realisasi output tonase harian &amp; per jam, grafik perbandingan tahapan produksi (Base vs CM vs Packing), serta tabel ringkas notifikasi SPK mendesak dan material yang kurang (shortage). Halaman bersifat Read-Only dan hanya menyediakan filter periode tanggal, shift, tipe (Water Based/Solvent Based), dan lokasi gudang/pabrik.</w:t>
       </w:r>
     </w:p>
     <w:p>
@@ -7996,7 +7996,7 @@
           <w:szCs w:val="24"/>
           <w:lang w:val="en-US"/>
         </w:rPr>
-        <w:t>Tampilan awal berupa visualisasi Gantt Chart interaktif dan tabel grid jadwal produksi. Dilengkapi filter rentang tanggal SPK (From-To Date), tipe adonan, dan pilihan mesin. Pengguna dapat menggeser/mengatur alokasi waktu jadwal produksi secara drag-and-drop atau memunculkan modal form input plotting jadwal baru.</w:t>
+        <w:t>Tampilan awal berupa visualisasi Gantt Chart interaktif dan tabel grid jadwal produksi. Dilengkapi filter rentang tanggal SPK (From-To Date), tipe, dan pilihan mesin. Pengguna dapat menggeser/mengatur alokasi waktu jadwal produksi secara drag-and-drop atau memunculkan modal form input plotting jadwal baru.</w:t>
       </w:r>
     </w:p>
     <w:p>
@@ -9469,6 +9469,14 @@
         </w:rPr>
         <w:t xml:space="preserve"> </w:t>
       </w:r>
+      <w:r>
+        <w:rPr>
+          <w:sz w:val="24"/>
+          <w:szCs w:val="24"/>
+          <w:lang w:val="en-US"/>
+        </w:rPr>
+        <w:t>Date, Production, Paid, Payment_Date, Status, Machine, Commission, Qty, Amount, Total, Notes</w:t>
+      </w:r>
     </w:p>
     <w:p>
       <w:pPr>
@@ -9504,6 +9512,14 @@
         </w:rPr>
         <w:t xml:space="preserve"> </w:t>
       </w:r>
+      <w:r>
+        <w:rPr>
+          <w:sz w:val="24"/>
+          <w:szCs w:val="24"/>
+          <w:lang w:val="en-US"/>
+        </w:rPr>
+        <w:t>Memantau kalkulasi rincian komisi operator/karyawan produksi berdasarkan aktivitas mesin dan jumlah hasil produksi, serta mengelola proses pencairan/pembayaran komisi terintegrasi.</w:t>
+      </w:r>
     </w:p>
     <w:p>
       <w:pPr>
@@ -9511,9 +9527,6 @@
           <w:ilvl w:val="2"/>
           <w:numId w:val="26"/>
         </w:numPr>
-        <w:tabs>
-          <w:tab w:val="num" w:pos="2160"/>
-        </w:tabs>
         <w:spacing w:line="360" w:lineRule="auto"/>
         <w:rPr>
           <w:sz w:val="24"/>
@@ -9531,17 +9544,230 @@
         </w:rPr>
         <w:t>Penjelasan UI:</w:t>
       </w:r>
+      <w:r>
+        <w:t xml:space="preserve"> </w:t>
+      </w:r>
+      <w:r>
+        <w:rPr>
+          <w:sz w:val="24"/>
+          <w:szCs w:val="24"/>
+          <w:lang w:val="en-US"/>
+        </w:rPr>
+        <w:t>Tampilan awal terdiri dari bagian Filter Atas dan 2 Tab Navigasi Utama:</w:t>
+      </w:r>
     </w:p>
     <w:p>
       <w:pPr>
         <w:spacing w:line="360" w:lineRule="auto"/>
-        <w:ind w:left="1440"/>
-        <w:rPr>
-          <w:sz w:val="24"/>
-          <w:szCs w:val="24"/>
-          <w:lang w:val="en-US"/>
-        </w:rPr>
-      </w:pPr>
+        <w:ind w:left="1728"/>
+        <w:rPr>
+          <w:sz w:val="24"/>
+          <w:szCs w:val="24"/>
+          <w:lang w:val="en-US"/>
+        </w:rPr>
+      </w:pPr>
+      <w:r>
+        <w:rPr>
+          <w:sz w:val="24"/>
+          <w:szCs w:val="24"/>
+          <w:lang w:val="en-US"/>
+        </w:rPr>
+        <w:t xml:space="preserve">      1. Filter Atas : Dropdown/Lookup Employee (Select Employee), DatePicker (From - To), tombol Refresh, dan checkbox Show COMPLETE only.</w:t>
+      </w:r>
+    </w:p>
+    <w:p>
+      <w:pPr>
+        <w:spacing w:line="360" w:lineRule="auto"/>
+        <w:ind w:left="1728"/>
+        <w:rPr>
+          <w:sz w:val="24"/>
+          <w:szCs w:val="24"/>
+          <w:lang w:val="en-US"/>
+        </w:rPr>
+      </w:pPr>
+      <w:r>
+        <w:rPr>
+          <w:sz w:val="24"/>
+          <w:szCs w:val="24"/>
+          <w:lang w:val="en-US"/>
+        </w:rPr>
+        <w:t xml:space="preserve">      2. Tab Navigasi :</w:t>
+      </w:r>
+    </w:p>
+    <w:p>
+      <w:pPr>
+        <w:spacing w:line="360" w:lineRule="auto"/>
+        <w:ind w:left="1728"/>
+        <w:rPr>
+          <w:sz w:val="24"/>
+          <w:szCs w:val="24"/>
+          <w:lang w:val="en-US"/>
+        </w:rPr>
+      </w:pPr>
+      <w:r>
+        <w:rPr>
+          <w:sz w:val="24"/>
+          <w:szCs w:val="24"/>
+          <w:lang w:val="en-US"/>
+        </w:rPr>
+        <w:t xml:space="preserve">      *</w:t>
+      </w:r>
+      <w:r>
+        <w:rPr>
+          <w:sz w:val="24"/>
+          <w:szCs w:val="24"/>
+          <w:lang w:val="en-US"/>
+        </w:rPr>
+        <w:t>*</w:t>
+      </w:r>
+      <w:r>
+        <w:rPr>
+          <w:sz w:val="24"/>
+          <w:szCs w:val="24"/>
+          <w:lang w:val="en-US"/>
+        </w:rPr>
+        <w:t xml:space="preserve"> Tab Commission : Menampilkan tabel daftar komisi dengan kolom Date, Production, Paid, Payment Date, Status, Machine, Commission, Qty, Amount, Total, Notes, tombol Print, serta tombol [ Pay Selected ] di sudut bawah untuk mencairkan komisi karyawan yang dipilih.</w:t>
+      </w:r>
+    </w:p>
+    <w:p>
+      <w:pPr>
+        <w:spacing w:line="360" w:lineRule="auto"/>
+        <w:ind w:left="1728"/>
+        <w:rPr>
+          <w:sz w:val="24"/>
+          <w:szCs w:val="24"/>
+          <w:lang w:val="en-US"/>
+        </w:rPr>
+      </w:pPr>
+      <w:r>
+        <w:rPr>
+          <w:sz w:val="24"/>
+          <w:szCs w:val="24"/>
+          <w:lang w:val="en-US"/>
+        </w:rPr>
+        <w:t xml:space="preserve">      *</w:t>
+      </w:r>
+      <w:r>
+        <w:rPr>
+          <w:sz w:val="24"/>
+          <w:szCs w:val="24"/>
+          <w:lang w:val="en-US"/>
+        </w:rPr>
+        <w:t>*</w:t>
+      </w:r>
+      <w:r>
+        <w:rPr>
+          <w:sz w:val="24"/>
+          <w:szCs w:val="24"/>
+          <w:lang w:val="en-US"/>
+        </w:rPr>
+        <w:t xml:space="preserve"> Tab Payment : Menampilkan tombol Print Payment Doc., tabel riwayat pembayaran komisi (Id, Date, Account, Total, Notes) pada atas, serta tabel Payment Detail (Production Id, Commission, Qty, Amount, Total, Total_Detail) pada bawah.</w:t>
+      </w:r>
+    </w:p>
+    <w:p>
+      <w:pPr>
+        <w:spacing w:line="360" w:lineRule="auto"/>
+        <w:ind w:left="1728"/>
+        <w:rPr>
+          <w:sz w:val="24"/>
+          <w:szCs w:val="24"/>
+          <w:lang w:val="en-US"/>
+        </w:rPr>
+      </w:pPr>
+      <w:r>
+        <w:rPr>
+          <w:sz w:val="24"/>
+          <w:szCs w:val="24"/>
+          <w:lang w:val="en-US"/>
+        </w:rPr>
+        <w:lastRenderedPageBreak/>
+        <w:drawing>
+          <wp:inline distT="0" distB="0" distL="0" distR="0" wp14:anchorId="141470A6" wp14:editId="192B707B">
+            <wp:extent cx="5163820" cy="2317998"/>
+            <wp:effectExtent l="0" t="0" r="0" b="6350"/>
+            <wp:docPr id="685812331" name="Picture 1"/>
+            <wp:cNvGraphicFramePr>
+              <a:graphicFrameLocks xmlns:a="http://schemas.openxmlformats.org/drawingml/2006/main" noChangeAspect="1"/>
+            </wp:cNvGraphicFramePr>
+            <a:graphic xmlns:a="http://schemas.openxmlformats.org/drawingml/2006/main">
+              <a:graphicData uri="http://schemas.openxmlformats.org/drawingml/2006/picture">
+                <pic:pic xmlns:pic="http://schemas.openxmlformats.org/drawingml/2006/picture">
+                  <pic:nvPicPr>
+                    <pic:cNvPr id="685812331" name=""/>
+                    <pic:cNvPicPr/>
+                  </pic:nvPicPr>
+                  <pic:blipFill>
+                    <a:blip r:embed="rId26"/>
+                    <a:stretch>
+                      <a:fillRect/>
+                    </a:stretch>
+                  </pic:blipFill>
+                  <pic:spPr>
+                    <a:xfrm>
+                      <a:off x="0" y="0"/>
+                      <a:ext cx="5178322" cy="2324508"/>
+                    </a:xfrm>
+                    <a:prstGeom prst="rect">
+                      <a:avLst/>
+                    </a:prstGeom>
+                  </pic:spPr>
+                </pic:pic>
+              </a:graphicData>
+            </a:graphic>
+          </wp:inline>
+        </w:drawing>
+      </w:r>
+    </w:p>
+    <w:p>
+      <w:pPr>
+        <w:spacing w:line="360" w:lineRule="auto"/>
+        <w:ind w:left="1728"/>
+        <w:rPr>
+          <w:sz w:val="24"/>
+          <w:szCs w:val="24"/>
+          <w:lang w:val="en-US"/>
+        </w:rPr>
+      </w:pPr>
+      <w:r>
+        <w:rPr>
+          <w:noProof/>
+        </w:rPr>
+        <w:drawing>
+          <wp:inline distT="0" distB="0" distL="0" distR="0" wp14:anchorId="57644C96" wp14:editId="605BB8A9">
+            <wp:extent cx="5163820" cy="2354447"/>
+            <wp:effectExtent l="0" t="0" r="0" b="8255"/>
+            <wp:docPr id="1223494157" name="Picture 1"/>
+            <wp:cNvGraphicFramePr>
+              <a:graphicFrameLocks xmlns:a="http://schemas.openxmlformats.org/drawingml/2006/main" noChangeAspect="1"/>
+            </wp:cNvGraphicFramePr>
+            <a:graphic xmlns:a="http://schemas.openxmlformats.org/drawingml/2006/main">
+              <a:graphicData uri="http://schemas.openxmlformats.org/drawingml/2006/picture">
+                <pic:pic xmlns:pic="http://schemas.openxmlformats.org/drawingml/2006/picture">
+                  <pic:nvPicPr>
+                    <pic:cNvPr id="1223494157" name=""/>
+                    <pic:cNvPicPr/>
+                  </pic:nvPicPr>
+                  <pic:blipFill>
+                    <a:blip r:embed="rId27"/>
+                    <a:stretch>
+                      <a:fillRect/>
+                    </a:stretch>
+                  </pic:blipFill>
+                  <pic:spPr>
+                    <a:xfrm>
+                      <a:off x="0" y="0"/>
+                      <a:ext cx="5172022" cy="2358187"/>
+                    </a:xfrm>
+                    <a:prstGeom prst="rect">
+                      <a:avLst/>
+                    </a:prstGeom>
+                  </pic:spPr>
+                </pic:pic>
+              </a:graphicData>
+            </a:graphic>
+          </wp:inline>
+        </w:drawing>
+      </w:r>
     </w:p>
     <w:p>
       <w:pPr>
@@ -9584,25 +9810,15 @@
           <w:szCs w:val="24"/>
           <w:lang w:val="en-US"/>
         </w:rPr>
-        <w:t xml:space="preserve">Dashboard </w:t>
-      </w:r>
-      <w:r>
-        <w:rPr>
-          <w:b/>
-          <w:bCs/>
-          <w:sz w:val="24"/>
-          <w:szCs w:val="24"/>
-          <w:lang w:val="en-US"/>
-        </w:rPr>
-        <w:t>Production Planing</w:t>
-      </w:r>
-      <w:r>
-        <w:rPr>
-          <w:sz w:val="24"/>
-          <w:szCs w:val="24"/>
-          <w:lang w:val="en-US"/>
-        </w:rPr>
-        <w:t xml:space="preserve"> `material-dashboard`</w:t>
+        <w:t xml:space="preserve">Daily Production Report </w:t>
+      </w:r>
+      <w:r>
+        <w:rPr>
+          <w:sz w:val="24"/>
+          <w:szCs w:val="24"/>
+          <w:lang w:val="en-US"/>
+        </w:rPr>
+        <w:t>`daily-production-report`</w:t>
       </w:r>
     </w:p>
     <w:p>
@@ -9639,6 +9855,14 @@
         </w:rPr>
         <w:t xml:space="preserve"> </w:t>
       </w:r>
+      <w:r>
+        <w:rPr>
+          <w:sz w:val="24"/>
+          <w:szCs w:val="24"/>
+          <w:lang w:val="en-US"/>
+        </w:rPr>
+        <w:t>Production_Id, Product_Name, Batch_No, Qty_Planned_Kg, Qty_Actual_Kg, Efficiency_Percent, Machine_ID, Status, Notes</w:t>
+      </w:r>
     </w:p>
     <w:p>
       <w:pPr>
@@ -9674,6 +9898,14 @@
         </w:rPr>
         <w:t xml:space="preserve"> </w:t>
       </w:r>
+      <w:r>
+        <w:rPr>
+          <w:sz w:val="24"/>
+          <w:szCs w:val="24"/>
+          <w:lang w:val="en-US"/>
+        </w:rPr>
+        <w:t>Menyajikan laporan harian rekapitulasi seluruh aktivitas produksi dan pencapaian efisiensi output produksi.</w:t>
+      </w:r>
     </w:p>
     <w:p>
       <w:pPr>
@@ -9701,6 +9933,1517 @@
         </w:rPr>
         <w:t>Penjelasan UI:</w:t>
       </w:r>
+      <w:r>
+        <w:t xml:space="preserve"> </w:t>
+      </w:r>
+      <w:r>
+        <w:rPr>
+          <w:sz w:val="24"/>
+          <w:szCs w:val="24"/>
+          <w:lang w:val="en-US"/>
+        </w:rPr>
+        <w:t>Tampilan berupa table analitik Read-Only dilengkapi Summary Card (Total Batch Diproduksi, Total Tonase, Rata-rata Efisiensi) di bagian atas, serta filter tanggal produksi, mesin, dan tipe produk.</w:t>
+      </w:r>
+    </w:p>
+    <w:p>
+      <w:pPr>
+        <w:tabs>
+          <w:tab w:val="num" w:pos="2160"/>
+        </w:tabs>
+        <w:spacing w:line="360" w:lineRule="auto"/>
+        <w:ind w:left="1728"/>
+        <w:rPr>
+          <w:sz w:val="24"/>
+          <w:szCs w:val="24"/>
+          <w:lang w:val="en-US"/>
+        </w:rPr>
+      </w:pPr>
+      <w:r>
+        <w:rPr>
+          <w:sz w:val="24"/>
+          <w:szCs w:val="24"/>
+          <w:lang w:val="en-US"/>
+        </w:rPr>
+        <w:lastRenderedPageBreak/>
+        <w:drawing>
+          <wp:inline distT="0" distB="0" distL="0" distR="0" wp14:anchorId="4398DECD" wp14:editId="5E7AF73E">
+            <wp:extent cx="5420995" cy="2491081"/>
+            <wp:effectExtent l="0" t="0" r="0" b="5080"/>
+            <wp:docPr id="1182387702" name="Picture 1"/>
+            <wp:cNvGraphicFramePr>
+              <a:graphicFrameLocks xmlns:a="http://schemas.openxmlformats.org/drawingml/2006/main" noChangeAspect="1"/>
+            </wp:cNvGraphicFramePr>
+            <a:graphic xmlns:a="http://schemas.openxmlformats.org/drawingml/2006/main">
+              <a:graphicData uri="http://schemas.openxmlformats.org/drawingml/2006/picture">
+                <pic:pic xmlns:pic="http://schemas.openxmlformats.org/drawingml/2006/picture">
+                  <pic:nvPicPr>
+                    <pic:cNvPr id="1182387702" name=""/>
+                    <pic:cNvPicPr/>
+                  </pic:nvPicPr>
+                  <pic:blipFill>
+                    <a:blip r:embed="rId28"/>
+                    <a:stretch>
+                      <a:fillRect/>
+                    </a:stretch>
+                  </pic:blipFill>
+                  <pic:spPr>
+                    <a:xfrm>
+                      <a:off x="0" y="0"/>
+                      <a:ext cx="5425544" cy="2493172"/>
+                    </a:xfrm>
+                    <a:prstGeom prst="rect">
+                      <a:avLst/>
+                    </a:prstGeom>
+                  </pic:spPr>
+                </pic:pic>
+              </a:graphicData>
+            </a:graphic>
+          </wp:inline>
+        </w:drawing>
+      </w:r>
+    </w:p>
+    <w:p>
+      <w:pPr>
+        <w:numPr>
+          <w:ilvl w:val="1"/>
+          <w:numId w:val="26"/>
+        </w:numPr>
+        <w:tabs>
+          <w:tab w:val="num" w:pos="1440"/>
+        </w:tabs>
+        <w:spacing w:line="360" w:lineRule="auto"/>
+        <w:rPr>
+          <w:sz w:val="24"/>
+          <w:szCs w:val="24"/>
+          <w:lang w:val="en-US"/>
+        </w:rPr>
+      </w:pPr>
+      <w:r>
+        <w:rPr>
+          <w:b/>
+          <w:bCs/>
+          <w:sz w:val="24"/>
+          <w:szCs w:val="24"/>
+          <w:lang w:val="en-US"/>
+        </w:rPr>
+        <w:t xml:space="preserve">Daily Production Base Report </w:t>
+      </w:r>
+      <w:r>
+        <w:rPr>
+          <w:sz w:val="24"/>
+          <w:szCs w:val="24"/>
+          <w:lang w:val="en-US"/>
+        </w:rPr>
+        <w:t>`daily-production-base-report`</w:t>
+      </w:r>
+    </w:p>
+    <w:p>
+      <w:pPr>
+        <w:numPr>
+          <w:ilvl w:val="2"/>
+          <w:numId w:val="26"/>
+        </w:numPr>
+        <w:tabs>
+          <w:tab w:val="num" w:pos="2160"/>
+        </w:tabs>
+        <w:spacing w:line="360" w:lineRule="auto"/>
+        <w:rPr>
+          <w:sz w:val="24"/>
+          <w:szCs w:val="24"/>
+          <w:lang w:val="en-US"/>
+        </w:rPr>
+      </w:pPr>
+      <w:r>
+        <w:rPr>
+          <w:b/>
+          <w:bCs/>
+          <w:sz w:val="24"/>
+          <w:szCs w:val="24"/>
+          <w:lang w:val="en-US"/>
+        </w:rPr>
+        <w:t>Komponen:</w:t>
+      </w:r>
+      <w:r>
+        <w:rPr>
+          <w:sz w:val="24"/>
+          <w:szCs w:val="24"/>
+          <w:lang w:val="en-US"/>
+        </w:rPr>
+        <w:t xml:space="preserve"> </w:t>
+      </w:r>
+      <w:r>
+        <w:rPr>
+          <w:sz w:val="24"/>
+          <w:szCs w:val="24"/>
+          <w:lang w:val="en-US"/>
+        </w:rPr>
+        <w:t>Date, Production_Id, Base_Name, Batch_No, Machine_ID, Target_Base_Kg, Actual_Base_Kg, Variance_Kg, Operator, Notes</w:t>
+      </w:r>
+    </w:p>
+    <w:p>
+      <w:pPr>
+        <w:numPr>
+          <w:ilvl w:val="2"/>
+          <w:numId w:val="26"/>
+        </w:numPr>
+        <w:tabs>
+          <w:tab w:val="num" w:pos="2160"/>
+        </w:tabs>
+        <w:spacing w:line="360" w:lineRule="auto"/>
+        <w:rPr>
+          <w:sz w:val="24"/>
+          <w:szCs w:val="24"/>
+          <w:lang w:val="en-US"/>
+        </w:rPr>
+      </w:pPr>
+      <w:r>
+        <w:rPr>
+          <w:b/>
+          <w:bCs/>
+          <w:sz w:val="24"/>
+          <w:szCs w:val="24"/>
+          <w:lang w:val="en-US"/>
+        </w:rPr>
+        <w:t>Fungsi:</w:t>
+      </w:r>
+      <w:r>
+        <w:rPr>
+          <w:sz w:val="24"/>
+          <w:szCs w:val="24"/>
+          <w:lang w:val="en-US"/>
+        </w:rPr>
+        <w:t xml:space="preserve"> </w:t>
+      </w:r>
+      <w:r>
+        <w:rPr>
+          <w:sz w:val="24"/>
+          <w:szCs w:val="24"/>
+          <w:lang w:val="en-US"/>
+        </w:rPr>
+        <w:t>Laporan harian khusus pemantauan hasil pencapaian pengolahan</w:t>
+      </w:r>
+      <w:r>
+        <w:rPr>
+          <w:sz w:val="24"/>
+          <w:szCs w:val="24"/>
+          <w:lang w:val="en-US"/>
+        </w:rPr>
+        <w:t xml:space="preserve"> </w:t>
+      </w:r>
+      <w:r>
+        <w:rPr>
+          <w:sz w:val="24"/>
+          <w:szCs w:val="24"/>
+          <w:lang w:val="en-US"/>
+        </w:rPr>
+        <w:t>dasar (base) dan selisih kuantitas target.</w:t>
+      </w:r>
+    </w:p>
+    <w:p>
+      <w:pPr>
+        <w:numPr>
+          <w:ilvl w:val="2"/>
+          <w:numId w:val="26"/>
+        </w:numPr>
+        <w:tabs>
+          <w:tab w:val="num" w:pos="2160"/>
+        </w:tabs>
+        <w:spacing w:line="360" w:lineRule="auto"/>
+        <w:rPr>
+          <w:sz w:val="24"/>
+          <w:szCs w:val="24"/>
+          <w:lang w:val="en-US"/>
+        </w:rPr>
+      </w:pPr>
+      <w:r>
+        <w:rPr>
+          <w:b/>
+          <w:bCs/>
+          <w:sz w:val="24"/>
+          <w:szCs w:val="24"/>
+          <w:lang w:val="en-US"/>
+        </w:rPr>
+        <w:t>Penjelasan UI:</w:t>
+      </w:r>
+      <w:r>
+        <w:t xml:space="preserve"> </w:t>
+      </w:r>
+      <w:r>
+        <w:rPr>
+          <w:sz w:val="24"/>
+          <w:szCs w:val="24"/>
+          <w:lang w:val="en-US"/>
+        </w:rPr>
+        <w:t>Tampilan berupa table analitik Read-Only dengan indikator warna deviasi (Variance KG) serta filter tanggal produksi, mesin, dan jenis base.</w:t>
+      </w:r>
+    </w:p>
+    <w:p>
+      <w:pPr>
+        <w:spacing w:line="360" w:lineRule="auto"/>
+        <w:ind w:left="1728"/>
+        <w:rPr>
+          <w:sz w:val="24"/>
+          <w:szCs w:val="24"/>
+          <w:lang w:val="en-US"/>
+        </w:rPr>
+      </w:pPr>
+      <w:r>
+        <w:rPr>
+          <w:sz w:val="24"/>
+          <w:szCs w:val="24"/>
+          <w:lang w:val="en-US"/>
+        </w:rPr>
+        <w:drawing>
+          <wp:inline distT="0" distB="0" distL="0" distR="0" wp14:anchorId="5897371F" wp14:editId="37BE8525">
+            <wp:extent cx="5544820" cy="2511815"/>
+            <wp:effectExtent l="0" t="0" r="0" b="3175"/>
+            <wp:docPr id="980737344" name="Picture 1"/>
+            <wp:cNvGraphicFramePr>
+              <a:graphicFrameLocks xmlns:a="http://schemas.openxmlformats.org/drawingml/2006/main" noChangeAspect="1"/>
+            </wp:cNvGraphicFramePr>
+            <a:graphic xmlns:a="http://schemas.openxmlformats.org/drawingml/2006/main">
+              <a:graphicData uri="http://schemas.openxmlformats.org/drawingml/2006/picture">
+                <pic:pic xmlns:pic="http://schemas.openxmlformats.org/drawingml/2006/picture">
+                  <pic:nvPicPr>
+                    <pic:cNvPr id="980737344" name=""/>
+                    <pic:cNvPicPr/>
+                  </pic:nvPicPr>
+                  <pic:blipFill>
+                    <a:blip r:embed="rId29"/>
+                    <a:stretch>
+                      <a:fillRect/>
+                    </a:stretch>
+                  </pic:blipFill>
+                  <pic:spPr>
+                    <a:xfrm>
+                      <a:off x="0" y="0"/>
+                      <a:ext cx="5549728" cy="2514038"/>
+                    </a:xfrm>
+                    <a:prstGeom prst="rect">
+                      <a:avLst/>
+                    </a:prstGeom>
+                  </pic:spPr>
+                </pic:pic>
+              </a:graphicData>
+            </a:graphic>
+          </wp:inline>
+        </w:drawing>
+      </w:r>
+    </w:p>
+    <w:p>
+      <w:pPr>
+        <w:numPr>
+          <w:ilvl w:val="1"/>
+          <w:numId w:val="26"/>
+        </w:numPr>
+        <w:tabs>
+          <w:tab w:val="num" w:pos="1440"/>
+        </w:tabs>
+        <w:spacing w:line="360" w:lineRule="auto"/>
+        <w:rPr>
+          <w:sz w:val="24"/>
+          <w:szCs w:val="24"/>
+          <w:lang w:val="en-US"/>
+        </w:rPr>
+      </w:pPr>
+      <w:r>
+        <w:rPr>
+          <w:b/>
+          <w:bCs/>
+          <w:sz w:val="24"/>
+          <w:szCs w:val="24"/>
+          <w:lang w:val="en-US"/>
+        </w:rPr>
+        <w:t xml:space="preserve">Daily Production Result Report </w:t>
+      </w:r>
+      <w:r>
+        <w:rPr>
+          <w:sz w:val="24"/>
+          <w:szCs w:val="24"/>
+          <w:lang w:val="en-US"/>
+        </w:rPr>
+        <w:t>`daily-production-result-report`</w:t>
+      </w:r>
+    </w:p>
+    <w:p>
+      <w:pPr>
+        <w:numPr>
+          <w:ilvl w:val="2"/>
+          <w:numId w:val="26"/>
+        </w:numPr>
+        <w:tabs>
+          <w:tab w:val="num" w:pos="2160"/>
+        </w:tabs>
+        <w:spacing w:line="360" w:lineRule="auto"/>
+        <w:rPr>
+          <w:sz w:val="24"/>
+          <w:szCs w:val="24"/>
+          <w:lang w:val="en-US"/>
+        </w:rPr>
+      </w:pPr>
+      <w:r>
+        <w:rPr>
+          <w:b/>
+          <w:bCs/>
+          <w:sz w:val="24"/>
+          <w:szCs w:val="24"/>
+          <w:lang w:val="en-US"/>
+        </w:rPr>
+        <w:t>Komponen:</w:t>
+      </w:r>
+      <w:r>
+        <w:rPr>
+          <w:sz w:val="24"/>
+          <w:szCs w:val="24"/>
+          <w:lang w:val="en-US"/>
+        </w:rPr>
+        <w:t xml:space="preserve"> </w:t>
+      </w:r>
+      <w:r>
+        <w:rPr>
+          <w:sz w:val="24"/>
+          <w:szCs w:val="24"/>
+          <w:lang w:val="en-US"/>
+        </w:rPr>
+        <w:t>Date, Production_Id, Product_Name, Batch_No, Total_Output_Pcs, Total_Output_Kg, Reject_Qty_Kg, Yield_Percent, Notes</w:t>
+      </w:r>
+    </w:p>
+    <w:p>
+      <w:pPr>
+        <w:numPr>
+          <w:ilvl w:val="2"/>
+          <w:numId w:val="26"/>
+        </w:numPr>
+        <w:tabs>
+          <w:tab w:val="num" w:pos="2160"/>
+        </w:tabs>
+        <w:spacing w:line="360" w:lineRule="auto"/>
+        <w:rPr>
+          <w:sz w:val="24"/>
+          <w:szCs w:val="24"/>
+          <w:lang w:val="en-US"/>
+        </w:rPr>
+      </w:pPr>
+      <w:r>
+        <w:rPr>
+          <w:b/>
+          <w:bCs/>
+          <w:sz w:val="24"/>
+          <w:szCs w:val="24"/>
+          <w:lang w:val="en-US"/>
+        </w:rPr>
+        <w:t>Fungsi:</w:t>
+      </w:r>
+      <w:r>
+        <w:rPr>
+          <w:sz w:val="24"/>
+          <w:szCs w:val="24"/>
+          <w:lang w:val="en-US"/>
+        </w:rPr>
+        <w:t xml:space="preserve"> </w:t>
+      </w:r>
+      <w:r>
+        <w:rPr>
+          <w:sz w:val="24"/>
+          <w:szCs w:val="24"/>
+          <w:lang w:val="en-US"/>
+        </w:rPr>
+        <w:t>Laporan rekapitulasi harian kuantitas produk jadi yang berhasil diproduksi beserta persentase perolehan (yield).</w:t>
+      </w:r>
+    </w:p>
+    <w:p>
+      <w:pPr>
+        <w:numPr>
+          <w:ilvl w:val="2"/>
+          <w:numId w:val="26"/>
+        </w:numPr>
+        <w:tabs>
+          <w:tab w:val="num" w:pos="2160"/>
+        </w:tabs>
+        <w:spacing w:line="360" w:lineRule="auto"/>
+        <w:rPr>
+          <w:sz w:val="24"/>
+          <w:szCs w:val="24"/>
+          <w:lang w:val="en-US"/>
+        </w:rPr>
+      </w:pPr>
+      <w:r>
+        <w:rPr>
+          <w:b/>
+          <w:bCs/>
+          <w:sz w:val="24"/>
+          <w:szCs w:val="24"/>
+          <w:lang w:val="en-US"/>
+        </w:rPr>
+        <w:t>Penjelasan UI:</w:t>
+      </w:r>
+      <w:r>
+        <w:t xml:space="preserve"> </w:t>
+      </w:r>
+      <w:r>
+        <w:rPr>
+          <w:sz w:val="24"/>
+          <w:szCs w:val="24"/>
+          <w:lang w:val="en-US"/>
+        </w:rPr>
+        <w:t>Tampilan berupa table Read-Only dengan ringkasan total produk jadi (Pcs/Kg) dan persentase afval/reject, dilengkapi filter tanggal dan kelompok produk.</w:t>
+      </w:r>
+    </w:p>
+    <w:p>
+      <w:pPr>
+        <w:spacing w:line="360" w:lineRule="auto"/>
+        <w:ind w:left="1728"/>
+        <w:rPr>
+          <w:sz w:val="24"/>
+          <w:szCs w:val="24"/>
+          <w:lang w:val="en-US"/>
+        </w:rPr>
+      </w:pPr>
+      <w:r>
+        <w:rPr>
+          <w:sz w:val="24"/>
+          <w:szCs w:val="24"/>
+          <w:lang w:val="en-US"/>
+        </w:rPr>
+        <w:lastRenderedPageBreak/>
+        <w:drawing>
+          <wp:inline distT="0" distB="0" distL="0" distR="0" wp14:anchorId="3153A616" wp14:editId="4FA21564">
+            <wp:extent cx="5563870" cy="2567175"/>
+            <wp:effectExtent l="0" t="0" r="0" b="5080"/>
+            <wp:docPr id="1089954531" name="Picture 1"/>
+            <wp:cNvGraphicFramePr>
+              <a:graphicFrameLocks xmlns:a="http://schemas.openxmlformats.org/drawingml/2006/main" noChangeAspect="1"/>
+            </wp:cNvGraphicFramePr>
+            <a:graphic xmlns:a="http://schemas.openxmlformats.org/drawingml/2006/main">
+              <a:graphicData uri="http://schemas.openxmlformats.org/drawingml/2006/picture">
+                <pic:pic xmlns:pic="http://schemas.openxmlformats.org/drawingml/2006/picture">
+                  <pic:nvPicPr>
+                    <pic:cNvPr id="1089954531" name=""/>
+                    <pic:cNvPicPr/>
+                  </pic:nvPicPr>
+                  <pic:blipFill>
+                    <a:blip r:embed="rId30"/>
+                    <a:stretch>
+                      <a:fillRect/>
+                    </a:stretch>
+                  </pic:blipFill>
+                  <pic:spPr>
+                    <a:xfrm>
+                      <a:off x="0" y="0"/>
+                      <a:ext cx="5575760" cy="2572661"/>
+                    </a:xfrm>
+                    <a:prstGeom prst="rect">
+                      <a:avLst/>
+                    </a:prstGeom>
+                  </pic:spPr>
+                </pic:pic>
+              </a:graphicData>
+            </a:graphic>
+          </wp:inline>
+        </w:drawing>
+      </w:r>
+    </w:p>
+    <w:p>
+      <w:pPr>
+        <w:numPr>
+          <w:ilvl w:val="1"/>
+          <w:numId w:val="26"/>
+        </w:numPr>
+        <w:tabs>
+          <w:tab w:val="num" w:pos="1440"/>
+        </w:tabs>
+        <w:spacing w:line="360" w:lineRule="auto"/>
+        <w:rPr>
+          <w:sz w:val="24"/>
+          <w:szCs w:val="24"/>
+          <w:lang w:val="en-US"/>
+        </w:rPr>
+      </w:pPr>
+      <w:r>
+        <w:rPr>
+          <w:b/>
+          <w:bCs/>
+          <w:sz w:val="24"/>
+          <w:szCs w:val="24"/>
+          <w:lang w:val="en-US"/>
+        </w:rPr>
+        <w:t xml:space="preserve">Daily Production Result Batch Report (STBJ) </w:t>
+      </w:r>
+      <w:r>
+        <w:rPr>
+          <w:sz w:val="24"/>
+          <w:szCs w:val="24"/>
+          <w:lang w:val="en-US"/>
+        </w:rPr>
+        <w:t>`daily-production-result-batch-report`</w:t>
+      </w:r>
+    </w:p>
+    <w:p>
+      <w:pPr>
+        <w:numPr>
+          <w:ilvl w:val="2"/>
+          <w:numId w:val="26"/>
+        </w:numPr>
+        <w:tabs>
+          <w:tab w:val="num" w:pos="2160"/>
+        </w:tabs>
+        <w:spacing w:line="360" w:lineRule="auto"/>
+        <w:rPr>
+          <w:sz w:val="24"/>
+          <w:szCs w:val="24"/>
+          <w:lang w:val="en-US"/>
+        </w:rPr>
+      </w:pPr>
+      <w:r>
+        <w:rPr>
+          <w:b/>
+          <w:bCs/>
+          <w:sz w:val="24"/>
+          <w:szCs w:val="24"/>
+          <w:lang w:val="en-US"/>
+        </w:rPr>
+        <w:t>Komponen:</w:t>
+      </w:r>
+      <w:r>
+        <w:rPr>
+          <w:sz w:val="24"/>
+          <w:szCs w:val="24"/>
+          <w:lang w:val="en-US"/>
+        </w:rPr>
+        <w:t xml:space="preserve"> </w:t>
+      </w:r>
+      <w:r>
+        <w:rPr>
+          <w:sz w:val="24"/>
+          <w:szCs w:val="24"/>
+          <w:lang w:val="en-US"/>
+        </w:rPr>
+        <w:t>Date, STBJ_No, Production_Id, Batch_No, Warehouse_Target, Total_Qty_Received_Pcs, Total_Weight_Kg, User_ID, Status</w:t>
+      </w:r>
+    </w:p>
+    <w:p>
+      <w:pPr>
+        <w:numPr>
+          <w:ilvl w:val="2"/>
+          <w:numId w:val="26"/>
+        </w:numPr>
+        <w:tabs>
+          <w:tab w:val="num" w:pos="2160"/>
+        </w:tabs>
+        <w:spacing w:line="360" w:lineRule="auto"/>
+        <w:rPr>
+          <w:sz w:val="24"/>
+          <w:szCs w:val="24"/>
+          <w:lang w:val="en-US"/>
+        </w:rPr>
+      </w:pPr>
+      <w:r>
+        <w:rPr>
+          <w:b/>
+          <w:bCs/>
+          <w:sz w:val="24"/>
+          <w:szCs w:val="24"/>
+          <w:lang w:val="en-US"/>
+        </w:rPr>
+        <w:t>Fungsi:</w:t>
+      </w:r>
+      <w:r>
+        <w:rPr>
+          <w:sz w:val="24"/>
+          <w:szCs w:val="24"/>
+          <w:lang w:val="en-US"/>
+        </w:rPr>
+        <w:t xml:space="preserve"> </w:t>
+      </w:r>
+      <w:r>
+        <w:rPr>
+          <w:sz w:val="24"/>
+          <w:szCs w:val="24"/>
+          <w:lang w:val="en-US"/>
+        </w:rPr>
+        <w:t>Laporan penyerahan dan penerimaan harian hasil produksi ke gudang berbasis dokumen STBJ.</w:t>
+      </w:r>
+    </w:p>
+    <w:p>
+      <w:pPr>
+        <w:numPr>
+          <w:ilvl w:val="2"/>
+          <w:numId w:val="26"/>
+        </w:numPr>
+        <w:tabs>
+          <w:tab w:val="num" w:pos="2160"/>
+        </w:tabs>
+        <w:spacing w:line="360" w:lineRule="auto"/>
+        <w:rPr>
+          <w:sz w:val="24"/>
+          <w:szCs w:val="24"/>
+          <w:lang w:val="en-US"/>
+        </w:rPr>
+      </w:pPr>
+      <w:r>
+        <w:rPr>
+          <w:b/>
+          <w:bCs/>
+          <w:sz w:val="24"/>
+          <w:szCs w:val="24"/>
+          <w:lang w:val="en-US"/>
+        </w:rPr>
+        <w:t>Penjelasan UI:</w:t>
+      </w:r>
+      <w:r>
+        <w:t xml:space="preserve"> </w:t>
+      </w:r>
+      <w:r>
+        <w:rPr>
+          <w:sz w:val="24"/>
+          <w:szCs w:val="24"/>
+          <w:lang w:val="en-US"/>
+        </w:rPr>
+        <w:t>Tampilan berupa table verifikasi penerimaan barang fisik di gudang dengan filter tanggal STBJ, nomor batch, dan gudang tujuan.</w:t>
+      </w:r>
+    </w:p>
+    <w:p>
+      <w:pPr>
+        <w:spacing w:line="360" w:lineRule="auto"/>
+        <w:ind w:left="1728"/>
+        <w:rPr>
+          <w:sz w:val="24"/>
+          <w:szCs w:val="24"/>
+          <w:lang w:val="en-US"/>
+        </w:rPr>
+      </w:pPr>
+      <w:r>
+        <w:rPr>
+          <w:sz w:val="24"/>
+          <w:szCs w:val="24"/>
+          <w:lang w:val="en-US"/>
+        </w:rPr>
+        <w:drawing>
+          <wp:inline distT="0" distB="0" distL="0" distR="0" wp14:anchorId="544F2C0B" wp14:editId="36B491E2">
+            <wp:extent cx="5573395" cy="2506335"/>
+            <wp:effectExtent l="0" t="0" r="0" b="8890"/>
+            <wp:docPr id="427847117" name="Picture 1"/>
+            <wp:cNvGraphicFramePr>
+              <a:graphicFrameLocks xmlns:a="http://schemas.openxmlformats.org/drawingml/2006/main" noChangeAspect="1"/>
+            </wp:cNvGraphicFramePr>
+            <a:graphic xmlns:a="http://schemas.openxmlformats.org/drawingml/2006/main">
+              <a:graphicData uri="http://schemas.openxmlformats.org/drawingml/2006/picture">
+                <pic:pic xmlns:pic="http://schemas.openxmlformats.org/drawingml/2006/picture">
+                  <pic:nvPicPr>
+                    <pic:cNvPr id="427847117" name=""/>
+                    <pic:cNvPicPr/>
+                  </pic:nvPicPr>
+                  <pic:blipFill>
+                    <a:blip r:embed="rId31"/>
+                    <a:stretch>
+                      <a:fillRect/>
+                    </a:stretch>
+                  </pic:blipFill>
+                  <pic:spPr>
+                    <a:xfrm>
+                      <a:off x="0" y="0"/>
+                      <a:ext cx="5582661" cy="2510502"/>
+                    </a:xfrm>
+                    <a:prstGeom prst="rect">
+                      <a:avLst/>
+                    </a:prstGeom>
+                  </pic:spPr>
+                </pic:pic>
+              </a:graphicData>
+            </a:graphic>
+          </wp:inline>
+        </w:drawing>
+      </w:r>
+    </w:p>
+    <w:p>
+      <w:pPr>
+        <w:numPr>
+          <w:ilvl w:val="1"/>
+          <w:numId w:val="26"/>
+        </w:numPr>
+        <w:tabs>
+          <w:tab w:val="num" w:pos="1440"/>
+        </w:tabs>
+        <w:spacing w:line="360" w:lineRule="auto"/>
+        <w:rPr>
+          <w:sz w:val="24"/>
+          <w:szCs w:val="24"/>
+          <w:lang w:val="en-US"/>
+        </w:rPr>
+      </w:pPr>
+      <w:r>
+        <w:rPr>
+          <w:b/>
+          <w:bCs/>
+          <w:sz w:val="24"/>
+          <w:szCs w:val="24"/>
+          <w:lang w:val="en-US"/>
+        </w:rPr>
+        <w:t xml:space="preserve">Daily Production Commission </w:t>
+      </w:r>
+      <w:r>
+        <w:rPr>
+          <w:sz w:val="24"/>
+          <w:szCs w:val="24"/>
+          <w:lang w:val="en-US"/>
+        </w:rPr>
+        <w:t>`daily-production-commission`</w:t>
+      </w:r>
+    </w:p>
+    <w:p>
+      <w:pPr>
+        <w:numPr>
+          <w:ilvl w:val="2"/>
+          <w:numId w:val="26"/>
+        </w:numPr>
+        <w:tabs>
+          <w:tab w:val="num" w:pos="2160"/>
+        </w:tabs>
+        <w:spacing w:line="360" w:lineRule="auto"/>
+        <w:rPr>
+          <w:sz w:val="24"/>
+          <w:szCs w:val="24"/>
+          <w:lang w:val="en-US"/>
+        </w:rPr>
+      </w:pPr>
+      <w:r>
+        <w:rPr>
+          <w:b/>
+          <w:bCs/>
+          <w:sz w:val="24"/>
+          <w:szCs w:val="24"/>
+          <w:lang w:val="en-US"/>
+        </w:rPr>
+        <w:t>Komponen:</w:t>
+      </w:r>
+      <w:r>
+        <w:rPr>
+          <w:sz w:val="24"/>
+          <w:szCs w:val="24"/>
+          <w:lang w:val="en-US"/>
+        </w:rPr>
+        <w:t xml:space="preserve"> </w:t>
+      </w:r>
+      <w:r>
+        <w:rPr>
+          <w:sz w:val="24"/>
+          <w:szCs w:val="24"/>
+          <w:lang w:val="en-US"/>
+        </w:rPr>
+        <w:t>Date, Production_Id, Material_ID, Material_Name, Qty_Used, UOM, Unit_Cost, Total_Material_Cost, Batch_No</w:t>
+      </w:r>
+    </w:p>
+    <w:p>
+      <w:pPr>
+        <w:numPr>
+          <w:ilvl w:val="2"/>
+          <w:numId w:val="26"/>
+        </w:numPr>
+        <w:tabs>
+          <w:tab w:val="num" w:pos="2160"/>
+        </w:tabs>
+        <w:spacing w:line="360" w:lineRule="auto"/>
+        <w:rPr>
+          <w:sz w:val="24"/>
+          <w:szCs w:val="24"/>
+          <w:lang w:val="en-US"/>
+        </w:rPr>
+      </w:pPr>
+      <w:r>
+        <w:rPr>
+          <w:b/>
+          <w:bCs/>
+          <w:sz w:val="24"/>
+          <w:szCs w:val="24"/>
+          <w:lang w:val="en-US"/>
+        </w:rPr>
+        <w:t>Fungsi:</w:t>
+      </w:r>
+      <w:r>
+        <w:rPr>
+          <w:sz w:val="24"/>
+          <w:szCs w:val="24"/>
+          <w:lang w:val="en-US"/>
+        </w:rPr>
+        <w:t xml:space="preserve"> </w:t>
+      </w:r>
+      <w:r>
+        <w:rPr>
+          <w:sz w:val="24"/>
+          <w:szCs w:val="24"/>
+          <w:lang w:val="en-US"/>
+        </w:rPr>
+        <w:t>Laporan harian pemakaian bahan baku/penolong beserta total nilai biaya bahan pada setiap batch produksi.</w:t>
+      </w:r>
+    </w:p>
+    <w:p>
+      <w:pPr>
+        <w:numPr>
+          <w:ilvl w:val="2"/>
+          <w:numId w:val="26"/>
+        </w:numPr>
+        <w:tabs>
+          <w:tab w:val="num" w:pos="2160"/>
+        </w:tabs>
+        <w:spacing w:line="360" w:lineRule="auto"/>
+        <w:rPr>
+          <w:sz w:val="24"/>
+          <w:szCs w:val="24"/>
+          <w:lang w:val="en-US"/>
+        </w:rPr>
+      </w:pPr>
+      <w:r>
+        <w:rPr>
+          <w:b/>
+          <w:bCs/>
+          <w:sz w:val="24"/>
+          <w:szCs w:val="24"/>
+          <w:lang w:val="en-US"/>
+        </w:rPr>
+        <w:t>Penjelasan UI:</w:t>
+      </w:r>
+      <w:r>
+        <w:t xml:space="preserve"> </w:t>
+      </w:r>
+      <w:r>
+        <w:rPr>
+          <w:sz w:val="24"/>
+          <w:szCs w:val="24"/>
+          <w:lang w:val="en-US"/>
+        </w:rPr>
+        <w:t>Tampilan berupa table breakdown biaya bahan baku per nomor batch, dilengkapi filter tanggal, material ID, dan fitur ekspor data.</w:t>
+      </w:r>
+    </w:p>
+    <w:p>
+      <w:pPr>
+        <w:spacing w:line="360" w:lineRule="auto"/>
+        <w:ind w:left="1728"/>
+        <w:rPr>
+          <w:sz w:val="24"/>
+          <w:szCs w:val="24"/>
+          <w:lang w:val="en-US"/>
+        </w:rPr>
+      </w:pPr>
+      <w:r>
+        <w:rPr>
+          <w:sz w:val="24"/>
+          <w:szCs w:val="24"/>
+          <w:lang w:val="en-US"/>
+        </w:rPr>
+        <w:lastRenderedPageBreak/>
+        <w:drawing>
+          <wp:inline distT="0" distB="0" distL="0" distR="0" wp14:anchorId="0B5E3126" wp14:editId="45C251CD">
+            <wp:extent cx="5640070" cy="2563027"/>
+            <wp:effectExtent l="0" t="0" r="0" b="8890"/>
+            <wp:docPr id="1410400848" name="Picture 1"/>
+            <wp:cNvGraphicFramePr>
+              <a:graphicFrameLocks xmlns:a="http://schemas.openxmlformats.org/drawingml/2006/main" noChangeAspect="1"/>
+            </wp:cNvGraphicFramePr>
+            <a:graphic xmlns:a="http://schemas.openxmlformats.org/drawingml/2006/main">
+              <a:graphicData uri="http://schemas.openxmlformats.org/drawingml/2006/picture">
+                <pic:pic xmlns:pic="http://schemas.openxmlformats.org/drawingml/2006/picture">
+                  <pic:nvPicPr>
+                    <pic:cNvPr id="1410400848" name=""/>
+                    <pic:cNvPicPr/>
+                  </pic:nvPicPr>
+                  <pic:blipFill>
+                    <a:blip r:embed="rId32"/>
+                    <a:stretch>
+                      <a:fillRect/>
+                    </a:stretch>
+                  </pic:blipFill>
+                  <pic:spPr>
+                    <a:xfrm>
+                      <a:off x="0" y="0"/>
+                      <a:ext cx="5654106" cy="2569405"/>
+                    </a:xfrm>
+                    <a:prstGeom prst="rect">
+                      <a:avLst/>
+                    </a:prstGeom>
+                  </pic:spPr>
+                </pic:pic>
+              </a:graphicData>
+            </a:graphic>
+          </wp:inline>
+        </w:drawing>
+      </w:r>
+    </w:p>
+    <w:p>
+      <w:pPr>
+        <w:numPr>
+          <w:ilvl w:val="1"/>
+          <w:numId w:val="26"/>
+        </w:numPr>
+        <w:tabs>
+          <w:tab w:val="num" w:pos="1440"/>
+        </w:tabs>
+        <w:spacing w:line="360" w:lineRule="auto"/>
+        <w:rPr>
+          <w:sz w:val="24"/>
+          <w:szCs w:val="24"/>
+          <w:lang w:val="en-US"/>
+        </w:rPr>
+      </w:pPr>
+      <w:r>
+        <w:rPr>
+          <w:b/>
+          <w:bCs/>
+          <w:sz w:val="24"/>
+          <w:szCs w:val="24"/>
+          <w:lang w:val="en-US"/>
+        </w:rPr>
+        <w:t xml:space="preserve">Daily Production Material Cost Report </w:t>
+      </w:r>
+      <w:r>
+        <w:rPr>
+          <w:sz w:val="24"/>
+          <w:szCs w:val="24"/>
+          <w:lang w:val="en-US"/>
+        </w:rPr>
+        <w:t>`daily-production-material-cost-report`</w:t>
+      </w:r>
+    </w:p>
+    <w:p>
+      <w:pPr>
+        <w:numPr>
+          <w:ilvl w:val="2"/>
+          <w:numId w:val="26"/>
+        </w:numPr>
+        <w:tabs>
+          <w:tab w:val="num" w:pos="2160"/>
+        </w:tabs>
+        <w:spacing w:line="360" w:lineRule="auto"/>
+        <w:rPr>
+          <w:sz w:val="24"/>
+          <w:szCs w:val="24"/>
+          <w:lang w:val="en-US"/>
+        </w:rPr>
+      </w:pPr>
+      <w:r>
+        <w:rPr>
+          <w:b/>
+          <w:bCs/>
+          <w:sz w:val="24"/>
+          <w:szCs w:val="24"/>
+          <w:lang w:val="en-US"/>
+        </w:rPr>
+        <w:t>Komponen:</w:t>
+      </w:r>
+      <w:r>
+        <w:rPr>
+          <w:sz w:val="24"/>
+          <w:szCs w:val="24"/>
+          <w:lang w:val="en-US"/>
+        </w:rPr>
+        <w:t xml:space="preserve"> </w:t>
+      </w:r>
+      <w:r>
+        <w:rPr>
+          <w:sz w:val="24"/>
+          <w:szCs w:val="24"/>
+          <w:lang w:val="en-US"/>
+        </w:rPr>
+        <w:t>Date, Production_Id, Material_ID, Material_Name, Qty_Used, UOM, Unit_Cost, Total_Material_Cost, Batch_No</w:t>
+      </w:r>
+    </w:p>
+    <w:p>
+      <w:pPr>
+        <w:numPr>
+          <w:ilvl w:val="2"/>
+          <w:numId w:val="26"/>
+        </w:numPr>
+        <w:tabs>
+          <w:tab w:val="num" w:pos="2160"/>
+        </w:tabs>
+        <w:spacing w:line="360" w:lineRule="auto"/>
+        <w:rPr>
+          <w:sz w:val="24"/>
+          <w:szCs w:val="24"/>
+          <w:lang w:val="en-US"/>
+        </w:rPr>
+      </w:pPr>
+      <w:r>
+        <w:rPr>
+          <w:b/>
+          <w:bCs/>
+          <w:sz w:val="24"/>
+          <w:szCs w:val="24"/>
+          <w:lang w:val="en-US"/>
+        </w:rPr>
+        <w:t>Fungsi:</w:t>
+      </w:r>
+      <w:r>
+        <w:rPr>
+          <w:sz w:val="24"/>
+          <w:szCs w:val="24"/>
+          <w:lang w:val="en-US"/>
+        </w:rPr>
+        <w:t xml:space="preserve"> </w:t>
+      </w:r>
+      <w:r>
+        <w:rPr>
+          <w:sz w:val="24"/>
+          <w:szCs w:val="24"/>
+          <w:lang w:val="en-US"/>
+        </w:rPr>
+        <w:t>Laporan harian pemakaian bahan baku beserta total nilai biaya bahan pada setiap batch produksi.</w:t>
+      </w:r>
+    </w:p>
+    <w:p>
+      <w:pPr>
+        <w:numPr>
+          <w:ilvl w:val="2"/>
+          <w:numId w:val="26"/>
+        </w:numPr>
+        <w:tabs>
+          <w:tab w:val="num" w:pos="2160"/>
+        </w:tabs>
+        <w:spacing w:line="360" w:lineRule="auto"/>
+        <w:rPr>
+          <w:sz w:val="24"/>
+          <w:szCs w:val="24"/>
+          <w:lang w:val="en-US"/>
+        </w:rPr>
+      </w:pPr>
+      <w:r>
+        <w:rPr>
+          <w:b/>
+          <w:bCs/>
+          <w:sz w:val="24"/>
+          <w:szCs w:val="24"/>
+          <w:lang w:val="en-US"/>
+        </w:rPr>
+        <w:t>Penjelasan UI:</w:t>
+      </w:r>
+      <w:r>
+        <w:t xml:space="preserve"> </w:t>
+      </w:r>
+      <w:r>
+        <w:rPr>
+          <w:sz w:val="24"/>
+          <w:szCs w:val="24"/>
+          <w:lang w:val="en-US"/>
+        </w:rPr>
+        <w:t>Tampilan berupa table breakdown biaya bahan baku per nomor batch, dilengkapi filter tanggal, material ID, dan fitur ekspor data.</w:t>
+      </w:r>
+    </w:p>
+    <w:p>
+      <w:pPr>
+        <w:spacing w:line="360" w:lineRule="auto"/>
+        <w:ind w:left="1728"/>
+        <w:rPr>
+          <w:sz w:val="24"/>
+          <w:szCs w:val="24"/>
+          <w:lang w:val="en-US"/>
+        </w:rPr>
+      </w:pPr>
+    </w:p>
+    <w:p>
+      <w:pPr>
+        <w:numPr>
+          <w:ilvl w:val="1"/>
+          <w:numId w:val="26"/>
+        </w:numPr>
+        <w:tabs>
+          <w:tab w:val="num" w:pos="1440"/>
+        </w:tabs>
+        <w:spacing w:line="360" w:lineRule="auto"/>
+        <w:rPr>
+          <w:sz w:val="24"/>
+          <w:szCs w:val="24"/>
+          <w:lang w:val="en-US"/>
+        </w:rPr>
+      </w:pPr>
+      <w:r>
+        <w:rPr>
+          <w:b/>
+          <w:bCs/>
+          <w:sz w:val="24"/>
+          <w:szCs w:val="24"/>
+          <w:lang w:val="en-US"/>
+        </w:rPr>
+        <w:t xml:space="preserve">Daily Production Result COGS Report </w:t>
+      </w:r>
+      <w:r>
+        <w:rPr>
+          <w:sz w:val="24"/>
+          <w:szCs w:val="24"/>
+          <w:lang w:val="en-US"/>
+        </w:rPr>
+        <w:t>`daily-production-result-cogs-report`</w:t>
+      </w:r>
+    </w:p>
+    <w:p>
+      <w:pPr>
+        <w:numPr>
+          <w:ilvl w:val="2"/>
+          <w:numId w:val="26"/>
+        </w:numPr>
+        <w:tabs>
+          <w:tab w:val="num" w:pos="2160"/>
+        </w:tabs>
+        <w:spacing w:line="360" w:lineRule="auto"/>
+        <w:rPr>
+          <w:sz w:val="24"/>
+          <w:szCs w:val="24"/>
+          <w:lang w:val="en-US"/>
+        </w:rPr>
+      </w:pPr>
+      <w:r>
+        <w:rPr>
+          <w:b/>
+          <w:bCs/>
+          <w:sz w:val="24"/>
+          <w:szCs w:val="24"/>
+          <w:lang w:val="en-US"/>
+        </w:rPr>
+        <w:t>Komponen:</w:t>
+      </w:r>
+      <w:r>
+        <w:rPr>
+          <w:sz w:val="24"/>
+          <w:szCs w:val="24"/>
+          <w:lang w:val="en-US"/>
+        </w:rPr>
+        <w:t xml:space="preserve"> </w:t>
+      </w:r>
+    </w:p>
+    <w:p>
+      <w:pPr>
+        <w:numPr>
+          <w:ilvl w:val="2"/>
+          <w:numId w:val="26"/>
+        </w:numPr>
+        <w:tabs>
+          <w:tab w:val="num" w:pos="2160"/>
+        </w:tabs>
+        <w:spacing w:line="360" w:lineRule="auto"/>
+        <w:rPr>
+          <w:sz w:val="24"/>
+          <w:szCs w:val="24"/>
+          <w:lang w:val="en-US"/>
+        </w:rPr>
+      </w:pPr>
+      <w:r>
+        <w:rPr>
+          <w:b/>
+          <w:bCs/>
+          <w:sz w:val="24"/>
+          <w:szCs w:val="24"/>
+          <w:lang w:val="en-US"/>
+        </w:rPr>
+        <w:t>Fungsi:</w:t>
+      </w:r>
+      <w:r>
+        <w:rPr>
+          <w:sz w:val="24"/>
+          <w:szCs w:val="24"/>
+          <w:lang w:val="en-US"/>
+        </w:rPr>
+        <w:t xml:space="preserve"> </w:t>
+      </w:r>
+    </w:p>
+    <w:p>
+      <w:pPr>
+        <w:numPr>
+          <w:ilvl w:val="2"/>
+          <w:numId w:val="26"/>
+        </w:numPr>
+        <w:tabs>
+          <w:tab w:val="num" w:pos="2160"/>
+        </w:tabs>
+        <w:spacing w:line="360" w:lineRule="auto"/>
+        <w:rPr>
+          <w:sz w:val="24"/>
+          <w:szCs w:val="24"/>
+          <w:lang w:val="en-US"/>
+        </w:rPr>
+      </w:pPr>
+      <w:r>
+        <w:rPr>
+          <w:b/>
+          <w:bCs/>
+          <w:sz w:val="24"/>
+          <w:szCs w:val="24"/>
+          <w:lang w:val="en-US"/>
+        </w:rPr>
+        <w:t>Penjelasan UI:</w:t>
+      </w:r>
+    </w:p>
+    <w:p>
+      <w:pPr>
+        <w:numPr>
+          <w:ilvl w:val="1"/>
+          <w:numId w:val="26"/>
+        </w:numPr>
+        <w:tabs>
+          <w:tab w:val="num" w:pos="1440"/>
+        </w:tabs>
+        <w:spacing w:line="360" w:lineRule="auto"/>
+        <w:rPr>
+          <w:sz w:val="24"/>
+          <w:szCs w:val="24"/>
+          <w:lang w:val="en-US"/>
+        </w:rPr>
+      </w:pPr>
+      <w:r>
+        <w:rPr>
+          <w:b/>
+          <w:bCs/>
+          <w:sz w:val="24"/>
+          <w:szCs w:val="24"/>
+          <w:lang w:val="en-US"/>
+        </w:rPr>
+        <w:t xml:space="preserve">Daily Production Packaging Report </w:t>
+      </w:r>
+      <w:r>
+        <w:rPr>
+          <w:sz w:val="24"/>
+          <w:szCs w:val="24"/>
+          <w:lang w:val="en-US"/>
+        </w:rPr>
+        <w:t>`daily-production-packaging-report`</w:t>
+      </w:r>
+    </w:p>
+    <w:p>
+      <w:pPr>
+        <w:numPr>
+          <w:ilvl w:val="2"/>
+          <w:numId w:val="26"/>
+        </w:numPr>
+        <w:tabs>
+          <w:tab w:val="num" w:pos="2160"/>
+        </w:tabs>
+        <w:spacing w:line="360" w:lineRule="auto"/>
+        <w:rPr>
+          <w:sz w:val="24"/>
+          <w:szCs w:val="24"/>
+          <w:lang w:val="en-US"/>
+        </w:rPr>
+      </w:pPr>
+      <w:r>
+        <w:rPr>
+          <w:b/>
+          <w:bCs/>
+          <w:sz w:val="24"/>
+          <w:szCs w:val="24"/>
+          <w:lang w:val="en-US"/>
+        </w:rPr>
+        <w:t>Komponen:</w:t>
+      </w:r>
+      <w:r>
+        <w:rPr>
+          <w:sz w:val="24"/>
+          <w:szCs w:val="24"/>
+          <w:lang w:val="en-US"/>
+        </w:rPr>
+        <w:t xml:space="preserve"> </w:t>
+      </w:r>
+    </w:p>
+    <w:p>
+      <w:pPr>
+        <w:numPr>
+          <w:ilvl w:val="2"/>
+          <w:numId w:val="26"/>
+        </w:numPr>
+        <w:tabs>
+          <w:tab w:val="num" w:pos="2160"/>
+        </w:tabs>
+        <w:spacing w:line="360" w:lineRule="auto"/>
+        <w:rPr>
+          <w:sz w:val="24"/>
+          <w:szCs w:val="24"/>
+          <w:lang w:val="en-US"/>
+        </w:rPr>
+      </w:pPr>
+      <w:r>
+        <w:rPr>
+          <w:b/>
+          <w:bCs/>
+          <w:sz w:val="24"/>
+          <w:szCs w:val="24"/>
+          <w:lang w:val="en-US"/>
+        </w:rPr>
+        <w:t>Fungsi:</w:t>
+      </w:r>
+      <w:r>
+        <w:rPr>
+          <w:sz w:val="24"/>
+          <w:szCs w:val="24"/>
+          <w:lang w:val="en-US"/>
+        </w:rPr>
+        <w:t xml:space="preserve"> </w:t>
+      </w:r>
+    </w:p>
+    <w:p>
+      <w:pPr>
+        <w:numPr>
+          <w:ilvl w:val="2"/>
+          <w:numId w:val="26"/>
+        </w:numPr>
+        <w:tabs>
+          <w:tab w:val="num" w:pos="2160"/>
+        </w:tabs>
+        <w:spacing w:line="360" w:lineRule="auto"/>
+        <w:rPr>
+          <w:sz w:val="24"/>
+          <w:szCs w:val="24"/>
+          <w:lang w:val="en-US"/>
+        </w:rPr>
+      </w:pPr>
+      <w:r>
+        <w:rPr>
+          <w:b/>
+          <w:bCs/>
+          <w:sz w:val="24"/>
+          <w:szCs w:val="24"/>
+          <w:lang w:val="en-US"/>
+        </w:rPr>
+        <w:t>Penjelasan UI:</w:t>
+      </w:r>
+    </w:p>
+    <w:p>
+      <w:pPr>
+        <w:numPr>
+          <w:ilvl w:val="1"/>
+          <w:numId w:val="26"/>
+        </w:numPr>
+        <w:tabs>
+          <w:tab w:val="num" w:pos="1440"/>
+        </w:tabs>
+        <w:spacing w:line="360" w:lineRule="auto"/>
+        <w:rPr>
+          <w:sz w:val="24"/>
+          <w:szCs w:val="24"/>
+          <w:lang w:val="en-US"/>
+        </w:rPr>
+      </w:pPr>
+      <w:r>
+        <w:rPr>
+          <w:b/>
+          <w:bCs/>
+          <w:sz w:val="24"/>
+          <w:szCs w:val="24"/>
+          <w:lang w:val="en-US"/>
+        </w:rPr>
+        <w:t xml:space="preserve">Daily Production Material Cost Recap Report </w:t>
+      </w:r>
+      <w:r>
+        <w:rPr>
+          <w:sz w:val="24"/>
+          <w:szCs w:val="24"/>
+          <w:lang w:val="en-US"/>
+        </w:rPr>
+        <w:t>`daily-production-material-cost-recap-report`</w:t>
+      </w:r>
+    </w:p>
+    <w:p>
+      <w:pPr>
+        <w:numPr>
+          <w:ilvl w:val="2"/>
+          <w:numId w:val="26"/>
+        </w:numPr>
+        <w:tabs>
+          <w:tab w:val="num" w:pos="2160"/>
+        </w:tabs>
+        <w:spacing w:line="360" w:lineRule="auto"/>
+        <w:rPr>
+          <w:sz w:val="24"/>
+          <w:szCs w:val="24"/>
+          <w:lang w:val="en-US"/>
+        </w:rPr>
+      </w:pPr>
+      <w:r>
+        <w:rPr>
+          <w:b/>
+          <w:bCs/>
+          <w:sz w:val="24"/>
+          <w:szCs w:val="24"/>
+          <w:lang w:val="en-US"/>
+        </w:rPr>
+        <w:t>Komponen:</w:t>
+      </w:r>
+      <w:r>
+        <w:rPr>
+          <w:sz w:val="24"/>
+          <w:szCs w:val="24"/>
+          <w:lang w:val="en-US"/>
+        </w:rPr>
+        <w:t xml:space="preserve"> </w:t>
+      </w:r>
+    </w:p>
+    <w:p>
+      <w:pPr>
+        <w:numPr>
+          <w:ilvl w:val="2"/>
+          <w:numId w:val="26"/>
+        </w:numPr>
+        <w:tabs>
+          <w:tab w:val="num" w:pos="2160"/>
+        </w:tabs>
+        <w:spacing w:line="360" w:lineRule="auto"/>
+        <w:rPr>
+          <w:sz w:val="24"/>
+          <w:szCs w:val="24"/>
+          <w:lang w:val="en-US"/>
+        </w:rPr>
+      </w:pPr>
+      <w:r>
+        <w:rPr>
+          <w:b/>
+          <w:bCs/>
+          <w:sz w:val="24"/>
+          <w:szCs w:val="24"/>
+          <w:lang w:val="en-US"/>
+        </w:rPr>
+        <w:t>Fungsi:</w:t>
+      </w:r>
+      <w:r>
+        <w:rPr>
+          <w:sz w:val="24"/>
+          <w:szCs w:val="24"/>
+          <w:lang w:val="en-US"/>
+        </w:rPr>
+        <w:t xml:space="preserve"> </w:t>
+      </w:r>
+    </w:p>
+    <w:p>
+      <w:pPr>
+        <w:numPr>
+          <w:ilvl w:val="2"/>
+          <w:numId w:val="26"/>
+        </w:numPr>
+        <w:tabs>
+          <w:tab w:val="num" w:pos="2160"/>
+        </w:tabs>
+        <w:spacing w:line="360" w:lineRule="auto"/>
+        <w:rPr>
+          <w:sz w:val="24"/>
+          <w:szCs w:val="24"/>
+          <w:lang w:val="en-US"/>
+        </w:rPr>
+      </w:pPr>
+      <w:r>
+        <w:rPr>
+          <w:b/>
+          <w:bCs/>
+          <w:sz w:val="24"/>
+          <w:szCs w:val="24"/>
+          <w:lang w:val="en-US"/>
+        </w:rPr>
+        <w:t>Penjelasan UI:</w:t>
+      </w:r>
+    </w:p>
+    <w:p>
+      <w:pPr>
+        <w:spacing w:line="360" w:lineRule="auto"/>
+        <w:ind w:left="1440"/>
+        <w:rPr>
+          <w:sz w:val="24"/>
+          <w:szCs w:val="24"/>
+          <w:lang w:val="en-US"/>
+        </w:rPr>
+      </w:pPr>
     </w:p>
     <w:p>
       <w:pPr>
@@ -9823,6 +11566,7 @@
           <w:szCs w:val="24"/>
           <w:lang w:val="en-US"/>
         </w:rPr>
+        <w:lastRenderedPageBreak/>
         <w:t>Fungsi:</w:t>
       </w:r>
       <w:r>
@@ -9874,7 +11618,6 @@
         <w:spacing w:before="136"/>
       </w:pPr>
       <w:r>
-        <w:lastRenderedPageBreak/>
         <w:t>Realisasi Jadwal</w:t>
       </w:r>
     </w:p>
@@ -10813,6 +12556,7 @@
           <w:szCs w:val="24"/>
           <w:lang w:val="en-US"/>
         </w:rPr>
+        <w:lastRenderedPageBreak/>
         <w:t>Penjelasan UI:</w:t>
       </w:r>
     </w:p>
@@ -10857,7 +12601,6 @@
           <w:szCs w:val="24"/>
           <w:lang w:val="en-US"/>
         </w:rPr>
-        <w:lastRenderedPageBreak/>
         <w:t xml:space="preserve">Dashboard </w:t>
       </w:r>
       <w:r>

</xml_diff>